<commit_message>
cap nhat dinh dang
</commit_message>
<xml_diff>
--- a/Healthcare Clinic & Telemedicine Portal-phase1.docx
+++ b/Healthcare Clinic & Telemedicine Portal-phase1.docx
@@ -25,6 +25,7 @@
     <w:p>
       <w:pPr>
         <w:spacing w:after="160"/>
+        <w:jc w:val="center"/>
         <w:rPr>
           <w:rFonts w:ascii="Times New Roman" w:eastAsia="Roboto" w:hAnsi="Times New Roman" w:cs="Times New Roman"/>
           <w:b/>
@@ -59,6 +60,7 @@
     <w:p>
       <w:pPr>
         <w:ind w:left="720"/>
+        <w:jc w:val="both"/>
         <w:rPr>
           <w:rFonts w:ascii="Times New Roman" w:eastAsia="Roboto" w:hAnsi="Times New Roman" w:cs="Times New Roman"/>
         </w:rPr>
@@ -95,6 +97,7 @@
     <w:p>
       <w:pPr>
         <w:ind w:left="720"/>
+        <w:jc w:val="both"/>
         <w:rPr>
           <w:rFonts w:ascii="Times New Roman" w:eastAsia="Roboto" w:hAnsi="Times New Roman" w:cs="Times New Roman"/>
         </w:rPr>
@@ -132,6 +135,7 @@
       <w:pPr>
         <w:shd w:val="clear" w:color="auto" w:fill="FFFFFF" w:themeFill="background1"/>
         <w:ind w:left="1440"/>
+        <w:jc w:val="both"/>
         <w:rPr>
           <w:rFonts w:ascii="Times New Roman" w:eastAsia="Roboto" w:hAnsi="Times New Roman" w:cs="Times New Roman"/>
         </w:rPr>
@@ -186,6 +190,7 @@
       <w:pPr>
         <w:shd w:val="clear" w:color="auto" w:fill="FFFFFF" w:themeFill="background1"/>
         <w:ind w:left="1440"/>
+        <w:jc w:val="both"/>
         <w:rPr>
           <w:rFonts w:ascii="Times New Roman" w:eastAsia="Roboto" w:hAnsi="Times New Roman" w:cs="Times New Roman"/>
         </w:rPr>
@@ -240,6 +245,7 @@
       <w:pPr>
         <w:shd w:val="clear" w:color="auto" w:fill="FFFFFF" w:themeFill="background1"/>
         <w:ind w:left="1440"/>
+        <w:jc w:val="both"/>
         <w:rPr>
           <w:rFonts w:ascii="Times New Roman" w:eastAsia="Roboto" w:hAnsi="Times New Roman" w:cs="Times New Roman"/>
         </w:rPr>
@@ -268,6 +274,7 @@
     <w:p>
       <w:pPr>
         <w:ind w:left="720"/>
+        <w:jc w:val="both"/>
         <w:rPr>
           <w:rFonts w:ascii="Times New Roman" w:eastAsia="Roboto" w:hAnsi="Times New Roman" w:cs="Times New Roman"/>
           <w:b/>
@@ -305,19 +312,11 @@
         </w:rPr>
         <w:t>Healthcare Clinic &amp; Telemedicine Portal Database System</w:t>
       </w:r>
-      <w:r>
-        <w:rPr>
-          <w:rFonts w:ascii="Times New Roman" w:eastAsia="Roboto" w:hAnsi="Times New Roman" w:cs="Times New Roman"/>
-          <w:b/>
-          <w:bCs/>
-          <w:lang w:val="en-US"/>
-        </w:rPr>
-        <w:t xml:space="preserve"> </w:t>
-      </w:r>
     </w:p>
     <w:p>
       <w:pPr>
         <w:ind w:left="720" w:firstLine="720"/>
+        <w:jc w:val="both"/>
         <w:rPr>
           <w:rFonts w:ascii="Times New Roman" w:eastAsia="Roboto" w:hAnsi="Times New Roman" w:cs="Times New Roman"/>
           <w:b/>
@@ -338,6 +337,7 @@
     <w:p>
       <w:pPr>
         <w:spacing w:after="160"/>
+        <w:jc w:val="both"/>
         <w:rPr>
           <w:rFonts w:ascii="Times New Roman" w:eastAsia="Roboto" w:hAnsi="Times New Roman" w:cs="Times New Roman"/>
           <w:b/>
@@ -357,6 +357,7 @@
     <w:p>
       <w:pPr>
         <w:spacing w:after="160"/>
+        <w:jc w:val="both"/>
         <w:rPr>
           <w:rFonts w:ascii="Times New Roman" w:eastAsia="Roboto" w:hAnsi="Times New Roman" w:cs="Times New Roman"/>
           <w:b/>
@@ -375,6 +376,7 @@
     <w:p>
       <w:pPr>
         <w:spacing w:after="160"/>
+        <w:jc w:val="both"/>
         <w:rPr>
           <w:rFonts w:ascii="Times New Roman" w:eastAsia="Roboto" w:hAnsi="Times New Roman" w:cs="Times New Roman"/>
           <w:b/>
@@ -393,6 +395,7 @@
     <w:p>
       <w:pPr>
         <w:ind w:left="720"/>
+        <w:jc w:val="both"/>
         <w:rPr>
           <w:rFonts w:ascii="Times New Roman" w:eastAsia="Roboto" w:hAnsi="Times New Roman" w:cs="Times New Roman"/>
         </w:rPr>
@@ -569,6 +572,7 @@
     <w:p>
       <w:pPr>
         <w:ind w:left="720"/>
+        <w:jc w:val="both"/>
         <w:rPr>
           <w:rFonts w:ascii="Times New Roman" w:eastAsia="Roboto" w:hAnsi="Times New Roman" w:cs="Times New Roman"/>
           <w:lang w:val="en-US"/>
@@ -601,16 +605,11 @@
         </w:rPr>
         <w:t>.</w:t>
       </w:r>
-      <w:r>
-        <w:rPr>
-          <w:rFonts w:ascii="Times New Roman" w:eastAsia="Roboto" w:hAnsi="Times New Roman" w:cs="Times New Roman"/>
-        </w:rPr>
-        <w:t xml:space="preserve"> </w:t>
-      </w:r>
     </w:p>
     <w:p>
       <w:pPr>
         <w:ind w:left="720"/>
+        <w:jc w:val="both"/>
         <w:rPr>
           <w:rFonts w:ascii="Times New Roman" w:eastAsia="Roboto" w:hAnsi="Times New Roman" w:cs="Times New Roman"/>
         </w:rPr>
@@ -639,6 +638,7 @@
     <w:p>
       <w:pPr>
         <w:ind w:left="1440"/>
+        <w:jc w:val="both"/>
         <w:rPr>
           <w:rFonts w:ascii="Times New Roman" w:eastAsia="Roboto" w:hAnsi="Times New Roman" w:cs="Times New Roman"/>
         </w:rPr>
@@ -675,6 +675,7 @@
     <w:p>
       <w:pPr>
         <w:ind w:left="1440"/>
+        <w:jc w:val="both"/>
         <w:rPr>
           <w:rFonts w:ascii="Times New Roman" w:eastAsia="Roboto" w:hAnsi="Times New Roman" w:cs="Times New Roman"/>
         </w:rPr>
@@ -686,6 +687,7 @@
         <w:keepNext w:val="0"/>
         <w:keepLines w:val="0"/>
         <w:spacing w:before="0"/>
+        <w:jc w:val="both"/>
         <w:rPr>
           <w:rFonts w:ascii="Times New Roman" w:hAnsi="Times New Roman" w:cs="Times New Roman"/>
           <w:b/>
@@ -712,7 +714,7 @@
     <w:tbl>
       <w:tblPr>
         <w:tblStyle w:val="a"/>
-        <w:tblW w:w="8775" w:type="dxa"/>
+        <w:tblW w:w="0" w:type="auto"/>
         <w:tblInd w:w="0" w:type="dxa"/>
         <w:tblBorders>
           <w:top w:val="nil"/>
@@ -726,18 +728,18 @@
         <w:tblLook w:val="0600" w:firstRow="0" w:lastRow="0" w:firstColumn="0" w:lastColumn="0" w:noHBand="1" w:noVBand="1"/>
       </w:tblPr>
       <w:tblGrid>
-        <w:gridCol w:w="840"/>
-        <w:gridCol w:w="1650"/>
-        <w:gridCol w:w="1980"/>
-        <w:gridCol w:w="4305"/>
+        <w:gridCol w:w="776"/>
+        <w:gridCol w:w="1700"/>
+        <w:gridCol w:w="1820"/>
+        <w:gridCol w:w="4721"/>
       </w:tblGrid>
       <w:tr>
         <w:trPr>
-          <w:trHeight w:val="810"/>
+          <w:trHeight w:val="239"/>
         </w:trPr>
         <w:tc>
           <w:tcPr>
-            <w:tcW w:w="840" w:type="dxa"/>
+            <w:tcW w:w="776" w:type="dxa"/>
             <w:tcBorders>
               <w:top w:val="single" w:sz="5" w:space="0" w:color="C4C7C5"/>
               <w:left w:val="single" w:sz="5" w:space="0" w:color="C4C7C5"/>
@@ -754,6 +756,7 @@
           <w:p>
             <w:pPr>
               <w:spacing w:after="480"/>
+              <w:jc w:val="center"/>
               <w:rPr>
                 <w:rFonts w:ascii="Times New Roman" w:hAnsi="Times New Roman" w:cs="Times New Roman"/>
               </w:rPr>
@@ -770,7 +773,7 @@
         </w:tc>
         <w:tc>
           <w:tcPr>
-            <w:tcW w:w="1650" w:type="dxa"/>
+            <w:tcW w:w="1700" w:type="dxa"/>
             <w:tcBorders>
               <w:top w:val="single" w:sz="5" w:space="0" w:color="C4C7C5"/>
               <w:left w:val="single" w:sz="5" w:space="0" w:color="C4C7C5"/>
@@ -787,6 +790,7 @@
           <w:p>
             <w:pPr>
               <w:spacing w:after="480"/>
+              <w:jc w:val="center"/>
               <w:rPr>
                 <w:rFonts w:ascii="Times New Roman" w:hAnsi="Times New Roman" w:cs="Times New Roman"/>
               </w:rPr>
@@ -803,7 +807,7 @@
         </w:tc>
         <w:tc>
           <w:tcPr>
-            <w:tcW w:w="1980" w:type="dxa"/>
+            <w:tcW w:w="1820" w:type="dxa"/>
             <w:tcBorders>
               <w:top w:val="single" w:sz="5" w:space="0" w:color="C4C7C5"/>
               <w:left w:val="single" w:sz="5" w:space="0" w:color="C4C7C5"/>
@@ -820,6 +824,7 @@
           <w:p>
             <w:pPr>
               <w:spacing w:after="480"/>
+              <w:jc w:val="center"/>
               <w:rPr>
                 <w:rFonts w:ascii="Times New Roman" w:hAnsi="Times New Roman" w:cs="Times New Roman"/>
               </w:rPr>
@@ -836,7 +841,7 @@
         </w:tc>
         <w:tc>
           <w:tcPr>
-            <w:tcW w:w="4305" w:type="dxa"/>
+            <w:tcW w:w="4721" w:type="dxa"/>
             <w:tcBorders>
               <w:top w:val="single" w:sz="5" w:space="0" w:color="C4C7C5"/>
               <w:left w:val="single" w:sz="5" w:space="0" w:color="C4C7C5"/>
@@ -853,6 +858,7 @@
           <w:p>
             <w:pPr>
               <w:spacing w:after="480"/>
+              <w:jc w:val="center"/>
               <w:rPr>
                 <w:rFonts w:ascii="Times New Roman" w:hAnsi="Times New Roman" w:cs="Times New Roman"/>
               </w:rPr>
@@ -874,105 +880,7 @@
         </w:trPr>
         <w:tc>
           <w:tcPr>
-            <w:tcW w:w="840" w:type="dxa"/>
-            <w:tcBorders>
-              <w:top w:val="single" w:sz="5" w:space="0" w:color="C4C7C5"/>
-              <w:left w:val="single" w:sz="5" w:space="0" w:color="C4C7C5"/>
-              <w:bottom w:val="single" w:sz="5" w:space="0" w:color="C4C7C5"/>
-              <w:right w:val="single" w:sz="5" w:space="0" w:color="C4C7C5"/>
-            </w:tcBorders>
-            <w:tcMar>
-              <w:top w:w="120" w:type="dxa"/>
-              <w:left w:w="180" w:type="dxa"/>
-              <w:bottom w:w="120" w:type="dxa"/>
-              <w:right w:w="180" w:type="dxa"/>
-            </w:tcMar>
-          </w:tcPr>
-          <w:p>
-            <w:pPr>
-              <w:spacing w:after="480"/>
-              <w:rPr>
-                <w:rFonts w:ascii="Times New Roman" w:hAnsi="Times New Roman" w:cs="Times New Roman"/>
-              </w:rPr>
-            </w:pPr>
-            <w:r>
-              <w:rPr>
-                <w:rFonts w:ascii="Times New Roman" w:hAnsi="Times New Roman" w:cs="Times New Roman"/>
-                <w:b/>
-                <w:bCs/>
-              </w:rPr>
-              <w:t>1</w:t>
-            </w:r>
-          </w:p>
-        </w:tc>
-        <w:tc>
-          <w:tcPr>
-            <w:tcW w:w="1650" w:type="dxa"/>
-            <w:tcBorders>
-              <w:top w:val="single" w:sz="5" w:space="0" w:color="C4C7C5"/>
-              <w:left w:val="single" w:sz="5" w:space="0" w:color="C4C7C5"/>
-              <w:bottom w:val="single" w:sz="5" w:space="0" w:color="C4C7C5"/>
-              <w:right w:val="single" w:sz="5" w:space="0" w:color="C4C7C5"/>
-            </w:tcBorders>
-            <w:tcMar>
-              <w:top w:w="120" w:type="dxa"/>
-              <w:left w:w="180" w:type="dxa"/>
-              <w:bottom w:w="120" w:type="dxa"/>
-              <w:right w:w="180" w:type="dxa"/>
-            </w:tcMar>
-          </w:tcPr>
-          <w:p>
-            <w:pPr>
-              <w:spacing w:after="480"/>
-              <w:rPr>
-                <w:rFonts w:ascii="Times New Roman" w:hAnsi="Times New Roman" w:cs="Times New Roman"/>
-              </w:rPr>
-            </w:pPr>
-            <w:r>
-              <w:rPr>
-                <w:rFonts w:ascii="Times New Roman" w:hAnsi="Times New Roman" w:cs="Times New Roman"/>
-                <w:b/>
-                <w:bCs/>
-              </w:rPr>
-              <w:t>BỆNH NHÂN</w:t>
-            </w:r>
-          </w:p>
-        </w:tc>
-        <w:tc>
-          <w:tcPr>
-            <w:tcW w:w="1980" w:type="dxa"/>
-            <w:tcBorders>
-              <w:top w:val="single" w:sz="5" w:space="0" w:color="C4C7C5"/>
-              <w:left w:val="single" w:sz="5" w:space="0" w:color="C4C7C5"/>
-              <w:bottom w:val="single" w:sz="5" w:space="0" w:color="C4C7C5"/>
-              <w:right w:val="single" w:sz="5" w:space="0" w:color="C4C7C5"/>
-            </w:tcBorders>
-            <w:tcMar>
-              <w:top w:w="120" w:type="dxa"/>
-              <w:left w:w="180" w:type="dxa"/>
-              <w:bottom w:w="120" w:type="dxa"/>
-              <w:right w:w="180" w:type="dxa"/>
-            </w:tcMar>
-          </w:tcPr>
-          <w:p>
-            <w:pPr>
-              <w:spacing w:after="480"/>
-              <w:rPr>
-                <w:rFonts w:ascii="Times New Roman" w:hAnsi="Times New Roman" w:cs="Times New Roman"/>
-              </w:rPr>
-            </w:pPr>
-            <w:r>
-              <w:rPr>
-                <w:rFonts w:ascii="Times New Roman" w:hAnsi="Times New Roman" w:cs="Times New Roman"/>
-                <w:color w:val="188038"/>
-              </w:rPr>
-              <w:t>Patient</w:t>
-            </w:r>
-          </w:p>
-        </w:tc>
-        <w:tc>
-          <w:tcPr>
-            <w:tcW w:w="4305" w:type="dxa"/>
+            <w:tcW w:w="776" w:type="dxa"/>
             <w:tcBorders>
               <w:top w:val="single" w:sz="5" w:space="0" w:color="C4C7C5"/>
               <w:left w:val="single" w:sz="5" w:space="0" w:color="C4C7C5"/>
@@ -997,19 +905,16 @@
             <w:r>
               <w:rPr>
                 <w:rFonts w:ascii="Times New Roman" w:hAnsi="Times New Roman" w:cs="Times New Roman"/>
-              </w:rPr>
-              <w:t>Đại diện cho đối tượng thụ hưởng dịch vụ y tế. Lưu trữ hồ sơ định danh, nhân khẩu học, thông tin liên lạc và tiền sử bệnh lý tổng quát.</w:t>
+                <w:b/>
+                <w:bCs/>
+              </w:rPr>
+              <w:t>1</w:t>
             </w:r>
           </w:p>
         </w:tc>
-      </w:tr>
-      <w:tr>
-        <w:trPr>
-          <w:trHeight w:val="1650"/>
-        </w:trPr>
         <w:tc>
           <w:tcPr>
-            <w:tcW w:w="840" w:type="dxa"/>
+            <w:tcW w:w="1700" w:type="dxa"/>
             <w:tcBorders>
               <w:top w:val="single" w:sz="5" w:space="0" w:color="C4C7C5"/>
               <w:left w:val="single" w:sz="5" w:space="0" w:color="C4C7C5"/>
@@ -1036,14 +941,13 @@
                 <w:b/>
                 <w:bCs/>
               </w:rPr>
-              <w:lastRenderedPageBreak/>
-              <w:t>2</w:t>
+              <w:t>BỆNH NHÂN</w:t>
             </w:r>
           </w:p>
         </w:tc>
         <w:tc>
           <w:tcPr>
-            <w:tcW w:w="1650" w:type="dxa"/>
+            <w:tcW w:w="1820" w:type="dxa"/>
             <w:tcBorders>
               <w:top w:val="single" w:sz="5" w:space="0" w:color="C4C7C5"/>
               <w:left w:val="single" w:sz="5" w:space="0" w:color="C4C7C5"/>
@@ -1067,48 +971,15 @@
             <w:r>
               <w:rPr>
                 <w:rFonts w:ascii="Times New Roman" w:hAnsi="Times New Roman" w:cs="Times New Roman"/>
-                <w:b/>
-                <w:bCs/>
-              </w:rPr>
-              <w:t>DỊ ỨNG BỆNH NHÂN</w:t>
+                <w:color w:val="188038"/>
+              </w:rPr>
+              <w:t>Patient</w:t>
             </w:r>
           </w:p>
         </w:tc>
         <w:tc>
           <w:tcPr>
-            <w:tcW w:w="1980" w:type="dxa"/>
-            <w:tcBorders>
-              <w:top w:val="single" w:sz="5" w:space="0" w:color="C4C7C5"/>
-              <w:left w:val="single" w:sz="5" w:space="0" w:color="C4C7C5"/>
-              <w:bottom w:val="single" w:sz="5" w:space="0" w:color="C4C7C5"/>
-              <w:right w:val="single" w:sz="5" w:space="0" w:color="C4C7C5"/>
-            </w:tcBorders>
-            <w:tcMar>
-              <w:top w:w="120" w:type="dxa"/>
-              <w:left w:w="180" w:type="dxa"/>
-              <w:bottom w:w="120" w:type="dxa"/>
-              <w:right w:w="180" w:type="dxa"/>
-            </w:tcMar>
-          </w:tcPr>
-          <w:p>
-            <w:pPr>
-              <w:spacing w:after="480"/>
-              <w:rPr>
-                <w:rFonts w:ascii="Times New Roman" w:hAnsi="Times New Roman" w:cs="Times New Roman"/>
-              </w:rPr>
-            </w:pPr>
-            <w:r>
-              <w:rPr>
-                <w:rFonts w:ascii="Times New Roman" w:hAnsi="Times New Roman" w:cs="Times New Roman"/>
-                <w:color w:val="188038"/>
-              </w:rPr>
-              <w:t>Patient Allergy</w:t>
-            </w:r>
-          </w:p>
-        </w:tc>
-        <w:tc>
-          <w:tcPr>
-            <w:tcW w:w="4305" w:type="dxa"/>
+            <w:tcW w:w="4721" w:type="dxa"/>
             <w:tcBorders>
               <w:top w:val="single" w:sz="5" w:space="0" w:color="C4C7C5"/>
               <w:left w:val="single" w:sz="5" w:space="0" w:color="C4C7C5"/>
@@ -1134,116 +1005,18 @@
               <w:rPr>
                 <w:rFonts w:ascii="Times New Roman" w:hAnsi="Times New Roman" w:cs="Times New Roman"/>
               </w:rPr>
-              <w:t>Lưu trữ danh mục các dị nguyên (thuốc, thức ăn, môi trường) và mức độ phản ứng của từng bệnh nhân, phục vụ cảnh báo chống chỉ định khi kê đơn.</w:t>
+              <w:t>Đại diện cho đối tượng thụ hưởng dịch vụ y tế. Lưu trữ hồ sơ định danh, nhân khẩu học, thông tin liên lạc và tiền sử bệnh lý tổng quát.</w:t>
             </w:r>
           </w:p>
         </w:tc>
       </w:tr>
       <w:tr>
         <w:trPr>
-          <w:trHeight w:val="1365"/>
+          <w:trHeight w:val="1650"/>
         </w:trPr>
         <w:tc>
           <w:tcPr>
-            <w:tcW w:w="840" w:type="dxa"/>
-            <w:tcBorders>
-              <w:top w:val="single" w:sz="5" w:space="0" w:color="C4C7C5"/>
-              <w:left w:val="single" w:sz="5" w:space="0" w:color="C4C7C5"/>
-              <w:bottom w:val="single" w:sz="5" w:space="0" w:color="C4C7C5"/>
-              <w:right w:val="single" w:sz="5" w:space="0" w:color="C4C7C5"/>
-            </w:tcBorders>
-            <w:tcMar>
-              <w:top w:w="120" w:type="dxa"/>
-              <w:left w:w="180" w:type="dxa"/>
-              <w:bottom w:w="120" w:type="dxa"/>
-              <w:right w:w="180" w:type="dxa"/>
-            </w:tcMar>
-          </w:tcPr>
-          <w:p>
-            <w:pPr>
-              <w:spacing w:after="480"/>
-              <w:rPr>
-                <w:rFonts w:ascii="Times New Roman" w:hAnsi="Times New Roman" w:cs="Times New Roman"/>
-              </w:rPr>
-            </w:pPr>
-            <w:r>
-              <w:rPr>
-                <w:rFonts w:ascii="Times New Roman" w:hAnsi="Times New Roman" w:cs="Times New Roman"/>
-                <w:b/>
-                <w:bCs/>
-              </w:rPr>
-              <w:t>3</w:t>
-            </w:r>
-          </w:p>
-        </w:tc>
-        <w:tc>
-          <w:tcPr>
-            <w:tcW w:w="1650" w:type="dxa"/>
-            <w:tcBorders>
-              <w:top w:val="single" w:sz="5" w:space="0" w:color="C4C7C5"/>
-              <w:left w:val="single" w:sz="5" w:space="0" w:color="C4C7C5"/>
-              <w:bottom w:val="single" w:sz="5" w:space="0" w:color="C4C7C5"/>
-              <w:right w:val="single" w:sz="5" w:space="0" w:color="C4C7C5"/>
-            </w:tcBorders>
-            <w:tcMar>
-              <w:top w:w="120" w:type="dxa"/>
-              <w:left w:w="180" w:type="dxa"/>
-              <w:bottom w:w="120" w:type="dxa"/>
-              <w:right w:w="180" w:type="dxa"/>
-            </w:tcMar>
-          </w:tcPr>
-          <w:p>
-            <w:pPr>
-              <w:spacing w:after="480"/>
-              <w:rPr>
-                <w:rFonts w:ascii="Times New Roman" w:hAnsi="Times New Roman" w:cs="Times New Roman"/>
-              </w:rPr>
-            </w:pPr>
-            <w:r>
-              <w:rPr>
-                <w:rFonts w:ascii="Times New Roman" w:hAnsi="Times New Roman" w:cs="Times New Roman"/>
-                <w:b/>
-                <w:bCs/>
-              </w:rPr>
-              <w:t>BÁC SĨ</w:t>
-            </w:r>
-          </w:p>
-        </w:tc>
-        <w:tc>
-          <w:tcPr>
-            <w:tcW w:w="1980" w:type="dxa"/>
-            <w:tcBorders>
-              <w:top w:val="single" w:sz="5" w:space="0" w:color="C4C7C5"/>
-              <w:left w:val="single" w:sz="5" w:space="0" w:color="C4C7C5"/>
-              <w:bottom w:val="single" w:sz="5" w:space="0" w:color="C4C7C5"/>
-              <w:right w:val="single" w:sz="5" w:space="0" w:color="C4C7C5"/>
-            </w:tcBorders>
-            <w:tcMar>
-              <w:top w:w="120" w:type="dxa"/>
-              <w:left w:w="180" w:type="dxa"/>
-              <w:bottom w:w="120" w:type="dxa"/>
-              <w:right w:w="180" w:type="dxa"/>
-            </w:tcMar>
-          </w:tcPr>
-          <w:p>
-            <w:pPr>
-              <w:spacing w:after="480"/>
-              <w:rPr>
-                <w:rFonts w:ascii="Times New Roman" w:hAnsi="Times New Roman" w:cs="Times New Roman"/>
-              </w:rPr>
-            </w:pPr>
-            <w:r>
-              <w:rPr>
-                <w:rFonts w:ascii="Times New Roman" w:hAnsi="Times New Roman" w:cs="Times New Roman"/>
-                <w:color w:val="188038"/>
-              </w:rPr>
-              <w:t>Doctor / Practitioner</w:t>
-            </w:r>
-          </w:p>
-        </w:tc>
-        <w:tc>
-          <w:tcPr>
-            <w:tcW w:w="4305" w:type="dxa"/>
+            <w:tcW w:w="776" w:type="dxa"/>
             <w:tcBorders>
               <w:top w:val="single" w:sz="5" w:space="0" w:color="C4C7C5"/>
               <w:left w:val="single" w:sz="5" w:space="0" w:color="C4C7C5"/>
@@ -1268,19 +1041,17 @@
             <w:r>
               <w:rPr>
                 <w:rFonts w:ascii="Times New Roman" w:hAnsi="Times New Roman" w:cs="Times New Roman"/>
-              </w:rPr>
-              <w:t>Thực thể cha (Generalization) đại diện cho nhân viên y tế trong hệ thống, chứa các thông tin định danh và liên lạc chung.</w:t>
+                <w:b/>
+                <w:bCs/>
+              </w:rPr>
+              <w:lastRenderedPageBreak/>
+              <w:t>2</w:t>
             </w:r>
           </w:p>
         </w:tc>
-      </w:tr>
-      <w:tr>
-        <w:trPr>
-          <w:trHeight w:val="1650"/>
-        </w:trPr>
         <w:tc>
           <w:tcPr>
-            <w:tcW w:w="840" w:type="dxa"/>
+            <w:tcW w:w="1700" w:type="dxa"/>
             <w:tcBorders>
               <w:top w:val="single" w:sz="5" w:space="0" w:color="C4C7C5"/>
               <w:left w:val="single" w:sz="5" w:space="0" w:color="C4C7C5"/>
@@ -1307,13 +1078,13 @@
                 <w:b/>
                 <w:bCs/>
               </w:rPr>
-              <w:t>4</w:t>
+              <w:t>DỊ ỨNG BỆNH NHÂN</w:t>
             </w:r>
           </w:p>
         </w:tc>
         <w:tc>
           <w:tcPr>
-            <w:tcW w:w="1650" w:type="dxa"/>
+            <w:tcW w:w="1820" w:type="dxa"/>
             <w:tcBorders>
               <w:top w:val="single" w:sz="5" w:space="0" w:color="C4C7C5"/>
               <w:left w:val="single" w:sz="5" w:space="0" w:color="C4C7C5"/>
@@ -1337,48 +1108,15 @@
             <w:r>
               <w:rPr>
                 <w:rFonts w:ascii="Times New Roman" w:hAnsi="Times New Roman" w:cs="Times New Roman"/>
-                <w:b/>
-                <w:bCs/>
-              </w:rPr>
-              <w:t>BÁC SĨ ĐA KHOA</w:t>
+                <w:color w:val="188038"/>
+              </w:rPr>
+              <w:t>Patient Allergy</w:t>
             </w:r>
           </w:p>
         </w:tc>
         <w:tc>
           <w:tcPr>
-            <w:tcW w:w="1980" w:type="dxa"/>
-            <w:tcBorders>
-              <w:top w:val="single" w:sz="5" w:space="0" w:color="C4C7C5"/>
-              <w:left w:val="single" w:sz="5" w:space="0" w:color="C4C7C5"/>
-              <w:bottom w:val="single" w:sz="5" w:space="0" w:color="C4C7C5"/>
-              <w:right w:val="single" w:sz="5" w:space="0" w:color="C4C7C5"/>
-            </w:tcBorders>
-            <w:tcMar>
-              <w:top w:w="120" w:type="dxa"/>
-              <w:left w:w="180" w:type="dxa"/>
-              <w:bottom w:w="120" w:type="dxa"/>
-              <w:right w:w="180" w:type="dxa"/>
-            </w:tcMar>
-          </w:tcPr>
-          <w:p>
-            <w:pPr>
-              <w:spacing w:after="480"/>
-              <w:rPr>
-                <w:rFonts w:ascii="Times New Roman" w:hAnsi="Times New Roman" w:cs="Times New Roman"/>
-              </w:rPr>
-            </w:pPr>
-            <w:r>
-              <w:rPr>
-                <w:rFonts w:ascii="Times New Roman" w:hAnsi="Times New Roman" w:cs="Times New Roman"/>
-                <w:color w:val="188038"/>
-              </w:rPr>
-              <w:t>General Practitioner (GP)</w:t>
-            </w:r>
-          </w:p>
-        </w:tc>
-        <w:tc>
-          <w:tcPr>
-            <w:tcW w:w="4305" w:type="dxa"/>
+            <w:tcW w:w="4721" w:type="dxa"/>
             <w:tcBorders>
               <w:top w:val="single" w:sz="5" w:space="0" w:color="C4C7C5"/>
               <w:left w:val="single" w:sz="5" w:space="0" w:color="C4C7C5"/>
@@ -1404,116 +1142,18 @@
               <w:rPr>
                 <w:rFonts w:ascii="Times New Roman" w:hAnsi="Times New Roman" w:cs="Times New Roman"/>
               </w:rPr>
-              <w:t>Thực thể con chuyên biệt (Specialization - IS-A), phụ trách tiếp nhận khám ban đầu, xử lý bệnh lý cơ bản và điều phối chuyển tuyến chuyên khoa.</w:t>
+              <w:t>Lưu trữ danh mục các dị nguyên (thuốc, thức ăn, môi trường) và mức độ phản ứng của từng bệnh nhân, phục vụ cảnh báo chống chỉ định khi kê đơn.</w:t>
             </w:r>
           </w:p>
         </w:tc>
       </w:tr>
       <w:tr>
         <w:trPr>
-          <w:trHeight w:val="1650"/>
+          <w:trHeight w:val="1365"/>
         </w:trPr>
         <w:tc>
           <w:tcPr>
-            <w:tcW w:w="840" w:type="dxa"/>
-            <w:tcBorders>
-              <w:top w:val="single" w:sz="5" w:space="0" w:color="C4C7C5"/>
-              <w:left w:val="single" w:sz="5" w:space="0" w:color="C4C7C5"/>
-              <w:bottom w:val="single" w:sz="5" w:space="0" w:color="C4C7C5"/>
-              <w:right w:val="single" w:sz="5" w:space="0" w:color="C4C7C5"/>
-            </w:tcBorders>
-            <w:tcMar>
-              <w:top w:w="120" w:type="dxa"/>
-              <w:left w:w="180" w:type="dxa"/>
-              <w:bottom w:w="120" w:type="dxa"/>
-              <w:right w:w="180" w:type="dxa"/>
-            </w:tcMar>
-          </w:tcPr>
-          <w:p>
-            <w:pPr>
-              <w:spacing w:after="480"/>
-              <w:rPr>
-                <w:rFonts w:ascii="Times New Roman" w:hAnsi="Times New Roman" w:cs="Times New Roman"/>
-              </w:rPr>
-            </w:pPr>
-            <w:r>
-              <w:rPr>
-                <w:rFonts w:ascii="Times New Roman" w:hAnsi="Times New Roman" w:cs="Times New Roman"/>
-                <w:b/>
-                <w:bCs/>
-              </w:rPr>
-              <w:t>5</w:t>
-            </w:r>
-          </w:p>
-        </w:tc>
-        <w:tc>
-          <w:tcPr>
-            <w:tcW w:w="1650" w:type="dxa"/>
-            <w:tcBorders>
-              <w:top w:val="single" w:sz="5" w:space="0" w:color="C4C7C5"/>
-              <w:left w:val="single" w:sz="5" w:space="0" w:color="C4C7C5"/>
-              <w:bottom w:val="single" w:sz="5" w:space="0" w:color="C4C7C5"/>
-              <w:right w:val="single" w:sz="5" w:space="0" w:color="C4C7C5"/>
-            </w:tcBorders>
-            <w:tcMar>
-              <w:top w:w="120" w:type="dxa"/>
-              <w:left w:w="180" w:type="dxa"/>
-              <w:bottom w:w="120" w:type="dxa"/>
-              <w:right w:w="180" w:type="dxa"/>
-            </w:tcMar>
-          </w:tcPr>
-          <w:p>
-            <w:pPr>
-              <w:spacing w:after="480"/>
-              <w:rPr>
-                <w:rFonts w:ascii="Times New Roman" w:hAnsi="Times New Roman" w:cs="Times New Roman"/>
-              </w:rPr>
-            </w:pPr>
-            <w:r>
-              <w:rPr>
-                <w:rFonts w:ascii="Times New Roman" w:hAnsi="Times New Roman" w:cs="Times New Roman"/>
-                <w:b/>
-                <w:bCs/>
-              </w:rPr>
-              <w:t>BÁC SĨ CHUYÊN KHOA</w:t>
-            </w:r>
-          </w:p>
-        </w:tc>
-        <w:tc>
-          <w:tcPr>
-            <w:tcW w:w="1980" w:type="dxa"/>
-            <w:tcBorders>
-              <w:top w:val="single" w:sz="5" w:space="0" w:color="C4C7C5"/>
-              <w:left w:val="single" w:sz="5" w:space="0" w:color="C4C7C5"/>
-              <w:bottom w:val="single" w:sz="5" w:space="0" w:color="C4C7C5"/>
-              <w:right w:val="single" w:sz="5" w:space="0" w:color="C4C7C5"/>
-            </w:tcBorders>
-            <w:tcMar>
-              <w:top w:w="120" w:type="dxa"/>
-              <w:left w:w="180" w:type="dxa"/>
-              <w:bottom w:w="120" w:type="dxa"/>
-              <w:right w:w="180" w:type="dxa"/>
-            </w:tcMar>
-          </w:tcPr>
-          <w:p>
-            <w:pPr>
-              <w:spacing w:after="480"/>
-              <w:rPr>
-                <w:rFonts w:ascii="Times New Roman" w:hAnsi="Times New Roman" w:cs="Times New Roman"/>
-              </w:rPr>
-            </w:pPr>
-            <w:r>
-              <w:rPr>
-                <w:rFonts w:ascii="Times New Roman" w:hAnsi="Times New Roman" w:cs="Times New Roman"/>
-                <w:color w:val="188038"/>
-              </w:rPr>
-              <w:t>Specialist</w:t>
-            </w:r>
-          </w:p>
-        </w:tc>
-        <w:tc>
-          <w:tcPr>
-            <w:tcW w:w="4305" w:type="dxa"/>
+            <w:tcW w:w="776" w:type="dxa"/>
             <w:tcBorders>
               <w:top w:val="single" w:sz="5" w:space="0" w:color="C4C7C5"/>
               <w:left w:val="single" w:sz="5" w:space="0" w:color="C4C7C5"/>
@@ -1538,19 +1178,16 @@
             <w:r>
               <w:rPr>
                 <w:rFonts w:ascii="Times New Roman" w:hAnsi="Times New Roman" w:cs="Times New Roman"/>
-              </w:rPr>
-              <w:t>Thực thể con chuyên biệt (Specialization - IS-A), tiếp nhận hội chẩn chuyên sâu theo đúng chuyên khoa được phân công hoặc qua phiếu chuyển tuyến.</w:t>
+                <w:b/>
+                <w:bCs/>
+              </w:rPr>
+              <w:t>3</w:t>
             </w:r>
           </w:p>
         </w:tc>
-      </w:tr>
-      <w:tr>
-        <w:trPr>
-          <w:trHeight w:val="1650"/>
-        </w:trPr>
         <w:tc>
           <w:tcPr>
-            <w:tcW w:w="840" w:type="dxa"/>
+            <w:tcW w:w="1700" w:type="dxa"/>
             <w:tcBorders>
               <w:top w:val="single" w:sz="5" w:space="0" w:color="C4C7C5"/>
               <w:left w:val="single" w:sz="5" w:space="0" w:color="C4C7C5"/>
@@ -1577,13 +1214,13 @@
                 <w:b/>
                 <w:bCs/>
               </w:rPr>
-              <w:t>6</w:t>
+              <w:t>BÁC SĨ</w:t>
             </w:r>
           </w:p>
         </w:tc>
         <w:tc>
           <w:tcPr>
-            <w:tcW w:w="1650" w:type="dxa"/>
+            <w:tcW w:w="1820" w:type="dxa"/>
             <w:tcBorders>
               <w:top w:val="single" w:sz="5" w:space="0" w:color="C4C7C5"/>
               <w:left w:val="single" w:sz="5" w:space="0" w:color="C4C7C5"/>
@@ -1607,48 +1244,15 @@
             <w:r>
               <w:rPr>
                 <w:rFonts w:ascii="Times New Roman" w:hAnsi="Times New Roman" w:cs="Times New Roman"/>
-                <w:b/>
-                <w:bCs/>
-              </w:rPr>
-              <w:t>CHUYÊN KHOA</w:t>
+                <w:color w:val="188038"/>
+              </w:rPr>
+              <w:t>Doctor / Practitioner</w:t>
             </w:r>
           </w:p>
         </w:tc>
         <w:tc>
           <w:tcPr>
-            <w:tcW w:w="1980" w:type="dxa"/>
-            <w:tcBorders>
-              <w:top w:val="single" w:sz="5" w:space="0" w:color="C4C7C5"/>
-              <w:left w:val="single" w:sz="5" w:space="0" w:color="C4C7C5"/>
-              <w:bottom w:val="single" w:sz="5" w:space="0" w:color="C4C7C5"/>
-              <w:right w:val="single" w:sz="5" w:space="0" w:color="C4C7C5"/>
-            </w:tcBorders>
-            <w:tcMar>
-              <w:top w:w="120" w:type="dxa"/>
-              <w:left w:w="180" w:type="dxa"/>
-              <w:bottom w:w="120" w:type="dxa"/>
-              <w:right w:w="180" w:type="dxa"/>
-            </w:tcMar>
-          </w:tcPr>
-          <w:p>
-            <w:pPr>
-              <w:spacing w:after="480"/>
-              <w:rPr>
-                <w:rFonts w:ascii="Times New Roman" w:hAnsi="Times New Roman" w:cs="Times New Roman"/>
-              </w:rPr>
-            </w:pPr>
-            <w:r>
-              <w:rPr>
-                <w:rFonts w:ascii="Times New Roman" w:hAnsi="Times New Roman" w:cs="Times New Roman"/>
-                <w:color w:val="188038"/>
-              </w:rPr>
-              <w:t>Medical Specialty</w:t>
-            </w:r>
-          </w:p>
-        </w:tc>
-        <w:tc>
-          <w:tcPr>
-            <w:tcW w:w="4305" w:type="dxa"/>
+            <w:tcW w:w="4721" w:type="dxa"/>
             <w:tcBorders>
               <w:top w:val="single" w:sz="5" w:space="0" w:color="C4C7C5"/>
               <w:left w:val="single" w:sz="5" w:space="0" w:color="C4C7C5"/>
@@ -1674,116 +1278,18 @@
               <w:rPr>
                 <w:rFonts w:ascii="Times New Roman" w:hAnsi="Times New Roman" w:cs="Times New Roman"/>
               </w:rPr>
-              <w:t>Danh mục quản lý các chuyên khoa y tế (Tim mạch, Da liễu, Thần kinh,...), là căn cứ phân loại bác sĩ chuyên khoa và điều hướng chuyển tuyến.</w:t>
+              <w:t>Thực thể cha (Generalization) đại diện cho nhân viên y tế trong hệ thống, chứa các thông tin định danh và liên lạc chung.</w:t>
             </w:r>
           </w:p>
         </w:tc>
       </w:tr>
       <w:tr>
         <w:trPr>
-          <w:trHeight w:val="1365"/>
+          <w:trHeight w:val="1650"/>
         </w:trPr>
         <w:tc>
           <w:tcPr>
-            <w:tcW w:w="840" w:type="dxa"/>
-            <w:tcBorders>
-              <w:top w:val="single" w:sz="5" w:space="0" w:color="C4C7C5"/>
-              <w:left w:val="single" w:sz="5" w:space="0" w:color="C4C7C5"/>
-              <w:bottom w:val="single" w:sz="5" w:space="0" w:color="C4C7C5"/>
-              <w:right w:val="single" w:sz="5" w:space="0" w:color="C4C7C5"/>
-            </w:tcBorders>
-            <w:tcMar>
-              <w:top w:w="120" w:type="dxa"/>
-              <w:left w:w="180" w:type="dxa"/>
-              <w:bottom w:w="120" w:type="dxa"/>
-              <w:right w:w="180" w:type="dxa"/>
-            </w:tcMar>
-          </w:tcPr>
-          <w:p>
-            <w:pPr>
-              <w:spacing w:after="480"/>
-              <w:rPr>
-                <w:rFonts w:ascii="Times New Roman" w:hAnsi="Times New Roman" w:cs="Times New Roman"/>
-              </w:rPr>
-            </w:pPr>
-            <w:r>
-              <w:rPr>
-                <w:rFonts w:ascii="Times New Roman" w:hAnsi="Times New Roman" w:cs="Times New Roman"/>
-                <w:b/>
-                <w:bCs/>
-              </w:rPr>
-              <w:t>7</w:t>
-            </w:r>
-          </w:p>
-        </w:tc>
-        <w:tc>
-          <w:tcPr>
-            <w:tcW w:w="1650" w:type="dxa"/>
-            <w:tcBorders>
-              <w:top w:val="single" w:sz="5" w:space="0" w:color="C4C7C5"/>
-              <w:left w:val="single" w:sz="5" w:space="0" w:color="C4C7C5"/>
-              <w:bottom w:val="single" w:sz="5" w:space="0" w:color="C4C7C5"/>
-              <w:right w:val="single" w:sz="5" w:space="0" w:color="C4C7C5"/>
-            </w:tcBorders>
-            <w:tcMar>
-              <w:top w:w="120" w:type="dxa"/>
-              <w:left w:w="180" w:type="dxa"/>
-              <w:bottom w:w="120" w:type="dxa"/>
-              <w:right w:w="180" w:type="dxa"/>
-            </w:tcMar>
-          </w:tcPr>
-          <w:p>
-            <w:pPr>
-              <w:spacing w:after="480"/>
-              <w:rPr>
-                <w:rFonts w:ascii="Times New Roman" w:hAnsi="Times New Roman" w:cs="Times New Roman"/>
-              </w:rPr>
-            </w:pPr>
-            <w:r>
-              <w:rPr>
-                <w:rFonts w:ascii="Times New Roman" w:hAnsi="Times New Roman" w:cs="Times New Roman"/>
-                <w:b/>
-                <w:bCs/>
-              </w:rPr>
-              <w:t>LỊCH LÀM VIỆC</w:t>
-            </w:r>
-          </w:p>
-        </w:tc>
-        <w:tc>
-          <w:tcPr>
-            <w:tcW w:w="1980" w:type="dxa"/>
-            <w:tcBorders>
-              <w:top w:val="single" w:sz="5" w:space="0" w:color="C4C7C5"/>
-              <w:left w:val="single" w:sz="5" w:space="0" w:color="C4C7C5"/>
-              <w:bottom w:val="single" w:sz="5" w:space="0" w:color="C4C7C5"/>
-              <w:right w:val="single" w:sz="5" w:space="0" w:color="C4C7C5"/>
-            </w:tcBorders>
-            <w:tcMar>
-              <w:top w:w="120" w:type="dxa"/>
-              <w:left w:w="180" w:type="dxa"/>
-              <w:bottom w:w="120" w:type="dxa"/>
-              <w:right w:w="180" w:type="dxa"/>
-            </w:tcMar>
-          </w:tcPr>
-          <w:p>
-            <w:pPr>
-              <w:spacing w:after="480"/>
-              <w:rPr>
-                <w:rFonts w:ascii="Times New Roman" w:hAnsi="Times New Roman" w:cs="Times New Roman"/>
-              </w:rPr>
-            </w:pPr>
-            <w:r>
-              <w:rPr>
-                <w:rFonts w:ascii="Times New Roman" w:hAnsi="Times New Roman" w:cs="Times New Roman"/>
-                <w:color w:val="188038"/>
-              </w:rPr>
-              <w:t>Doctor Schedule / Shift</w:t>
-            </w:r>
-          </w:p>
-        </w:tc>
-        <w:tc>
-          <w:tcPr>
-            <w:tcW w:w="4305" w:type="dxa"/>
+            <w:tcW w:w="776" w:type="dxa"/>
             <w:tcBorders>
               <w:top w:val="single" w:sz="5" w:space="0" w:color="C4C7C5"/>
               <w:left w:val="single" w:sz="5" w:space="0" w:color="C4C7C5"/>
@@ -1808,19 +1314,16 @@
             <w:r>
               <w:rPr>
                 <w:rFonts w:ascii="Times New Roman" w:hAnsi="Times New Roman" w:cs="Times New Roman"/>
-              </w:rPr>
-              <w:t>Định nghĩa các ca trực, khung giờ làm việc linh hoạt (Shift Rostering) của bác sĩ theo ngày, làm cơ sở để mở slot nhận lịch hẹn.</w:t>
+                <w:b/>
+                <w:bCs/>
+              </w:rPr>
+              <w:t>4</w:t>
             </w:r>
           </w:p>
         </w:tc>
-      </w:tr>
-      <w:tr>
-        <w:trPr>
-          <w:trHeight w:val="1365"/>
-        </w:trPr>
         <w:tc>
           <w:tcPr>
-            <w:tcW w:w="840" w:type="dxa"/>
+            <w:tcW w:w="1700" w:type="dxa"/>
             <w:tcBorders>
               <w:top w:val="single" w:sz="5" w:space="0" w:color="C4C7C5"/>
               <w:left w:val="single" w:sz="5" w:space="0" w:color="C4C7C5"/>
@@ -1847,13 +1350,13 @@
                 <w:b/>
                 <w:bCs/>
               </w:rPr>
-              <w:t>8</w:t>
+              <w:t>BÁC SĨ ĐA KHOA</w:t>
             </w:r>
           </w:p>
         </w:tc>
         <w:tc>
           <w:tcPr>
-            <w:tcW w:w="1650" w:type="dxa"/>
+            <w:tcW w:w="1820" w:type="dxa"/>
             <w:tcBorders>
               <w:top w:val="single" w:sz="5" w:space="0" w:color="C4C7C5"/>
               <w:left w:val="single" w:sz="5" w:space="0" w:color="C4C7C5"/>
@@ -1877,48 +1380,15 @@
             <w:r>
               <w:rPr>
                 <w:rFonts w:ascii="Times New Roman" w:hAnsi="Times New Roman" w:cs="Times New Roman"/>
-                <w:b/>
-                <w:bCs/>
-              </w:rPr>
-              <w:t>LỊCH HẸN KHÁM</w:t>
+                <w:color w:val="188038"/>
+              </w:rPr>
+              <w:t>General Practitioner (GP)</w:t>
             </w:r>
           </w:p>
         </w:tc>
         <w:tc>
           <w:tcPr>
-            <w:tcW w:w="1980" w:type="dxa"/>
-            <w:tcBorders>
-              <w:top w:val="single" w:sz="5" w:space="0" w:color="C4C7C5"/>
-              <w:left w:val="single" w:sz="5" w:space="0" w:color="C4C7C5"/>
-              <w:bottom w:val="single" w:sz="5" w:space="0" w:color="C4C7C5"/>
-              <w:right w:val="single" w:sz="5" w:space="0" w:color="C4C7C5"/>
-            </w:tcBorders>
-            <w:tcMar>
-              <w:top w:w="120" w:type="dxa"/>
-              <w:left w:w="180" w:type="dxa"/>
-              <w:bottom w:w="120" w:type="dxa"/>
-              <w:right w:w="180" w:type="dxa"/>
-            </w:tcMar>
-          </w:tcPr>
-          <w:p>
-            <w:pPr>
-              <w:spacing w:after="480"/>
-              <w:rPr>
-                <w:rFonts w:ascii="Times New Roman" w:hAnsi="Times New Roman" w:cs="Times New Roman"/>
-              </w:rPr>
-            </w:pPr>
-            <w:r>
-              <w:rPr>
-                <w:rFonts w:ascii="Times New Roman" w:hAnsi="Times New Roman" w:cs="Times New Roman"/>
-                <w:color w:val="188038"/>
-              </w:rPr>
-              <w:t>Appointment</w:t>
-            </w:r>
-          </w:p>
-        </w:tc>
-        <w:tc>
-          <w:tcPr>
-            <w:tcW w:w="4305" w:type="dxa"/>
+            <w:tcW w:w="4721" w:type="dxa"/>
             <w:tcBorders>
               <w:top w:val="single" w:sz="5" w:space="0" w:color="C4C7C5"/>
               <w:left w:val="single" w:sz="5" w:space="0" w:color="C4C7C5"/>
@@ -1944,117 +1414,18 @@
               <w:rPr>
                 <w:rFonts w:ascii="Times New Roman" w:hAnsi="Times New Roman" w:cs="Times New Roman"/>
               </w:rPr>
-              <w:t>Đơn vị điều phối cốt lõi quản lý vòng đời cuộc hẹn giữa bệnh nhân và bác sĩ (Trực tiếp hoặc Từ xa) qua cỗ máy trạng thái (State Machine).</w:t>
+              <w:t>Thực thể con chuyên biệt (Specialization - IS-A), phụ trách tiếp nhận khám ban đầu, xử lý bệnh lý cơ bản và điều phối chuyển tuyến chuyên khoa.</w:t>
             </w:r>
           </w:p>
         </w:tc>
       </w:tr>
       <w:tr>
         <w:trPr>
-          <w:trHeight w:val="1365"/>
+          <w:trHeight w:val="1650"/>
         </w:trPr>
         <w:tc>
           <w:tcPr>
-            <w:tcW w:w="840" w:type="dxa"/>
-            <w:tcBorders>
-              <w:top w:val="single" w:sz="5" w:space="0" w:color="C4C7C5"/>
-              <w:left w:val="single" w:sz="5" w:space="0" w:color="C4C7C5"/>
-              <w:bottom w:val="single" w:sz="5" w:space="0" w:color="C4C7C5"/>
-              <w:right w:val="single" w:sz="5" w:space="0" w:color="C4C7C5"/>
-            </w:tcBorders>
-            <w:tcMar>
-              <w:top w:w="120" w:type="dxa"/>
-              <w:left w:w="180" w:type="dxa"/>
-              <w:bottom w:w="120" w:type="dxa"/>
-              <w:right w:w="180" w:type="dxa"/>
-            </w:tcMar>
-          </w:tcPr>
-          <w:p>
-            <w:pPr>
-              <w:spacing w:after="480"/>
-              <w:rPr>
-                <w:rFonts w:ascii="Times New Roman" w:hAnsi="Times New Roman" w:cs="Times New Roman"/>
-              </w:rPr>
-            </w:pPr>
-            <w:r>
-              <w:rPr>
-                <w:rFonts w:ascii="Times New Roman" w:hAnsi="Times New Roman" w:cs="Times New Roman"/>
-                <w:b/>
-                <w:bCs/>
-              </w:rPr>
-              <w:lastRenderedPageBreak/>
-              <w:t>9</w:t>
-            </w:r>
-          </w:p>
-        </w:tc>
-        <w:tc>
-          <w:tcPr>
-            <w:tcW w:w="1650" w:type="dxa"/>
-            <w:tcBorders>
-              <w:top w:val="single" w:sz="5" w:space="0" w:color="C4C7C5"/>
-              <w:left w:val="single" w:sz="5" w:space="0" w:color="C4C7C5"/>
-              <w:bottom w:val="single" w:sz="5" w:space="0" w:color="C4C7C5"/>
-              <w:right w:val="single" w:sz="5" w:space="0" w:color="C4C7C5"/>
-            </w:tcBorders>
-            <w:tcMar>
-              <w:top w:w="120" w:type="dxa"/>
-              <w:left w:w="180" w:type="dxa"/>
-              <w:bottom w:w="120" w:type="dxa"/>
-              <w:right w:w="180" w:type="dxa"/>
-            </w:tcMar>
-          </w:tcPr>
-          <w:p>
-            <w:pPr>
-              <w:spacing w:after="480"/>
-              <w:rPr>
-                <w:rFonts w:ascii="Times New Roman" w:hAnsi="Times New Roman" w:cs="Times New Roman"/>
-              </w:rPr>
-            </w:pPr>
-            <w:r>
-              <w:rPr>
-                <w:rFonts w:ascii="Times New Roman" w:hAnsi="Times New Roman" w:cs="Times New Roman"/>
-                <w:b/>
-                <w:bCs/>
-              </w:rPr>
-              <w:t>PHIÊN KHÁM TỪ XA</w:t>
-            </w:r>
-          </w:p>
-        </w:tc>
-        <w:tc>
-          <w:tcPr>
-            <w:tcW w:w="1980" w:type="dxa"/>
-            <w:tcBorders>
-              <w:top w:val="single" w:sz="5" w:space="0" w:color="C4C7C5"/>
-              <w:left w:val="single" w:sz="5" w:space="0" w:color="C4C7C5"/>
-              <w:bottom w:val="single" w:sz="5" w:space="0" w:color="C4C7C5"/>
-              <w:right w:val="single" w:sz="5" w:space="0" w:color="C4C7C5"/>
-            </w:tcBorders>
-            <w:tcMar>
-              <w:top w:w="120" w:type="dxa"/>
-              <w:left w:w="180" w:type="dxa"/>
-              <w:bottom w:w="120" w:type="dxa"/>
-              <w:right w:w="180" w:type="dxa"/>
-            </w:tcMar>
-          </w:tcPr>
-          <w:p>
-            <w:pPr>
-              <w:spacing w:after="480"/>
-              <w:rPr>
-                <w:rFonts w:ascii="Times New Roman" w:hAnsi="Times New Roman" w:cs="Times New Roman"/>
-              </w:rPr>
-            </w:pPr>
-            <w:r>
-              <w:rPr>
-                <w:rFonts w:ascii="Times New Roman" w:hAnsi="Times New Roman" w:cs="Times New Roman"/>
-                <w:color w:val="188038"/>
-              </w:rPr>
-              <w:t>Telemedicine Session</w:t>
-            </w:r>
-          </w:p>
-        </w:tc>
-        <w:tc>
-          <w:tcPr>
-            <w:tcW w:w="4305" w:type="dxa"/>
+            <w:tcW w:w="776" w:type="dxa"/>
             <w:tcBorders>
               <w:top w:val="single" w:sz="5" w:space="0" w:color="C4C7C5"/>
               <w:left w:val="single" w:sz="5" w:space="0" w:color="C4C7C5"/>
@@ -2079,19 +1450,16 @@
             <w:r>
               <w:rPr>
                 <w:rFonts w:ascii="Times New Roman" w:hAnsi="Times New Roman" w:cs="Times New Roman"/>
-              </w:rPr>
-              <w:t>Thực thể mở rộng của lịch hẹn trực tuyến, lưu trữ thông tin kỹ thuật phục vụ phòng khám ảo (URL hội chẩn WebRTC, khóa mã hóa E2EE).</w:t>
+                <w:b/>
+                <w:bCs/>
+              </w:rPr>
+              <w:t>5</w:t>
             </w:r>
           </w:p>
         </w:tc>
-      </w:tr>
-      <w:tr>
-        <w:trPr>
-          <w:trHeight w:val="1365"/>
-        </w:trPr>
         <w:tc>
           <w:tcPr>
-            <w:tcW w:w="840" w:type="dxa"/>
+            <w:tcW w:w="1700" w:type="dxa"/>
             <w:tcBorders>
               <w:top w:val="single" w:sz="5" w:space="0" w:color="C4C7C5"/>
               <w:left w:val="single" w:sz="5" w:space="0" w:color="C4C7C5"/>
@@ -2118,13 +1486,13 @@
                 <w:b/>
                 <w:bCs/>
               </w:rPr>
-              <w:t>10</w:t>
+              <w:t>BÁC SĨ CHUYÊN KHOA</w:t>
             </w:r>
           </w:p>
         </w:tc>
         <w:tc>
           <w:tcPr>
-            <w:tcW w:w="1650" w:type="dxa"/>
+            <w:tcW w:w="1820" w:type="dxa"/>
             <w:tcBorders>
               <w:top w:val="single" w:sz="5" w:space="0" w:color="C4C7C5"/>
               <w:left w:val="single" w:sz="5" w:space="0" w:color="C4C7C5"/>
@@ -2148,48 +1516,15 @@
             <w:r>
               <w:rPr>
                 <w:rFonts w:ascii="Times New Roman" w:hAnsi="Times New Roman" w:cs="Times New Roman"/>
-                <w:b/>
-                <w:bCs/>
-              </w:rPr>
-              <w:t>PHIẾU CHUYỂN TUYẾN</w:t>
+                <w:color w:val="188038"/>
+              </w:rPr>
+              <w:t>Specialist</w:t>
             </w:r>
           </w:p>
         </w:tc>
         <w:tc>
           <w:tcPr>
-            <w:tcW w:w="1980" w:type="dxa"/>
-            <w:tcBorders>
-              <w:top w:val="single" w:sz="5" w:space="0" w:color="C4C7C5"/>
-              <w:left w:val="single" w:sz="5" w:space="0" w:color="C4C7C5"/>
-              <w:bottom w:val="single" w:sz="5" w:space="0" w:color="C4C7C5"/>
-              <w:right w:val="single" w:sz="5" w:space="0" w:color="C4C7C5"/>
-            </w:tcBorders>
-            <w:tcMar>
-              <w:top w:w="120" w:type="dxa"/>
-              <w:left w:w="180" w:type="dxa"/>
-              <w:bottom w:w="120" w:type="dxa"/>
-              <w:right w:w="180" w:type="dxa"/>
-            </w:tcMar>
-          </w:tcPr>
-          <w:p>
-            <w:pPr>
-              <w:spacing w:after="480"/>
-              <w:rPr>
-                <w:rFonts w:ascii="Times New Roman" w:hAnsi="Times New Roman" w:cs="Times New Roman"/>
-              </w:rPr>
-            </w:pPr>
-            <w:r>
-              <w:rPr>
-                <w:rFonts w:ascii="Times New Roman" w:hAnsi="Times New Roman" w:cs="Times New Roman"/>
-                <w:color w:val="188038"/>
-              </w:rPr>
-              <w:t>Referral Ticket</w:t>
-            </w:r>
-          </w:p>
-        </w:tc>
-        <w:tc>
-          <w:tcPr>
-            <w:tcW w:w="4305" w:type="dxa"/>
+            <w:tcW w:w="4721" w:type="dxa"/>
             <w:tcBorders>
               <w:top w:val="single" w:sz="5" w:space="0" w:color="C4C7C5"/>
               <w:left w:val="single" w:sz="5" w:space="0" w:color="C4C7C5"/>
@@ -2215,7 +1550,7 @@
               <w:rPr>
                 <w:rFonts w:ascii="Times New Roman" w:hAnsi="Times New Roman" w:cs="Times New Roman"/>
               </w:rPr>
-              <w:t>Chứng từ trung gian ghi nhận yêu cầu chuyển ca bệnh từ Bác sĩ Đa khoa sang Chuyên khoa hoặc đích danh Bác sĩ Chuyên khoa.</w:t>
+              <w:t>Thực thể con chuyên biệt (Specialization - IS-A), tiếp nhận hội chẩn chuyên sâu theo đúng chuyên khoa được phân công hoặc qua phiếu chuyển tuyến.</w:t>
             </w:r>
           </w:p>
         </w:tc>
@@ -2226,105 +1561,7 @@
         </w:trPr>
         <w:tc>
           <w:tcPr>
-            <w:tcW w:w="840" w:type="dxa"/>
-            <w:tcBorders>
-              <w:top w:val="single" w:sz="5" w:space="0" w:color="C4C7C5"/>
-              <w:left w:val="single" w:sz="5" w:space="0" w:color="C4C7C5"/>
-              <w:bottom w:val="single" w:sz="5" w:space="0" w:color="C4C7C5"/>
-              <w:right w:val="single" w:sz="5" w:space="0" w:color="C4C7C5"/>
-            </w:tcBorders>
-            <w:tcMar>
-              <w:top w:w="120" w:type="dxa"/>
-              <w:left w:w="180" w:type="dxa"/>
-              <w:bottom w:w="120" w:type="dxa"/>
-              <w:right w:w="180" w:type="dxa"/>
-            </w:tcMar>
-          </w:tcPr>
-          <w:p>
-            <w:pPr>
-              <w:spacing w:after="480"/>
-              <w:rPr>
-                <w:rFonts w:ascii="Times New Roman" w:hAnsi="Times New Roman" w:cs="Times New Roman"/>
-              </w:rPr>
-            </w:pPr>
-            <w:r>
-              <w:rPr>
-                <w:rFonts w:ascii="Times New Roman" w:hAnsi="Times New Roman" w:cs="Times New Roman"/>
-                <w:b/>
-                <w:bCs/>
-              </w:rPr>
-              <w:t>11</w:t>
-            </w:r>
-          </w:p>
-        </w:tc>
-        <w:tc>
-          <w:tcPr>
-            <w:tcW w:w="1650" w:type="dxa"/>
-            <w:tcBorders>
-              <w:top w:val="single" w:sz="5" w:space="0" w:color="C4C7C5"/>
-              <w:left w:val="single" w:sz="5" w:space="0" w:color="C4C7C5"/>
-              <w:bottom w:val="single" w:sz="5" w:space="0" w:color="C4C7C5"/>
-              <w:right w:val="single" w:sz="5" w:space="0" w:color="C4C7C5"/>
-            </w:tcBorders>
-            <w:tcMar>
-              <w:top w:w="120" w:type="dxa"/>
-              <w:left w:w="180" w:type="dxa"/>
-              <w:bottom w:w="120" w:type="dxa"/>
-              <w:right w:w="180" w:type="dxa"/>
-            </w:tcMar>
-          </w:tcPr>
-          <w:p>
-            <w:pPr>
-              <w:spacing w:after="480"/>
-              <w:rPr>
-                <w:rFonts w:ascii="Times New Roman" w:hAnsi="Times New Roman" w:cs="Times New Roman"/>
-              </w:rPr>
-            </w:pPr>
-            <w:r>
-              <w:rPr>
-                <w:rFonts w:ascii="Times New Roman" w:hAnsi="Times New Roman" w:cs="Times New Roman"/>
-                <w:b/>
-                <w:bCs/>
-              </w:rPr>
-              <w:t>HỒ SƠ BỆNH ÁN</w:t>
-            </w:r>
-          </w:p>
-        </w:tc>
-        <w:tc>
-          <w:tcPr>
-            <w:tcW w:w="1980" w:type="dxa"/>
-            <w:tcBorders>
-              <w:top w:val="single" w:sz="5" w:space="0" w:color="C4C7C5"/>
-              <w:left w:val="single" w:sz="5" w:space="0" w:color="C4C7C5"/>
-              <w:bottom w:val="single" w:sz="5" w:space="0" w:color="C4C7C5"/>
-              <w:right w:val="single" w:sz="5" w:space="0" w:color="C4C7C5"/>
-            </w:tcBorders>
-            <w:tcMar>
-              <w:top w:w="120" w:type="dxa"/>
-              <w:left w:w="180" w:type="dxa"/>
-              <w:bottom w:w="120" w:type="dxa"/>
-              <w:right w:w="180" w:type="dxa"/>
-            </w:tcMar>
-          </w:tcPr>
-          <w:p>
-            <w:pPr>
-              <w:spacing w:after="480"/>
-              <w:rPr>
-                <w:rFonts w:ascii="Times New Roman" w:hAnsi="Times New Roman" w:cs="Times New Roman"/>
-              </w:rPr>
-            </w:pPr>
-            <w:r>
-              <w:rPr>
-                <w:rFonts w:ascii="Times New Roman" w:hAnsi="Times New Roman" w:cs="Times New Roman"/>
-                <w:color w:val="188038"/>
-              </w:rPr>
-              <w:t>Medical Record (EMR)</w:t>
-            </w:r>
-          </w:p>
-        </w:tc>
-        <w:tc>
-          <w:tcPr>
-            <w:tcW w:w="4305" w:type="dxa"/>
+            <w:tcW w:w="776" w:type="dxa"/>
             <w:tcBorders>
               <w:top w:val="single" w:sz="5" w:space="0" w:color="C4C7C5"/>
               <w:left w:val="single" w:sz="5" w:space="0" w:color="C4C7C5"/>
@@ -2349,19 +1586,16 @@
             <w:r>
               <w:rPr>
                 <w:rFonts w:ascii="Times New Roman" w:hAnsi="Times New Roman" w:cs="Times New Roman"/>
-              </w:rPr>
-              <w:t>Hồ sơ điện tử ghi nhận triệu chứng, chẩn đoán (ICD-10) và kết luận điều trị sau buổi khám; chuyển sang trạng thái bất biến (Read-only) khi khóa sổ.</w:t>
+                <w:b/>
+                <w:bCs/>
+              </w:rPr>
+              <w:t>6</w:t>
             </w:r>
           </w:p>
         </w:tc>
-      </w:tr>
-      <w:tr>
-        <w:trPr>
-          <w:trHeight w:val="1365"/>
-        </w:trPr>
         <w:tc>
           <w:tcPr>
-            <w:tcW w:w="840" w:type="dxa"/>
+            <w:tcW w:w="1700" w:type="dxa"/>
             <w:tcBorders>
               <w:top w:val="single" w:sz="5" w:space="0" w:color="C4C7C5"/>
               <w:left w:val="single" w:sz="5" w:space="0" w:color="C4C7C5"/>
@@ -2388,13 +1622,13 @@
                 <w:b/>
                 <w:bCs/>
               </w:rPr>
-              <w:t>12</w:t>
+              <w:t>CHUYÊN KHOA</w:t>
             </w:r>
           </w:p>
         </w:tc>
         <w:tc>
           <w:tcPr>
-            <w:tcW w:w="1650" w:type="dxa"/>
+            <w:tcW w:w="1820" w:type="dxa"/>
             <w:tcBorders>
               <w:top w:val="single" w:sz="5" w:space="0" w:color="C4C7C5"/>
               <w:left w:val="single" w:sz="5" w:space="0" w:color="C4C7C5"/>
@@ -2418,48 +1652,15 @@
             <w:r>
               <w:rPr>
                 <w:rFonts w:ascii="Times New Roman" w:hAnsi="Times New Roman" w:cs="Times New Roman"/>
-                <w:b/>
-                <w:bCs/>
-              </w:rPr>
-              <w:t>PHỤ LỤC ĐÍNH CHÍNH</w:t>
+                <w:color w:val="188038"/>
+              </w:rPr>
+              <w:t>Medical Specialty</w:t>
             </w:r>
           </w:p>
         </w:tc>
         <w:tc>
           <w:tcPr>
-            <w:tcW w:w="1980" w:type="dxa"/>
-            <w:tcBorders>
-              <w:top w:val="single" w:sz="5" w:space="0" w:color="C4C7C5"/>
-              <w:left w:val="single" w:sz="5" w:space="0" w:color="C4C7C5"/>
-              <w:bottom w:val="single" w:sz="5" w:space="0" w:color="C4C7C5"/>
-              <w:right w:val="single" w:sz="5" w:space="0" w:color="C4C7C5"/>
-            </w:tcBorders>
-            <w:tcMar>
-              <w:top w:w="120" w:type="dxa"/>
-              <w:left w:w="180" w:type="dxa"/>
-              <w:bottom w:w="120" w:type="dxa"/>
-              <w:right w:w="180" w:type="dxa"/>
-            </w:tcMar>
-          </w:tcPr>
-          <w:p>
-            <w:pPr>
-              <w:spacing w:after="480"/>
-              <w:rPr>
-                <w:rFonts w:ascii="Times New Roman" w:hAnsi="Times New Roman" w:cs="Times New Roman"/>
-              </w:rPr>
-            </w:pPr>
-            <w:r>
-              <w:rPr>
-                <w:rFonts w:ascii="Times New Roman" w:hAnsi="Times New Roman" w:cs="Times New Roman"/>
-                <w:color w:val="188038"/>
-              </w:rPr>
-              <w:t>Record Addendum</w:t>
-            </w:r>
-          </w:p>
-        </w:tc>
-        <w:tc>
-          <w:tcPr>
-            <w:tcW w:w="4305" w:type="dxa"/>
+            <w:tcW w:w="4721" w:type="dxa"/>
             <w:tcBorders>
               <w:top w:val="single" w:sz="5" w:space="0" w:color="C4C7C5"/>
               <w:left w:val="single" w:sz="5" w:space="0" w:color="C4C7C5"/>
@@ -2485,7 +1686,7 @@
               <w:rPr>
                 <w:rFonts w:ascii="Times New Roman" w:hAnsi="Times New Roman" w:cs="Times New Roman"/>
               </w:rPr>
-              <w:t>Bản ghi bổ sung/đính chính gắn liền với bệnh án gốc nhằm bảo toàn tính bất biến và dấu vết pháp lý y khoa khi có sai sót cần điều chỉnh.</w:t>
+              <w:t>Danh mục quản lý các chuyên khoa y tế (Tim mạch, Da liễu, Thần kinh,...), là căn cứ phân loại bác sĩ chuyên khoa và điều hướng chuyển tuyến.</w:t>
             </w:r>
           </w:p>
         </w:tc>
@@ -2496,105 +1697,7 @@
         </w:trPr>
         <w:tc>
           <w:tcPr>
-            <w:tcW w:w="840" w:type="dxa"/>
-            <w:tcBorders>
-              <w:top w:val="single" w:sz="5" w:space="0" w:color="C4C7C5"/>
-              <w:left w:val="single" w:sz="5" w:space="0" w:color="C4C7C5"/>
-              <w:bottom w:val="single" w:sz="5" w:space="0" w:color="C4C7C5"/>
-              <w:right w:val="single" w:sz="5" w:space="0" w:color="C4C7C5"/>
-            </w:tcBorders>
-            <w:tcMar>
-              <w:top w:w="120" w:type="dxa"/>
-              <w:left w:w="180" w:type="dxa"/>
-              <w:bottom w:w="120" w:type="dxa"/>
-              <w:right w:w="180" w:type="dxa"/>
-            </w:tcMar>
-          </w:tcPr>
-          <w:p>
-            <w:pPr>
-              <w:spacing w:after="480"/>
-              <w:rPr>
-                <w:rFonts w:ascii="Times New Roman" w:hAnsi="Times New Roman" w:cs="Times New Roman"/>
-              </w:rPr>
-            </w:pPr>
-            <w:r>
-              <w:rPr>
-                <w:rFonts w:ascii="Times New Roman" w:hAnsi="Times New Roman" w:cs="Times New Roman"/>
-                <w:b/>
-                <w:bCs/>
-              </w:rPr>
-              <w:t>13</w:t>
-            </w:r>
-          </w:p>
-        </w:tc>
-        <w:tc>
-          <w:tcPr>
-            <w:tcW w:w="1650" w:type="dxa"/>
-            <w:tcBorders>
-              <w:top w:val="single" w:sz="5" w:space="0" w:color="C4C7C5"/>
-              <w:left w:val="single" w:sz="5" w:space="0" w:color="C4C7C5"/>
-              <w:bottom w:val="single" w:sz="5" w:space="0" w:color="C4C7C5"/>
-              <w:right w:val="single" w:sz="5" w:space="0" w:color="C4C7C5"/>
-            </w:tcBorders>
-            <w:tcMar>
-              <w:top w:w="120" w:type="dxa"/>
-              <w:left w:w="180" w:type="dxa"/>
-              <w:bottom w:w="120" w:type="dxa"/>
-              <w:right w:w="180" w:type="dxa"/>
-            </w:tcMar>
-          </w:tcPr>
-          <w:p>
-            <w:pPr>
-              <w:spacing w:after="480"/>
-              <w:rPr>
-                <w:rFonts w:ascii="Times New Roman" w:hAnsi="Times New Roman" w:cs="Times New Roman"/>
-              </w:rPr>
-            </w:pPr>
-            <w:r>
-              <w:rPr>
-                <w:rFonts w:ascii="Times New Roman" w:hAnsi="Times New Roman" w:cs="Times New Roman"/>
-                <w:b/>
-                <w:bCs/>
-              </w:rPr>
-              <w:t>ĐƠN THUỐC</w:t>
-            </w:r>
-          </w:p>
-        </w:tc>
-        <w:tc>
-          <w:tcPr>
-            <w:tcW w:w="1980" w:type="dxa"/>
-            <w:tcBorders>
-              <w:top w:val="single" w:sz="5" w:space="0" w:color="C4C7C5"/>
-              <w:left w:val="single" w:sz="5" w:space="0" w:color="C4C7C5"/>
-              <w:bottom w:val="single" w:sz="5" w:space="0" w:color="C4C7C5"/>
-              <w:right w:val="single" w:sz="5" w:space="0" w:color="C4C7C5"/>
-            </w:tcBorders>
-            <w:tcMar>
-              <w:top w:w="120" w:type="dxa"/>
-              <w:left w:w="180" w:type="dxa"/>
-              <w:bottom w:w="120" w:type="dxa"/>
-              <w:right w:w="180" w:type="dxa"/>
-            </w:tcMar>
-          </w:tcPr>
-          <w:p>
-            <w:pPr>
-              <w:spacing w:after="480"/>
-              <w:rPr>
-                <w:rFonts w:ascii="Times New Roman" w:hAnsi="Times New Roman" w:cs="Times New Roman"/>
-              </w:rPr>
-            </w:pPr>
-            <w:r>
-              <w:rPr>
-                <w:rFonts w:ascii="Times New Roman" w:hAnsi="Times New Roman" w:cs="Times New Roman"/>
-                <w:color w:val="188038"/>
-              </w:rPr>
-              <w:t>Prescription</w:t>
-            </w:r>
-          </w:p>
-        </w:tc>
-        <w:tc>
-          <w:tcPr>
-            <w:tcW w:w="4305" w:type="dxa"/>
+            <w:tcW w:w="776" w:type="dxa"/>
             <w:tcBorders>
               <w:top w:val="single" w:sz="5" w:space="0" w:color="C4C7C5"/>
               <w:left w:val="single" w:sz="5" w:space="0" w:color="C4C7C5"/>
@@ -2619,19 +1722,16 @@
             <w:r>
               <w:rPr>
                 <w:rFonts w:ascii="Times New Roman" w:hAnsi="Times New Roman" w:cs="Times New Roman"/>
-              </w:rPr>
-              <w:t>Đơn thuốc điện tử được phát hành gắn liền với một hồ sơ bệnh án đã hoàn tất, là căn cứ để chỉ định điều trị và đồng bộ kho dược.</w:t>
+                <w:b/>
+                <w:bCs/>
+              </w:rPr>
+              <w:t>7</w:t>
             </w:r>
           </w:p>
         </w:tc>
-      </w:tr>
-      <w:tr>
-        <w:trPr>
-          <w:trHeight w:val="1365"/>
-        </w:trPr>
         <w:tc>
           <w:tcPr>
-            <w:tcW w:w="840" w:type="dxa"/>
+            <w:tcW w:w="1700" w:type="dxa"/>
             <w:tcBorders>
               <w:top w:val="single" w:sz="5" w:space="0" w:color="C4C7C5"/>
               <w:left w:val="single" w:sz="5" w:space="0" w:color="C4C7C5"/>
@@ -2658,13 +1758,13 @@
                 <w:b/>
                 <w:bCs/>
               </w:rPr>
-              <w:t>14</w:t>
+              <w:t>LỊCH LÀM VIỆC</w:t>
             </w:r>
           </w:p>
         </w:tc>
         <w:tc>
           <w:tcPr>
-            <w:tcW w:w="1650" w:type="dxa"/>
+            <w:tcW w:w="1820" w:type="dxa"/>
             <w:tcBorders>
               <w:top w:val="single" w:sz="5" w:space="0" w:color="C4C7C5"/>
               <w:left w:val="single" w:sz="5" w:space="0" w:color="C4C7C5"/>
@@ -2688,48 +1788,15 @@
             <w:r>
               <w:rPr>
                 <w:rFonts w:ascii="Times New Roman" w:hAnsi="Times New Roman" w:cs="Times New Roman"/>
-                <w:b/>
-                <w:bCs/>
-              </w:rPr>
-              <w:t>CHI TIẾT ĐƠN THUỐC</w:t>
+                <w:color w:val="188038"/>
+              </w:rPr>
+              <w:t>Doctor Schedule / Shift</w:t>
             </w:r>
           </w:p>
         </w:tc>
         <w:tc>
           <w:tcPr>
-            <w:tcW w:w="1980" w:type="dxa"/>
-            <w:tcBorders>
-              <w:top w:val="single" w:sz="5" w:space="0" w:color="C4C7C5"/>
-              <w:left w:val="single" w:sz="5" w:space="0" w:color="C4C7C5"/>
-              <w:bottom w:val="single" w:sz="5" w:space="0" w:color="C4C7C5"/>
-              <w:right w:val="single" w:sz="5" w:space="0" w:color="C4C7C5"/>
-            </w:tcBorders>
-            <w:tcMar>
-              <w:top w:w="120" w:type="dxa"/>
-              <w:left w:w="180" w:type="dxa"/>
-              <w:bottom w:w="120" w:type="dxa"/>
-              <w:right w:w="180" w:type="dxa"/>
-            </w:tcMar>
-          </w:tcPr>
-          <w:p>
-            <w:pPr>
-              <w:spacing w:after="480"/>
-              <w:rPr>
-                <w:rFonts w:ascii="Times New Roman" w:hAnsi="Times New Roman" w:cs="Times New Roman"/>
-              </w:rPr>
-            </w:pPr>
-            <w:r>
-              <w:rPr>
-                <w:rFonts w:ascii="Times New Roman" w:hAnsi="Times New Roman" w:cs="Times New Roman"/>
-                <w:color w:val="188038"/>
-              </w:rPr>
-              <w:t>Prescription Item</w:t>
-            </w:r>
-          </w:p>
-        </w:tc>
-        <w:tc>
-          <w:tcPr>
-            <w:tcW w:w="4305" w:type="dxa"/>
+            <w:tcW w:w="4721" w:type="dxa"/>
             <w:tcBorders>
               <w:top w:val="single" w:sz="5" w:space="0" w:color="C4C7C5"/>
               <w:left w:val="single" w:sz="5" w:space="0" w:color="C4C7C5"/>
@@ -2755,7 +1822,7 @@
               <w:rPr>
                 <w:rFonts w:ascii="Times New Roman" w:hAnsi="Times New Roman" w:cs="Times New Roman"/>
               </w:rPr>
-              <w:t>Thực thể yếu/liên kết phân rã đơn thuốc thành từng dòng thuốc cụ thể kèm liều dùng, đường dùng và số lượng cấp phát.</w:t>
+              <w:t>Định nghĩa các ca trực, khung giờ làm việc linh hoạt (Shift Rostering) của bác sĩ theo ngày, làm cơ sở để mở slot nhận lịch hẹn.</w:t>
             </w:r>
           </w:p>
         </w:tc>
@@ -2766,105 +1833,7 @@
         </w:trPr>
         <w:tc>
           <w:tcPr>
-            <w:tcW w:w="840" w:type="dxa"/>
-            <w:tcBorders>
-              <w:top w:val="single" w:sz="5" w:space="0" w:color="C4C7C5"/>
-              <w:left w:val="single" w:sz="5" w:space="0" w:color="C4C7C5"/>
-              <w:bottom w:val="single" w:sz="5" w:space="0" w:color="C4C7C5"/>
-              <w:right w:val="single" w:sz="5" w:space="0" w:color="C4C7C5"/>
-            </w:tcBorders>
-            <w:tcMar>
-              <w:top w:w="120" w:type="dxa"/>
-              <w:left w:w="180" w:type="dxa"/>
-              <w:bottom w:w="120" w:type="dxa"/>
-              <w:right w:w="180" w:type="dxa"/>
-            </w:tcMar>
-          </w:tcPr>
-          <w:p>
-            <w:pPr>
-              <w:spacing w:after="480"/>
-              <w:rPr>
-                <w:rFonts w:ascii="Times New Roman" w:hAnsi="Times New Roman" w:cs="Times New Roman"/>
-              </w:rPr>
-            </w:pPr>
-            <w:r>
-              <w:rPr>
-                <w:rFonts w:ascii="Times New Roman" w:hAnsi="Times New Roman" w:cs="Times New Roman"/>
-                <w:b/>
-                <w:bCs/>
-              </w:rPr>
-              <w:t>15</w:t>
-            </w:r>
-          </w:p>
-        </w:tc>
-        <w:tc>
-          <w:tcPr>
-            <w:tcW w:w="1650" w:type="dxa"/>
-            <w:tcBorders>
-              <w:top w:val="single" w:sz="5" w:space="0" w:color="C4C7C5"/>
-              <w:left w:val="single" w:sz="5" w:space="0" w:color="C4C7C5"/>
-              <w:bottom w:val="single" w:sz="5" w:space="0" w:color="C4C7C5"/>
-              <w:right w:val="single" w:sz="5" w:space="0" w:color="C4C7C5"/>
-            </w:tcBorders>
-            <w:tcMar>
-              <w:top w:w="120" w:type="dxa"/>
-              <w:left w:w="180" w:type="dxa"/>
-              <w:bottom w:w="120" w:type="dxa"/>
-              <w:right w:w="180" w:type="dxa"/>
-            </w:tcMar>
-          </w:tcPr>
-          <w:p>
-            <w:pPr>
-              <w:spacing w:after="480"/>
-              <w:rPr>
-                <w:rFonts w:ascii="Times New Roman" w:hAnsi="Times New Roman" w:cs="Times New Roman"/>
-              </w:rPr>
-            </w:pPr>
-            <w:r>
-              <w:rPr>
-                <w:rFonts w:ascii="Times New Roman" w:hAnsi="Times New Roman" w:cs="Times New Roman"/>
-                <w:b/>
-                <w:bCs/>
-              </w:rPr>
-              <w:t>DANH MỤC THUỐC</w:t>
-            </w:r>
-          </w:p>
-        </w:tc>
-        <w:tc>
-          <w:tcPr>
-            <w:tcW w:w="1980" w:type="dxa"/>
-            <w:tcBorders>
-              <w:top w:val="single" w:sz="5" w:space="0" w:color="C4C7C5"/>
-              <w:left w:val="single" w:sz="5" w:space="0" w:color="C4C7C5"/>
-              <w:bottom w:val="single" w:sz="5" w:space="0" w:color="C4C7C5"/>
-              <w:right w:val="single" w:sz="5" w:space="0" w:color="C4C7C5"/>
-            </w:tcBorders>
-            <w:tcMar>
-              <w:top w:w="120" w:type="dxa"/>
-              <w:left w:w="180" w:type="dxa"/>
-              <w:bottom w:w="120" w:type="dxa"/>
-              <w:right w:w="180" w:type="dxa"/>
-            </w:tcMar>
-          </w:tcPr>
-          <w:p>
-            <w:pPr>
-              <w:spacing w:after="480"/>
-              <w:rPr>
-                <w:rFonts w:ascii="Times New Roman" w:hAnsi="Times New Roman" w:cs="Times New Roman"/>
-              </w:rPr>
-            </w:pPr>
-            <w:r>
-              <w:rPr>
-                <w:rFonts w:ascii="Times New Roman" w:hAnsi="Times New Roman" w:cs="Times New Roman"/>
-                <w:color w:val="188038"/>
-              </w:rPr>
-              <w:t>Medication Inventory</w:t>
-            </w:r>
-          </w:p>
-        </w:tc>
-        <w:tc>
-          <w:tcPr>
-            <w:tcW w:w="4305" w:type="dxa"/>
+            <w:tcW w:w="776" w:type="dxa"/>
             <w:tcBorders>
               <w:top w:val="single" w:sz="5" w:space="0" w:color="C4C7C5"/>
               <w:left w:val="single" w:sz="5" w:space="0" w:color="C4C7C5"/>
@@ -2889,6 +1858,1065 @@
             <w:r>
               <w:rPr>
                 <w:rFonts w:ascii="Times New Roman" w:hAnsi="Times New Roman" w:cs="Times New Roman"/>
+                <w:b/>
+                <w:bCs/>
+              </w:rPr>
+              <w:t>8</w:t>
+            </w:r>
+          </w:p>
+        </w:tc>
+        <w:tc>
+          <w:tcPr>
+            <w:tcW w:w="1700" w:type="dxa"/>
+            <w:tcBorders>
+              <w:top w:val="single" w:sz="5" w:space="0" w:color="C4C7C5"/>
+              <w:left w:val="single" w:sz="5" w:space="0" w:color="C4C7C5"/>
+              <w:bottom w:val="single" w:sz="5" w:space="0" w:color="C4C7C5"/>
+              <w:right w:val="single" w:sz="5" w:space="0" w:color="C4C7C5"/>
+            </w:tcBorders>
+            <w:tcMar>
+              <w:top w:w="120" w:type="dxa"/>
+              <w:left w:w="180" w:type="dxa"/>
+              <w:bottom w:w="120" w:type="dxa"/>
+              <w:right w:w="180" w:type="dxa"/>
+            </w:tcMar>
+          </w:tcPr>
+          <w:p>
+            <w:pPr>
+              <w:spacing w:after="480"/>
+              <w:rPr>
+                <w:rFonts w:ascii="Times New Roman" w:hAnsi="Times New Roman" w:cs="Times New Roman"/>
+              </w:rPr>
+            </w:pPr>
+            <w:r>
+              <w:rPr>
+                <w:rFonts w:ascii="Times New Roman" w:hAnsi="Times New Roman" w:cs="Times New Roman"/>
+                <w:b/>
+                <w:bCs/>
+              </w:rPr>
+              <w:t>LỊCH HẸN KHÁM</w:t>
+            </w:r>
+          </w:p>
+        </w:tc>
+        <w:tc>
+          <w:tcPr>
+            <w:tcW w:w="1820" w:type="dxa"/>
+            <w:tcBorders>
+              <w:top w:val="single" w:sz="5" w:space="0" w:color="C4C7C5"/>
+              <w:left w:val="single" w:sz="5" w:space="0" w:color="C4C7C5"/>
+              <w:bottom w:val="single" w:sz="5" w:space="0" w:color="C4C7C5"/>
+              <w:right w:val="single" w:sz="5" w:space="0" w:color="C4C7C5"/>
+            </w:tcBorders>
+            <w:tcMar>
+              <w:top w:w="120" w:type="dxa"/>
+              <w:left w:w="180" w:type="dxa"/>
+              <w:bottom w:w="120" w:type="dxa"/>
+              <w:right w:w="180" w:type="dxa"/>
+            </w:tcMar>
+          </w:tcPr>
+          <w:p>
+            <w:pPr>
+              <w:spacing w:after="480"/>
+              <w:rPr>
+                <w:rFonts w:ascii="Times New Roman" w:hAnsi="Times New Roman" w:cs="Times New Roman"/>
+              </w:rPr>
+            </w:pPr>
+            <w:r>
+              <w:rPr>
+                <w:rFonts w:ascii="Times New Roman" w:hAnsi="Times New Roman" w:cs="Times New Roman"/>
+                <w:color w:val="188038"/>
+              </w:rPr>
+              <w:t>Appointment</w:t>
+            </w:r>
+          </w:p>
+        </w:tc>
+        <w:tc>
+          <w:tcPr>
+            <w:tcW w:w="4721" w:type="dxa"/>
+            <w:tcBorders>
+              <w:top w:val="single" w:sz="5" w:space="0" w:color="C4C7C5"/>
+              <w:left w:val="single" w:sz="5" w:space="0" w:color="C4C7C5"/>
+              <w:bottom w:val="single" w:sz="5" w:space="0" w:color="C4C7C5"/>
+              <w:right w:val="single" w:sz="5" w:space="0" w:color="C4C7C5"/>
+            </w:tcBorders>
+            <w:tcMar>
+              <w:top w:w="120" w:type="dxa"/>
+              <w:left w:w="180" w:type="dxa"/>
+              <w:bottom w:w="120" w:type="dxa"/>
+              <w:right w:w="180" w:type="dxa"/>
+            </w:tcMar>
+          </w:tcPr>
+          <w:p>
+            <w:pPr>
+              <w:spacing w:after="480"/>
+              <w:jc w:val="both"/>
+              <w:rPr>
+                <w:rFonts w:ascii="Times New Roman" w:hAnsi="Times New Roman" w:cs="Times New Roman"/>
+              </w:rPr>
+            </w:pPr>
+            <w:r>
+              <w:rPr>
+                <w:rFonts w:ascii="Times New Roman" w:hAnsi="Times New Roman" w:cs="Times New Roman"/>
+              </w:rPr>
+              <w:t>Đơn vị điều phối cốt lõi quản lý vòng đời cuộc hẹn giữa bệnh nhân và bác sĩ (Trực tiếp hoặc Từ xa) qua cỗ máy trạng thái (State Machine).</w:t>
+            </w:r>
+          </w:p>
+        </w:tc>
+      </w:tr>
+      <w:tr>
+        <w:trPr>
+          <w:trHeight w:val="1365"/>
+        </w:trPr>
+        <w:tc>
+          <w:tcPr>
+            <w:tcW w:w="776" w:type="dxa"/>
+            <w:tcBorders>
+              <w:top w:val="single" w:sz="5" w:space="0" w:color="C4C7C5"/>
+              <w:left w:val="single" w:sz="5" w:space="0" w:color="C4C7C5"/>
+              <w:bottom w:val="single" w:sz="5" w:space="0" w:color="C4C7C5"/>
+              <w:right w:val="single" w:sz="5" w:space="0" w:color="C4C7C5"/>
+            </w:tcBorders>
+            <w:tcMar>
+              <w:top w:w="120" w:type="dxa"/>
+              <w:left w:w="180" w:type="dxa"/>
+              <w:bottom w:w="120" w:type="dxa"/>
+              <w:right w:w="180" w:type="dxa"/>
+            </w:tcMar>
+          </w:tcPr>
+          <w:p>
+            <w:pPr>
+              <w:spacing w:after="480"/>
+              <w:jc w:val="both"/>
+              <w:rPr>
+                <w:rFonts w:ascii="Times New Roman" w:hAnsi="Times New Roman" w:cs="Times New Roman"/>
+              </w:rPr>
+            </w:pPr>
+            <w:r>
+              <w:rPr>
+                <w:rFonts w:ascii="Times New Roman" w:hAnsi="Times New Roman" w:cs="Times New Roman"/>
+                <w:b/>
+                <w:bCs/>
+              </w:rPr>
+              <w:lastRenderedPageBreak/>
+              <w:t>9</w:t>
+            </w:r>
+          </w:p>
+        </w:tc>
+        <w:tc>
+          <w:tcPr>
+            <w:tcW w:w="1700" w:type="dxa"/>
+            <w:tcBorders>
+              <w:top w:val="single" w:sz="5" w:space="0" w:color="C4C7C5"/>
+              <w:left w:val="single" w:sz="5" w:space="0" w:color="C4C7C5"/>
+              <w:bottom w:val="single" w:sz="5" w:space="0" w:color="C4C7C5"/>
+              <w:right w:val="single" w:sz="5" w:space="0" w:color="C4C7C5"/>
+            </w:tcBorders>
+            <w:tcMar>
+              <w:top w:w="120" w:type="dxa"/>
+              <w:left w:w="180" w:type="dxa"/>
+              <w:bottom w:w="120" w:type="dxa"/>
+              <w:right w:w="180" w:type="dxa"/>
+            </w:tcMar>
+          </w:tcPr>
+          <w:p>
+            <w:pPr>
+              <w:spacing w:after="480"/>
+              <w:rPr>
+                <w:rFonts w:ascii="Times New Roman" w:hAnsi="Times New Roman" w:cs="Times New Roman"/>
+              </w:rPr>
+            </w:pPr>
+            <w:r>
+              <w:rPr>
+                <w:rFonts w:ascii="Times New Roman" w:hAnsi="Times New Roman" w:cs="Times New Roman"/>
+                <w:b/>
+                <w:bCs/>
+              </w:rPr>
+              <w:t>PHIÊN KHÁM TỪ XA</w:t>
+            </w:r>
+          </w:p>
+        </w:tc>
+        <w:tc>
+          <w:tcPr>
+            <w:tcW w:w="1820" w:type="dxa"/>
+            <w:tcBorders>
+              <w:top w:val="single" w:sz="5" w:space="0" w:color="C4C7C5"/>
+              <w:left w:val="single" w:sz="5" w:space="0" w:color="C4C7C5"/>
+              <w:bottom w:val="single" w:sz="5" w:space="0" w:color="C4C7C5"/>
+              <w:right w:val="single" w:sz="5" w:space="0" w:color="C4C7C5"/>
+            </w:tcBorders>
+            <w:tcMar>
+              <w:top w:w="120" w:type="dxa"/>
+              <w:left w:w="180" w:type="dxa"/>
+              <w:bottom w:w="120" w:type="dxa"/>
+              <w:right w:w="180" w:type="dxa"/>
+            </w:tcMar>
+          </w:tcPr>
+          <w:p>
+            <w:pPr>
+              <w:spacing w:after="480"/>
+              <w:jc w:val="both"/>
+              <w:rPr>
+                <w:rFonts w:ascii="Times New Roman" w:hAnsi="Times New Roman" w:cs="Times New Roman"/>
+              </w:rPr>
+            </w:pPr>
+            <w:r>
+              <w:rPr>
+                <w:rFonts w:ascii="Times New Roman" w:hAnsi="Times New Roman" w:cs="Times New Roman"/>
+                <w:color w:val="188038"/>
+              </w:rPr>
+              <w:t>Telemedicine Session</w:t>
+            </w:r>
+          </w:p>
+        </w:tc>
+        <w:tc>
+          <w:tcPr>
+            <w:tcW w:w="4721" w:type="dxa"/>
+            <w:tcBorders>
+              <w:top w:val="single" w:sz="5" w:space="0" w:color="C4C7C5"/>
+              <w:left w:val="single" w:sz="5" w:space="0" w:color="C4C7C5"/>
+              <w:bottom w:val="single" w:sz="5" w:space="0" w:color="C4C7C5"/>
+              <w:right w:val="single" w:sz="5" w:space="0" w:color="C4C7C5"/>
+            </w:tcBorders>
+            <w:tcMar>
+              <w:top w:w="120" w:type="dxa"/>
+              <w:left w:w="180" w:type="dxa"/>
+              <w:bottom w:w="120" w:type="dxa"/>
+              <w:right w:w="180" w:type="dxa"/>
+            </w:tcMar>
+          </w:tcPr>
+          <w:p>
+            <w:pPr>
+              <w:spacing w:after="480"/>
+              <w:jc w:val="both"/>
+              <w:rPr>
+                <w:rFonts w:ascii="Times New Roman" w:hAnsi="Times New Roman" w:cs="Times New Roman"/>
+              </w:rPr>
+            </w:pPr>
+            <w:r>
+              <w:rPr>
+                <w:rFonts w:ascii="Times New Roman" w:hAnsi="Times New Roman" w:cs="Times New Roman"/>
+              </w:rPr>
+              <w:t>Thực thể mở rộng của lịch hẹn trực tuyến, lưu trữ thông tin kỹ thuật phục vụ phòng khám ảo (URL hội chẩn WebRTC, khóa mã hóa E2EE).</w:t>
+            </w:r>
+          </w:p>
+        </w:tc>
+      </w:tr>
+      <w:tr>
+        <w:trPr>
+          <w:trHeight w:val="1365"/>
+        </w:trPr>
+        <w:tc>
+          <w:tcPr>
+            <w:tcW w:w="776" w:type="dxa"/>
+            <w:tcBorders>
+              <w:top w:val="single" w:sz="5" w:space="0" w:color="C4C7C5"/>
+              <w:left w:val="single" w:sz="5" w:space="0" w:color="C4C7C5"/>
+              <w:bottom w:val="single" w:sz="5" w:space="0" w:color="C4C7C5"/>
+              <w:right w:val="single" w:sz="5" w:space="0" w:color="C4C7C5"/>
+            </w:tcBorders>
+            <w:tcMar>
+              <w:top w:w="120" w:type="dxa"/>
+              <w:left w:w="180" w:type="dxa"/>
+              <w:bottom w:w="120" w:type="dxa"/>
+              <w:right w:w="180" w:type="dxa"/>
+            </w:tcMar>
+          </w:tcPr>
+          <w:p>
+            <w:pPr>
+              <w:spacing w:after="480"/>
+              <w:jc w:val="both"/>
+              <w:rPr>
+                <w:rFonts w:ascii="Times New Roman" w:hAnsi="Times New Roman" w:cs="Times New Roman"/>
+              </w:rPr>
+            </w:pPr>
+            <w:r>
+              <w:rPr>
+                <w:rFonts w:ascii="Times New Roman" w:hAnsi="Times New Roman" w:cs="Times New Roman"/>
+                <w:b/>
+                <w:bCs/>
+              </w:rPr>
+              <w:t>10</w:t>
+            </w:r>
+          </w:p>
+        </w:tc>
+        <w:tc>
+          <w:tcPr>
+            <w:tcW w:w="1700" w:type="dxa"/>
+            <w:tcBorders>
+              <w:top w:val="single" w:sz="5" w:space="0" w:color="C4C7C5"/>
+              <w:left w:val="single" w:sz="5" w:space="0" w:color="C4C7C5"/>
+              <w:bottom w:val="single" w:sz="5" w:space="0" w:color="C4C7C5"/>
+              <w:right w:val="single" w:sz="5" w:space="0" w:color="C4C7C5"/>
+            </w:tcBorders>
+            <w:tcMar>
+              <w:top w:w="120" w:type="dxa"/>
+              <w:left w:w="180" w:type="dxa"/>
+              <w:bottom w:w="120" w:type="dxa"/>
+              <w:right w:w="180" w:type="dxa"/>
+            </w:tcMar>
+          </w:tcPr>
+          <w:p>
+            <w:pPr>
+              <w:spacing w:after="480"/>
+              <w:rPr>
+                <w:rFonts w:ascii="Times New Roman" w:hAnsi="Times New Roman" w:cs="Times New Roman"/>
+              </w:rPr>
+            </w:pPr>
+            <w:r>
+              <w:rPr>
+                <w:rFonts w:ascii="Times New Roman" w:hAnsi="Times New Roman" w:cs="Times New Roman"/>
+                <w:b/>
+                <w:bCs/>
+              </w:rPr>
+              <w:t>PHIẾU CHUYỂN TUYẾN</w:t>
+            </w:r>
+          </w:p>
+        </w:tc>
+        <w:tc>
+          <w:tcPr>
+            <w:tcW w:w="1820" w:type="dxa"/>
+            <w:tcBorders>
+              <w:top w:val="single" w:sz="5" w:space="0" w:color="C4C7C5"/>
+              <w:left w:val="single" w:sz="5" w:space="0" w:color="C4C7C5"/>
+              <w:bottom w:val="single" w:sz="5" w:space="0" w:color="C4C7C5"/>
+              <w:right w:val="single" w:sz="5" w:space="0" w:color="C4C7C5"/>
+            </w:tcBorders>
+            <w:tcMar>
+              <w:top w:w="120" w:type="dxa"/>
+              <w:left w:w="180" w:type="dxa"/>
+              <w:bottom w:w="120" w:type="dxa"/>
+              <w:right w:w="180" w:type="dxa"/>
+            </w:tcMar>
+          </w:tcPr>
+          <w:p>
+            <w:pPr>
+              <w:spacing w:after="480"/>
+              <w:jc w:val="both"/>
+              <w:rPr>
+                <w:rFonts w:ascii="Times New Roman" w:hAnsi="Times New Roman" w:cs="Times New Roman"/>
+              </w:rPr>
+            </w:pPr>
+            <w:r>
+              <w:rPr>
+                <w:rFonts w:ascii="Times New Roman" w:hAnsi="Times New Roman" w:cs="Times New Roman"/>
+                <w:color w:val="188038"/>
+              </w:rPr>
+              <w:t>Referral Ticket</w:t>
+            </w:r>
+          </w:p>
+        </w:tc>
+        <w:tc>
+          <w:tcPr>
+            <w:tcW w:w="4721" w:type="dxa"/>
+            <w:tcBorders>
+              <w:top w:val="single" w:sz="5" w:space="0" w:color="C4C7C5"/>
+              <w:left w:val="single" w:sz="5" w:space="0" w:color="C4C7C5"/>
+              <w:bottom w:val="single" w:sz="5" w:space="0" w:color="C4C7C5"/>
+              <w:right w:val="single" w:sz="5" w:space="0" w:color="C4C7C5"/>
+            </w:tcBorders>
+            <w:tcMar>
+              <w:top w:w="120" w:type="dxa"/>
+              <w:left w:w="180" w:type="dxa"/>
+              <w:bottom w:w="120" w:type="dxa"/>
+              <w:right w:w="180" w:type="dxa"/>
+            </w:tcMar>
+          </w:tcPr>
+          <w:p>
+            <w:pPr>
+              <w:spacing w:after="480"/>
+              <w:jc w:val="both"/>
+              <w:rPr>
+                <w:rFonts w:ascii="Times New Roman" w:hAnsi="Times New Roman" w:cs="Times New Roman"/>
+              </w:rPr>
+            </w:pPr>
+            <w:r>
+              <w:rPr>
+                <w:rFonts w:ascii="Times New Roman" w:hAnsi="Times New Roman" w:cs="Times New Roman"/>
+              </w:rPr>
+              <w:t>Chứng từ trung gian ghi nhận yêu cầu chuyển ca bệnh từ Bác sĩ Đa khoa sang Chuyên khoa hoặc đích danh Bác sĩ Chuyên khoa.</w:t>
+            </w:r>
+          </w:p>
+        </w:tc>
+      </w:tr>
+      <w:tr>
+        <w:trPr>
+          <w:trHeight w:val="1650"/>
+        </w:trPr>
+        <w:tc>
+          <w:tcPr>
+            <w:tcW w:w="776" w:type="dxa"/>
+            <w:tcBorders>
+              <w:top w:val="single" w:sz="5" w:space="0" w:color="C4C7C5"/>
+              <w:left w:val="single" w:sz="5" w:space="0" w:color="C4C7C5"/>
+              <w:bottom w:val="single" w:sz="5" w:space="0" w:color="C4C7C5"/>
+              <w:right w:val="single" w:sz="5" w:space="0" w:color="C4C7C5"/>
+            </w:tcBorders>
+            <w:tcMar>
+              <w:top w:w="120" w:type="dxa"/>
+              <w:left w:w="180" w:type="dxa"/>
+              <w:bottom w:w="120" w:type="dxa"/>
+              <w:right w:w="180" w:type="dxa"/>
+            </w:tcMar>
+          </w:tcPr>
+          <w:p>
+            <w:pPr>
+              <w:spacing w:after="480"/>
+              <w:jc w:val="both"/>
+              <w:rPr>
+                <w:rFonts w:ascii="Times New Roman" w:hAnsi="Times New Roman" w:cs="Times New Roman"/>
+              </w:rPr>
+            </w:pPr>
+            <w:r>
+              <w:rPr>
+                <w:rFonts w:ascii="Times New Roman" w:hAnsi="Times New Roman" w:cs="Times New Roman"/>
+                <w:b/>
+                <w:bCs/>
+              </w:rPr>
+              <w:t>11</w:t>
+            </w:r>
+          </w:p>
+        </w:tc>
+        <w:tc>
+          <w:tcPr>
+            <w:tcW w:w="1700" w:type="dxa"/>
+            <w:tcBorders>
+              <w:top w:val="single" w:sz="5" w:space="0" w:color="C4C7C5"/>
+              <w:left w:val="single" w:sz="5" w:space="0" w:color="C4C7C5"/>
+              <w:bottom w:val="single" w:sz="5" w:space="0" w:color="C4C7C5"/>
+              <w:right w:val="single" w:sz="5" w:space="0" w:color="C4C7C5"/>
+            </w:tcBorders>
+            <w:tcMar>
+              <w:top w:w="120" w:type="dxa"/>
+              <w:left w:w="180" w:type="dxa"/>
+              <w:bottom w:w="120" w:type="dxa"/>
+              <w:right w:w="180" w:type="dxa"/>
+            </w:tcMar>
+          </w:tcPr>
+          <w:p>
+            <w:pPr>
+              <w:spacing w:after="480"/>
+              <w:rPr>
+                <w:rFonts w:ascii="Times New Roman" w:hAnsi="Times New Roman" w:cs="Times New Roman"/>
+              </w:rPr>
+            </w:pPr>
+            <w:r>
+              <w:rPr>
+                <w:rFonts w:ascii="Times New Roman" w:hAnsi="Times New Roman" w:cs="Times New Roman"/>
+                <w:b/>
+                <w:bCs/>
+              </w:rPr>
+              <w:t>HỒ SƠ BỆNH ÁN</w:t>
+            </w:r>
+          </w:p>
+        </w:tc>
+        <w:tc>
+          <w:tcPr>
+            <w:tcW w:w="1820" w:type="dxa"/>
+            <w:tcBorders>
+              <w:top w:val="single" w:sz="5" w:space="0" w:color="C4C7C5"/>
+              <w:left w:val="single" w:sz="5" w:space="0" w:color="C4C7C5"/>
+              <w:bottom w:val="single" w:sz="5" w:space="0" w:color="C4C7C5"/>
+              <w:right w:val="single" w:sz="5" w:space="0" w:color="C4C7C5"/>
+            </w:tcBorders>
+            <w:tcMar>
+              <w:top w:w="120" w:type="dxa"/>
+              <w:left w:w="180" w:type="dxa"/>
+              <w:bottom w:w="120" w:type="dxa"/>
+              <w:right w:w="180" w:type="dxa"/>
+            </w:tcMar>
+          </w:tcPr>
+          <w:p>
+            <w:pPr>
+              <w:spacing w:after="480"/>
+              <w:jc w:val="both"/>
+              <w:rPr>
+                <w:rFonts w:ascii="Times New Roman" w:hAnsi="Times New Roman" w:cs="Times New Roman"/>
+              </w:rPr>
+            </w:pPr>
+            <w:r>
+              <w:rPr>
+                <w:rFonts w:ascii="Times New Roman" w:hAnsi="Times New Roman" w:cs="Times New Roman"/>
+                <w:color w:val="188038"/>
+              </w:rPr>
+              <w:t>Medical Record (EMR)</w:t>
+            </w:r>
+          </w:p>
+        </w:tc>
+        <w:tc>
+          <w:tcPr>
+            <w:tcW w:w="4721" w:type="dxa"/>
+            <w:tcBorders>
+              <w:top w:val="single" w:sz="5" w:space="0" w:color="C4C7C5"/>
+              <w:left w:val="single" w:sz="5" w:space="0" w:color="C4C7C5"/>
+              <w:bottom w:val="single" w:sz="5" w:space="0" w:color="C4C7C5"/>
+              <w:right w:val="single" w:sz="5" w:space="0" w:color="C4C7C5"/>
+            </w:tcBorders>
+            <w:tcMar>
+              <w:top w:w="120" w:type="dxa"/>
+              <w:left w:w="180" w:type="dxa"/>
+              <w:bottom w:w="120" w:type="dxa"/>
+              <w:right w:w="180" w:type="dxa"/>
+            </w:tcMar>
+          </w:tcPr>
+          <w:p>
+            <w:pPr>
+              <w:spacing w:after="480"/>
+              <w:jc w:val="both"/>
+              <w:rPr>
+                <w:rFonts w:ascii="Times New Roman" w:hAnsi="Times New Roman" w:cs="Times New Roman"/>
+              </w:rPr>
+            </w:pPr>
+            <w:r>
+              <w:rPr>
+                <w:rFonts w:ascii="Times New Roman" w:hAnsi="Times New Roman" w:cs="Times New Roman"/>
+              </w:rPr>
+              <w:t>Hồ sơ điện tử ghi nhận triệu chứng, chẩn đoán (ICD-10) và kết luận điều trị sau buổi khám; chuyển sang trạng thái bất biến (Read-only) khi khóa sổ.</w:t>
+            </w:r>
+          </w:p>
+        </w:tc>
+      </w:tr>
+      <w:tr>
+        <w:trPr>
+          <w:trHeight w:val="1365"/>
+        </w:trPr>
+        <w:tc>
+          <w:tcPr>
+            <w:tcW w:w="776" w:type="dxa"/>
+            <w:tcBorders>
+              <w:top w:val="single" w:sz="5" w:space="0" w:color="C4C7C5"/>
+              <w:left w:val="single" w:sz="5" w:space="0" w:color="C4C7C5"/>
+              <w:bottom w:val="single" w:sz="5" w:space="0" w:color="C4C7C5"/>
+              <w:right w:val="single" w:sz="5" w:space="0" w:color="C4C7C5"/>
+            </w:tcBorders>
+            <w:tcMar>
+              <w:top w:w="120" w:type="dxa"/>
+              <w:left w:w="180" w:type="dxa"/>
+              <w:bottom w:w="120" w:type="dxa"/>
+              <w:right w:w="180" w:type="dxa"/>
+            </w:tcMar>
+          </w:tcPr>
+          <w:p>
+            <w:pPr>
+              <w:spacing w:after="480"/>
+              <w:jc w:val="both"/>
+              <w:rPr>
+                <w:rFonts w:ascii="Times New Roman" w:hAnsi="Times New Roman" w:cs="Times New Roman"/>
+              </w:rPr>
+            </w:pPr>
+            <w:r>
+              <w:rPr>
+                <w:rFonts w:ascii="Times New Roman" w:hAnsi="Times New Roman" w:cs="Times New Roman"/>
+                <w:b/>
+                <w:bCs/>
+              </w:rPr>
+              <w:t>12</w:t>
+            </w:r>
+          </w:p>
+        </w:tc>
+        <w:tc>
+          <w:tcPr>
+            <w:tcW w:w="1700" w:type="dxa"/>
+            <w:tcBorders>
+              <w:top w:val="single" w:sz="5" w:space="0" w:color="C4C7C5"/>
+              <w:left w:val="single" w:sz="5" w:space="0" w:color="C4C7C5"/>
+              <w:bottom w:val="single" w:sz="5" w:space="0" w:color="C4C7C5"/>
+              <w:right w:val="single" w:sz="5" w:space="0" w:color="C4C7C5"/>
+            </w:tcBorders>
+            <w:tcMar>
+              <w:top w:w="120" w:type="dxa"/>
+              <w:left w:w="180" w:type="dxa"/>
+              <w:bottom w:w="120" w:type="dxa"/>
+              <w:right w:w="180" w:type="dxa"/>
+            </w:tcMar>
+          </w:tcPr>
+          <w:p>
+            <w:pPr>
+              <w:spacing w:after="480"/>
+              <w:rPr>
+                <w:rFonts w:ascii="Times New Roman" w:hAnsi="Times New Roman" w:cs="Times New Roman"/>
+              </w:rPr>
+            </w:pPr>
+            <w:r>
+              <w:rPr>
+                <w:rFonts w:ascii="Times New Roman" w:hAnsi="Times New Roman" w:cs="Times New Roman"/>
+                <w:b/>
+                <w:bCs/>
+              </w:rPr>
+              <w:t>PHỤ LỤC ĐÍNH CHÍNH</w:t>
+            </w:r>
+          </w:p>
+        </w:tc>
+        <w:tc>
+          <w:tcPr>
+            <w:tcW w:w="1820" w:type="dxa"/>
+            <w:tcBorders>
+              <w:top w:val="single" w:sz="5" w:space="0" w:color="C4C7C5"/>
+              <w:left w:val="single" w:sz="5" w:space="0" w:color="C4C7C5"/>
+              <w:bottom w:val="single" w:sz="5" w:space="0" w:color="C4C7C5"/>
+              <w:right w:val="single" w:sz="5" w:space="0" w:color="C4C7C5"/>
+            </w:tcBorders>
+            <w:tcMar>
+              <w:top w:w="120" w:type="dxa"/>
+              <w:left w:w="180" w:type="dxa"/>
+              <w:bottom w:w="120" w:type="dxa"/>
+              <w:right w:w="180" w:type="dxa"/>
+            </w:tcMar>
+          </w:tcPr>
+          <w:p>
+            <w:pPr>
+              <w:spacing w:after="480"/>
+              <w:jc w:val="both"/>
+              <w:rPr>
+                <w:rFonts w:ascii="Times New Roman" w:hAnsi="Times New Roman" w:cs="Times New Roman"/>
+              </w:rPr>
+            </w:pPr>
+            <w:r>
+              <w:rPr>
+                <w:rFonts w:ascii="Times New Roman" w:hAnsi="Times New Roman" w:cs="Times New Roman"/>
+                <w:color w:val="188038"/>
+              </w:rPr>
+              <w:t>Record Addendum</w:t>
+            </w:r>
+          </w:p>
+        </w:tc>
+        <w:tc>
+          <w:tcPr>
+            <w:tcW w:w="4721" w:type="dxa"/>
+            <w:tcBorders>
+              <w:top w:val="single" w:sz="5" w:space="0" w:color="C4C7C5"/>
+              <w:left w:val="single" w:sz="5" w:space="0" w:color="C4C7C5"/>
+              <w:bottom w:val="single" w:sz="5" w:space="0" w:color="C4C7C5"/>
+              <w:right w:val="single" w:sz="5" w:space="0" w:color="C4C7C5"/>
+            </w:tcBorders>
+            <w:tcMar>
+              <w:top w:w="120" w:type="dxa"/>
+              <w:left w:w="180" w:type="dxa"/>
+              <w:bottom w:w="120" w:type="dxa"/>
+              <w:right w:w="180" w:type="dxa"/>
+            </w:tcMar>
+          </w:tcPr>
+          <w:p>
+            <w:pPr>
+              <w:spacing w:after="480"/>
+              <w:jc w:val="both"/>
+              <w:rPr>
+                <w:rFonts w:ascii="Times New Roman" w:hAnsi="Times New Roman" w:cs="Times New Roman"/>
+              </w:rPr>
+            </w:pPr>
+            <w:r>
+              <w:rPr>
+                <w:rFonts w:ascii="Times New Roman" w:hAnsi="Times New Roman" w:cs="Times New Roman"/>
+              </w:rPr>
+              <w:t>Bản ghi bổ sung/đính chính gắn liền với bệnh án gốc nhằm bảo toàn tính bất biến và dấu vết pháp lý y khoa khi có sai sót cần điều chỉnh.</w:t>
+            </w:r>
+          </w:p>
+        </w:tc>
+      </w:tr>
+      <w:tr>
+        <w:trPr>
+          <w:trHeight w:val="1059"/>
+        </w:trPr>
+        <w:tc>
+          <w:tcPr>
+            <w:tcW w:w="776" w:type="dxa"/>
+            <w:tcBorders>
+              <w:top w:val="single" w:sz="5" w:space="0" w:color="C4C7C5"/>
+              <w:left w:val="single" w:sz="5" w:space="0" w:color="C4C7C5"/>
+              <w:bottom w:val="single" w:sz="5" w:space="0" w:color="C4C7C5"/>
+              <w:right w:val="single" w:sz="5" w:space="0" w:color="C4C7C5"/>
+            </w:tcBorders>
+            <w:tcMar>
+              <w:top w:w="120" w:type="dxa"/>
+              <w:left w:w="180" w:type="dxa"/>
+              <w:bottom w:w="120" w:type="dxa"/>
+              <w:right w:w="180" w:type="dxa"/>
+            </w:tcMar>
+          </w:tcPr>
+          <w:p>
+            <w:pPr>
+              <w:spacing w:after="480"/>
+              <w:jc w:val="both"/>
+              <w:rPr>
+                <w:rFonts w:ascii="Times New Roman" w:hAnsi="Times New Roman" w:cs="Times New Roman"/>
+              </w:rPr>
+            </w:pPr>
+            <w:r>
+              <w:rPr>
+                <w:rFonts w:ascii="Times New Roman" w:hAnsi="Times New Roman" w:cs="Times New Roman"/>
+                <w:b/>
+                <w:bCs/>
+              </w:rPr>
+              <w:t>13</w:t>
+            </w:r>
+          </w:p>
+        </w:tc>
+        <w:tc>
+          <w:tcPr>
+            <w:tcW w:w="1700" w:type="dxa"/>
+            <w:tcBorders>
+              <w:top w:val="single" w:sz="5" w:space="0" w:color="C4C7C5"/>
+              <w:left w:val="single" w:sz="5" w:space="0" w:color="C4C7C5"/>
+              <w:bottom w:val="single" w:sz="5" w:space="0" w:color="C4C7C5"/>
+              <w:right w:val="single" w:sz="5" w:space="0" w:color="C4C7C5"/>
+            </w:tcBorders>
+            <w:tcMar>
+              <w:top w:w="120" w:type="dxa"/>
+              <w:left w:w="180" w:type="dxa"/>
+              <w:bottom w:w="120" w:type="dxa"/>
+              <w:right w:w="180" w:type="dxa"/>
+            </w:tcMar>
+          </w:tcPr>
+          <w:p>
+            <w:pPr>
+              <w:spacing w:after="480"/>
+              <w:rPr>
+                <w:rFonts w:ascii="Times New Roman" w:hAnsi="Times New Roman" w:cs="Times New Roman"/>
+              </w:rPr>
+            </w:pPr>
+            <w:r>
+              <w:rPr>
+                <w:rFonts w:ascii="Times New Roman" w:hAnsi="Times New Roman" w:cs="Times New Roman"/>
+                <w:b/>
+                <w:bCs/>
+              </w:rPr>
+              <w:t>ĐƠN THUỐC</w:t>
+            </w:r>
+          </w:p>
+        </w:tc>
+        <w:tc>
+          <w:tcPr>
+            <w:tcW w:w="1820" w:type="dxa"/>
+            <w:tcBorders>
+              <w:top w:val="single" w:sz="5" w:space="0" w:color="C4C7C5"/>
+              <w:left w:val="single" w:sz="5" w:space="0" w:color="C4C7C5"/>
+              <w:bottom w:val="single" w:sz="5" w:space="0" w:color="C4C7C5"/>
+              <w:right w:val="single" w:sz="5" w:space="0" w:color="C4C7C5"/>
+            </w:tcBorders>
+            <w:tcMar>
+              <w:top w:w="120" w:type="dxa"/>
+              <w:left w:w="180" w:type="dxa"/>
+              <w:bottom w:w="120" w:type="dxa"/>
+              <w:right w:w="180" w:type="dxa"/>
+            </w:tcMar>
+          </w:tcPr>
+          <w:p>
+            <w:pPr>
+              <w:spacing w:after="480"/>
+              <w:jc w:val="both"/>
+              <w:rPr>
+                <w:rFonts w:ascii="Times New Roman" w:hAnsi="Times New Roman" w:cs="Times New Roman"/>
+              </w:rPr>
+            </w:pPr>
+            <w:r>
+              <w:rPr>
+                <w:rFonts w:ascii="Times New Roman" w:hAnsi="Times New Roman" w:cs="Times New Roman"/>
+                <w:color w:val="188038"/>
+              </w:rPr>
+              <w:t>Prescription</w:t>
+            </w:r>
+          </w:p>
+        </w:tc>
+        <w:tc>
+          <w:tcPr>
+            <w:tcW w:w="4721" w:type="dxa"/>
+            <w:tcBorders>
+              <w:top w:val="single" w:sz="5" w:space="0" w:color="C4C7C5"/>
+              <w:left w:val="single" w:sz="5" w:space="0" w:color="C4C7C5"/>
+              <w:bottom w:val="single" w:sz="5" w:space="0" w:color="C4C7C5"/>
+              <w:right w:val="single" w:sz="5" w:space="0" w:color="C4C7C5"/>
+            </w:tcBorders>
+            <w:tcMar>
+              <w:top w:w="120" w:type="dxa"/>
+              <w:left w:w="180" w:type="dxa"/>
+              <w:bottom w:w="120" w:type="dxa"/>
+              <w:right w:w="180" w:type="dxa"/>
+            </w:tcMar>
+          </w:tcPr>
+          <w:p>
+            <w:pPr>
+              <w:spacing w:after="480"/>
+              <w:jc w:val="both"/>
+              <w:rPr>
+                <w:rFonts w:ascii="Times New Roman" w:hAnsi="Times New Roman" w:cs="Times New Roman"/>
+              </w:rPr>
+            </w:pPr>
+            <w:r>
+              <w:rPr>
+                <w:rFonts w:ascii="Times New Roman" w:hAnsi="Times New Roman" w:cs="Times New Roman"/>
+              </w:rPr>
+              <w:t>Đơn thuốc điện tử được phát hành gắn liền với một hồ sơ bệnh án đã hoàn tất, là căn cứ để chỉ định điều trị và đồng bộ kho dược.</w:t>
+            </w:r>
+          </w:p>
+        </w:tc>
+      </w:tr>
+      <w:tr>
+        <w:trPr>
+          <w:trHeight w:val="1365"/>
+        </w:trPr>
+        <w:tc>
+          <w:tcPr>
+            <w:tcW w:w="776" w:type="dxa"/>
+            <w:tcBorders>
+              <w:top w:val="single" w:sz="5" w:space="0" w:color="C4C7C5"/>
+              <w:left w:val="single" w:sz="5" w:space="0" w:color="C4C7C5"/>
+              <w:bottom w:val="single" w:sz="5" w:space="0" w:color="C4C7C5"/>
+              <w:right w:val="single" w:sz="5" w:space="0" w:color="C4C7C5"/>
+            </w:tcBorders>
+            <w:tcMar>
+              <w:top w:w="120" w:type="dxa"/>
+              <w:left w:w="180" w:type="dxa"/>
+              <w:bottom w:w="120" w:type="dxa"/>
+              <w:right w:w="180" w:type="dxa"/>
+            </w:tcMar>
+          </w:tcPr>
+          <w:p>
+            <w:pPr>
+              <w:spacing w:after="480"/>
+              <w:jc w:val="both"/>
+              <w:rPr>
+                <w:rFonts w:ascii="Times New Roman" w:hAnsi="Times New Roman" w:cs="Times New Roman"/>
+              </w:rPr>
+            </w:pPr>
+            <w:r>
+              <w:rPr>
+                <w:rFonts w:ascii="Times New Roman" w:hAnsi="Times New Roman" w:cs="Times New Roman"/>
+                <w:b/>
+                <w:bCs/>
+              </w:rPr>
+              <w:t>14</w:t>
+            </w:r>
+          </w:p>
+        </w:tc>
+        <w:tc>
+          <w:tcPr>
+            <w:tcW w:w="1700" w:type="dxa"/>
+            <w:tcBorders>
+              <w:top w:val="single" w:sz="5" w:space="0" w:color="C4C7C5"/>
+              <w:left w:val="single" w:sz="5" w:space="0" w:color="C4C7C5"/>
+              <w:bottom w:val="single" w:sz="5" w:space="0" w:color="C4C7C5"/>
+              <w:right w:val="single" w:sz="5" w:space="0" w:color="C4C7C5"/>
+            </w:tcBorders>
+            <w:tcMar>
+              <w:top w:w="120" w:type="dxa"/>
+              <w:left w:w="180" w:type="dxa"/>
+              <w:bottom w:w="120" w:type="dxa"/>
+              <w:right w:w="180" w:type="dxa"/>
+            </w:tcMar>
+          </w:tcPr>
+          <w:p>
+            <w:pPr>
+              <w:spacing w:after="480"/>
+              <w:rPr>
+                <w:rFonts w:ascii="Times New Roman" w:hAnsi="Times New Roman" w:cs="Times New Roman"/>
+              </w:rPr>
+            </w:pPr>
+            <w:r>
+              <w:rPr>
+                <w:rFonts w:ascii="Times New Roman" w:hAnsi="Times New Roman" w:cs="Times New Roman"/>
+                <w:b/>
+                <w:bCs/>
+              </w:rPr>
+              <w:t>CHI TIẾT ĐƠN THUỐC</w:t>
+            </w:r>
+          </w:p>
+        </w:tc>
+        <w:tc>
+          <w:tcPr>
+            <w:tcW w:w="1820" w:type="dxa"/>
+            <w:tcBorders>
+              <w:top w:val="single" w:sz="5" w:space="0" w:color="C4C7C5"/>
+              <w:left w:val="single" w:sz="5" w:space="0" w:color="C4C7C5"/>
+              <w:bottom w:val="single" w:sz="5" w:space="0" w:color="C4C7C5"/>
+              <w:right w:val="single" w:sz="5" w:space="0" w:color="C4C7C5"/>
+            </w:tcBorders>
+            <w:tcMar>
+              <w:top w:w="120" w:type="dxa"/>
+              <w:left w:w="180" w:type="dxa"/>
+              <w:bottom w:w="120" w:type="dxa"/>
+              <w:right w:w="180" w:type="dxa"/>
+            </w:tcMar>
+          </w:tcPr>
+          <w:p>
+            <w:pPr>
+              <w:spacing w:after="480"/>
+              <w:jc w:val="both"/>
+              <w:rPr>
+                <w:rFonts w:ascii="Times New Roman" w:hAnsi="Times New Roman" w:cs="Times New Roman"/>
+              </w:rPr>
+            </w:pPr>
+            <w:r>
+              <w:rPr>
+                <w:rFonts w:ascii="Times New Roman" w:hAnsi="Times New Roman" w:cs="Times New Roman"/>
+                <w:color w:val="188038"/>
+              </w:rPr>
+              <w:t>Prescription Item</w:t>
+            </w:r>
+          </w:p>
+        </w:tc>
+        <w:tc>
+          <w:tcPr>
+            <w:tcW w:w="4721" w:type="dxa"/>
+            <w:tcBorders>
+              <w:top w:val="single" w:sz="5" w:space="0" w:color="C4C7C5"/>
+              <w:left w:val="single" w:sz="5" w:space="0" w:color="C4C7C5"/>
+              <w:bottom w:val="single" w:sz="5" w:space="0" w:color="C4C7C5"/>
+              <w:right w:val="single" w:sz="5" w:space="0" w:color="C4C7C5"/>
+            </w:tcBorders>
+            <w:tcMar>
+              <w:top w:w="120" w:type="dxa"/>
+              <w:left w:w="180" w:type="dxa"/>
+              <w:bottom w:w="120" w:type="dxa"/>
+              <w:right w:w="180" w:type="dxa"/>
+            </w:tcMar>
+          </w:tcPr>
+          <w:p>
+            <w:pPr>
+              <w:spacing w:after="480"/>
+              <w:jc w:val="both"/>
+              <w:rPr>
+                <w:rFonts w:ascii="Times New Roman" w:hAnsi="Times New Roman" w:cs="Times New Roman"/>
+              </w:rPr>
+            </w:pPr>
+            <w:r>
+              <w:rPr>
+                <w:rFonts w:ascii="Times New Roman" w:hAnsi="Times New Roman" w:cs="Times New Roman"/>
+              </w:rPr>
+              <w:t>Thực thể yếu/liên kết phân rã đơn thuốc thành từng dòng thuốc cụ thể kèm liều dùng, đường dùng và số lượng cấp phát.</w:t>
+            </w:r>
+          </w:p>
+        </w:tc>
+      </w:tr>
+      <w:tr>
+        <w:trPr>
+          <w:trHeight w:val="1365"/>
+        </w:trPr>
+        <w:tc>
+          <w:tcPr>
+            <w:tcW w:w="776" w:type="dxa"/>
+            <w:tcBorders>
+              <w:top w:val="single" w:sz="5" w:space="0" w:color="C4C7C5"/>
+              <w:left w:val="single" w:sz="5" w:space="0" w:color="C4C7C5"/>
+              <w:bottom w:val="single" w:sz="5" w:space="0" w:color="C4C7C5"/>
+              <w:right w:val="single" w:sz="5" w:space="0" w:color="C4C7C5"/>
+            </w:tcBorders>
+            <w:tcMar>
+              <w:top w:w="120" w:type="dxa"/>
+              <w:left w:w="180" w:type="dxa"/>
+              <w:bottom w:w="120" w:type="dxa"/>
+              <w:right w:w="180" w:type="dxa"/>
+            </w:tcMar>
+          </w:tcPr>
+          <w:p>
+            <w:pPr>
+              <w:spacing w:after="480"/>
+              <w:jc w:val="both"/>
+              <w:rPr>
+                <w:rFonts w:ascii="Times New Roman" w:hAnsi="Times New Roman" w:cs="Times New Roman"/>
+              </w:rPr>
+            </w:pPr>
+            <w:r>
+              <w:rPr>
+                <w:rFonts w:ascii="Times New Roman" w:hAnsi="Times New Roman" w:cs="Times New Roman"/>
+                <w:b/>
+                <w:bCs/>
+              </w:rPr>
+              <w:t>15</w:t>
+            </w:r>
+          </w:p>
+        </w:tc>
+        <w:tc>
+          <w:tcPr>
+            <w:tcW w:w="1700" w:type="dxa"/>
+            <w:tcBorders>
+              <w:top w:val="single" w:sz="5" w:space="0" w:color="C4C7C5"/>
+              <w:left w:val="single" w:sz="5" w:space="0" w:color="C4C7C5"/>
+              <w:bottom w:val="single" w:sz="5" w:space="0" w:color="C4C7C5"/>
+              <w:right w:val="single" w:sz="5" w:space="0" w:color="C4C7C5"/>
+            </w:tcBorders>
+            <w:tcMar>
+              <w:top w:w="120" w:type="dxa"/>
+              <w:left w:w="180" w:type="dxa"/>
+              <w:bottom w:w="120" w:type="dxa"/>
+              <w:right w:w="180" w:type="dxa"/>
+            </w:tcMar>
+          </w:tcPr>
+          <w:p>
+            <w:pPr>
+              <w:spacing w:after="480"/>
+              <w:rPr>
+                <w:rFonts w:ascii="Times New Roman" w:hAnsi="Times New Roman" w:cs="Times New Roman"/>
+              </w:rPr>
+            </w:pPr>
+            <w:r>
+              <w:rPr>
+                <w:rFonts w:ascii="Times New Roman" w:hAnsi="Times New Roman" w:cs="Times New Roman"/>
+                <w:b/>
+                <w:bCs/>
+              </w:rPr>
+              <w:t>DANH MỤC THUỐC</w:t>
+            </w:r>
+          </w:p>
+        </w:tc>
+        <w:tc>
+          <w:tcPr>
+            <w:tcW w:w="1820" w:type="dxa"/>
+            <w:tcBorders>
+              <w:top w:val="single" w:sz="5" w:space="0" w:color="C4C7C5"/>
+              <w:left w:val="single" w:sz="5" w:space="0" w:color="C4C7C5"/>
+              <w:bottom w:val="single" w:sz="5" w:space="0" w:color="C4C7C5"/>
+              <w:right w:val="single" w:sz="5" w:space="0" w:color="C4C7C5"/>
+            </w:tcBorders>
+            <w:tcMar>
+              <w:top w:w="120" w:type="dxa"/>
+              <w:left w:w="180" w:type="dxa"/>
+              <w:bottom w:w="120" w:type="dxa"/>
+              <w:right w:w="180" w:type="dxa"/>
+            </w:tcMar>
+          </w:tcPr>
+          <w:p>
+            <w:pPr>
+              <w:spacing w:after="480"/>
+              <w:jc w:val="both"/>
+              <w:rPr>
+                <w:rFonts w:ascii="Times New Roman" w:hAnsi="Times New Roman" w:cs="Times New Roman"/>
+              </w:rPr>
+            </w:pPr>
+            <w:r>
+              <w:rPr>
+                <w:rFonts w:ascii="Times New Roman" w:hAnsi="Times New Roman" w:cs="Times New Roman"/>
+                <w:color w:val="188038"/>
+              </w:rPr>
+              <w:t>Medication Inventory</w:t>
+            </w:r>
+          </w:p>
+        </w:tc>
+        <w:tc>
+          <w:tcPr>
+            <w:tcW w:w="4721" w:type="dxa"/>
+            <w:tcBorders>
+              <w:top w:val="single" w:sz="5" w:space="0" w:color="C4C7C5"/>
+              <w:left w:val="single" w:sz="5" w:space="0" w:color="C4C7C5"/>
+              <w:bottom w:val="single" w:sz="5" w:space="0" w:color="C4C7C5"/>
+              <w:right w:val="single" w:sz="5" w:space="0" w:color="C4C7C5"/>
+            </w:tcBorders>
+            <w:tcMar>
+              <w:top w:w="120" w:type="dxa"/>
+              <w:left w:w="180" w:type="dxa"/>
+              <w:bottom w:w="120" w:type="dxa"/>
+              <w:right w:w="180" w:type="dxa"/>
+            </w:tcMar>
+          </w:tcPr>
+          <w:p>
+            <w:pPr>
+              <w:spacing w:after="480"/>
+              <w:jc w:val="both"/>
+              <w:rPr>
+                <w:rFonts w:ascii="Times New Roman" w:hAnsi="Times New Roman" w:cs="Times New Roman"/>
+              </w:rPr>
+            </w:pPr>
+            <w:r>
+              <w:rPr>
+                <w:rFonts w:ascii="Times New Roman" w:hAnsi="Times New Roman" w:cs="Times New Roman"/>
               </w:rPr>
               <w:t>Quản lý kho dược phẩm, thông tin biệt dược, hoạt chất và theo dõi tồn kho theo thời gian thực để tự động trừ kho khi phát hành đơn.</w:t>
             </w:r>
@@ -2898,6 +2926,7 @@
     </w:tbl>
     <w:p>
       <w:pPr>
+        <w:jc w:val="both"/>
         <w:rPr>
           <w:rFonts w:ascii="Times New Roman" w:eastAsia="Roboto" w:hAnsi="Times New Roman" w:cs="Times New Roman"/>
         </w:rPr>
@@ -2909,6 +2938,7 @@
         <w:keepNext w:val="0"/>
         <w:keepLines w:val="0"/>
         <w:spacing w:before="280"/>
+        <w:jc w:val="both"/>
         <w:rPr>
           <w:rFonts w:ascii="Times New Roman" w:eastAsia="Roboto" w:hAnsi="Times New Roman" w:cs="Times New Roman"/>
           <w:b/>
@@ -2935,6 +2965,7 @@
     <w:p>
       <w:pPr>
         <w:spacing w:before="240" w:after="240"/>
+        <w:jc w:val="both"/>
         <w:rPr>
           <w:rFonts w:ascii="Times New Roman" w:eastAsia="Roboto" w:hAnsi="Times New Roman" w:cs="Times New Roman"/>
           <w:b/>
@@ -2957,17 +2988,18 @@
           <w:numId w:val="9"/>
         </w:numPr>
         <w:spacing w:before="240"/>
-        <w:rPr>
-          <w:rFonts w:ascii="Times New Roman" w:eastAsia="Roboto" w:hAnsi="Times New Roman" w:cs="Times New Roman"/>
-        </w:rPr>
-      </w:pPr>
-      <w:r>
-        <w:rPr>
-          <w:rFonts w:ascii="Times New Roman" w:eastAsia="Roboto" w:hAnsi="Times New Roman" w:cs="Times New Roman"/>
-          <w:b/>
-          <w:bCs/>
-        </w:rPr>
-        <w:t xml:space="preserve"> Ý nghĩa:</w:t>
+        <w:jc w:val="both"/>
+        <w:rPr>
+          <w:rFonts w:ascii="Times New Roman" w:eastAsia="Roboto" w:hAnsi="Times New Roman" w:cs="Times New Roman"/>
+        </w:rPr>
+      </w:pPr>
+      <w:r>
+        <w:rPr>
+          <w:rFonts w:ascii="Times New Roman" w:eastAsia="Roboto" w:hAnsi="Times New Roman" w:cs="Times New Roman"/>
+          <w:b/>
+          <w:bCs/>
+        </w:rPr>
+        <w:t>Ý nghĩa:</w:t>
       </w:r>
       <w:r>
         <w:rPr>
@@ -2982,20 +3014,20 @@
           <w:ilvl w:val="0"/>
           <w:numId w:val="9"/>
         </w:numPr>
-        <w:rPr>
-          <w:rFonts w:ascii="Times New Roman" w:eastAsia="Roboto" w:hAnsi="Times New Roman" w:cs="Times New Roman"/>
-          <w:b/>
-          <w:bCs/>
-        </w:rPr>
-      </w:pPr>
-      <w:r>
-        <w:rPr>
-          <w:rFonts w:ascii="Times New Roman" w:eastAsia="Roboto" w:hAnsi="Times New Roman" w:cs="Times New Roman"/>
-          <w:b/>
-          <w:bCs/>
-        </w:rPr>
-        <w:lastRenderedPageBreak/>
-        <w:t xml:space="preserve"> Các thuộc tính chính:</w:t>
+        <w:jc w:val="both"/>
+        <w:rPr>
+          <w:rFonts w:ascii="Times New Roman" w:eastAsia="Roboto" w:hAnsi="Times New Roman" w:cs="Times New Roman"/>
+          <w:b/>
+          <w:bCs/>
+        </w:rPr>
+      </w:pPr>
+      <w:r>
+        <w:rPr>
+          <w:rFonts w:ascii="Times New Roman" w:eastAsia="Roboto" w:hAnsi="Times New Roman" w:cs="Times New Roman"/>
+          <w:b/>
+          <w:bCs/>
+        </w:rPr>
+        <w:t>Các thuộc tính chính:</w:t>
       </w:r>
     </w:p>
     <w:p>
@@ -3004,6 +3036,7 @@
           <w:ilvl w:val="1"/>
           <w:numId w:val="8"/>
         </w:numPr>
+        <w:jc w:val="both"/>
         <w:rPr>
           <w:rFonts w:ascii="Times New Roman" w:eastAsia="Roboto" w:hAnsi="Times New Roman" w:cs="Times New Roman"/>
         </w:rPr>
@@ -3013,6 +3046,7 @@
           <w:rFonts w:ascii="Times New Roman" w:eastAsia="Roboto Mono" w:hAnsi="Times New Roman" w:cs="Times New Roman"/>
           <w:color w:val="188038"/>
         </w:rPr>
+        <w:lastRenderedPageBreak/>
         <w:t>ma_benh_nhan (PK)</w:t>
       </w:r>
       <w:r>
@@ -3028,6 +3062,7 @@
           <w:ilvl w:val="1"/>
           <w:numId w:val="8"/>
         </w:numPr>
+        <w:jc w:val="both"/>
         <w:rPr>
           <w:rFonts w:ascii="Times New Roman" w:eastAsia="Roboto" w:hAnsi="Times New Roman" w:cs="Times New Roman"/>
         </w:rPr>
@@ -3052,6 +3087,7 @@
           <w:ilvl w:val="1"/>
           <w:numId w:val="8"/>
         </w:numPr>
+        <w:jc w:val="both"/>
         <w:rPr>
           <w:rFonts w:ascii="Times New Roman" w:eastAsia="Roboto" w:hAnsi="Times New Roman" w:cs="Times New Roman"/>
         </w:rPr>
@@ -3089,6 +3125,7 @@
           <w:ilvl w:val="1"/>
           <w:numId w:val="8"/>
         </w:numPr>
+        <w:jc w:val="both"/>
         <w:rPr>
           <w:rFonts w:ascii="Times New Roman" w:eastAsia="Roboto" w:hAnsi="Times New Roman" w:cs="Times New Roman"/>
         </w:rPr>
@@ -3113,6 +3150,7 @@
           <w:ilvl w:val="1"/>
           <w:numId w:val="8"/>
         </w:numPr>
+        <w:jc w:val="both"/>
         <w:rPr>
           <w:rFonts w:ascii="Times New Roman" w:eastAsia="Roboto" w:hAnsi="Times New Roman" w:cs="Times New Roman"/>
         </w:rPr>
@@ -3138,6 +3176,7 @@
           <w:numId w:val="8"/>
         </w:numPr>
         <w:spacing w:after="240"/>
+        <w:jc w:val="both"/>
         <w:rPr>
           <w:rFonts w:ascii="Times New Roman" w:eastAsia="Roboto" w:hAnsi="Times New Roman" w:cs="Times New Roman"/>
         </w:rPr>
@@ -3159,6 +3198,7 @@
     <w:p>
       <w:pPr>
         <w:spacing w:before="240" w:after="240"/>
+        <w:jc w:val="both"/>
         <w:rPr>
           <w:rFonts w:ascii="Times New Roman" w:eastAsia="Roboto" w:hAnsi="Times New Roman" w:cs="Times New Roman"/>
           <w:b/>
@@ -3198,6 +3238,7 @@
           <w:numId w:val="6"/>
         </w:numPr>
         <w:spacing w:before="240"/>
+        <w:jc w:val="both"/>
         <w:rPr>
           <w:rFonts w:ascii="Times New Roman" w:eastAsia="Roboto" w:hAnsi="Times New Roman" w:cs="Times New Roman"/>
         </w:rPr>
@@ -3223,6 +3264,7 @@
           <w:ilvl w:val="0"/>
           <w:numId w:val="6"/>
         </w:numPr>
+        <w:jc w:val="both"/>
         <w:rPr>
           <w:rFonts w:ascii="Times New Roman" w:eastAsia="Roboto" w:hAnsi="Times New Roman" w:cs="Times New Roman"/>
         </w:rPr>
@@ -3242,6 +3284,7 @@
           <w:ilvl w:val="1"/>
           <w:numId w:val="6"/>
         </w:numPr>
+        <w:jc w:val="both"/>
         <w:rPr>
           <w:rFonts w:ascii="Times New Roman" w:eastAsia="Roboto" w:hAnsi="Times New Roman" w:cs="Times New Roman"/>
         </w:rPr>
@@ -3266,6 +3309,7 @@
           <w:ilvl w:val="1"/>
           <w:numId w:val="6"/>
         </w:numPr>
+        <w:jc w:val="both"/>
         <w:rPr>
           <w:rFonts w:ascii="Times New Roman" w:eastAsia="Roboto" w:hAnsi="Times New Roman" w:cs="Times New Roman"/>
         </w:rPr>
@@ -3291,6 +3335,7 @@
           <w:numId w:val="6"/>
         </w:numPr>
         <w:spacing w:after="240"/>
+        <w:jc w:val="both"/>
         <w:rPr>
           <w:rFonts w:ascii="Times New Roman" w:eastAsia="Roboto" w:hAnsi="Times New Roman" w:cs="Times New Roman"/>
         </w:rPr>
@@ -3312,6 +3357,7 @@
     <w:p>
       <w:pPr>
         <w:spacing w:before="240" w:after="240"/>
+        <w:jc w:val="both"/>
         <w:rPr>
           <w:rFonts w:ascii="Times New Roman" w:eastAsia="Roboto" w:hAnsi="Times New Roman" w:cs="Times New Roman"/>
           <w:b/>
@@ -3334,6 +3380,7 @@
           <w:numId w:val="10"/>
         </w:numPr>
         <w:spacing w:before="240"/>
+        <w:jc w:val="both"/>
         <w:rPr>
           <w:rFonts w:ascii="Times New Roman" w:eastAsia="Roboto" w:hAnsi="Times New Roman" w:cs="Times New Roman"/>
         </w:rPr>
@@ -3441,6 +3488,7 @@
           <w:ilvl w:val="0"/>
           <w:numId w:val="10"/>
         </w:numPr>
+        <w:jc w:val="both"/>
         <w:rPr>
           <w:rFonts w:ascii="Times New Roman" w:eastAsia="Roboto" w:hAnsi="Times New Roman" w:cs="Times New Roman"/>
         </w:rPr>
@@ -3510,6 +3558,7 @@
           <w:numId w:val="10"/>
         </w:numPr>
         <w:spacing w:after="240"/>
+        <w:jc w:val="both"/>
         <w:rPr>
           <w:rFonts w:ascii="Times New Roman" w:eastAsia="Roboto" w:hAnsi="Times New Roman" w:cs="Times New Roman"/>
         </w:rPr>
@@ -3588,6 +3637,7 @@
     <w:p>
       <w:pPr>
         <w:spacing w:before="240" w:after="240"/>
+        <w:jc w:val="both"/>
         <w:rPr>
           <w:rFonts w:ascii="Times New Roman" w:eastAsia="Roboto" w:hAnsi="Times New Roman" w:cs="Times New Roman"/>
           <w:b/>
@@ -3627,6 +3677,7 @@
           <w:numId w:val="1"/>
         </w:numPr>
         <w:spacing w:before="240"/>
+        <w:jc w:val="both"/>
         <w:rPr>
           <w:rFonts w:ascii="Times New Roman" w:eastAsia="Roboto" w:hAnsi="Times New Roman" w:cs="Times New Roman"/>
         </w:rPr>
@@ -3652,6 +3703,7 @@
           <w:ilvl w:val="0"/>
           <w:numId w:val="1"/>
         </w:numPr>
+        <w:jc w:val="both"/>
         <w:rPr>
           <w:rFonts w:ascii="Times New Roman" w:eastAsia="Roboto" w:hAnsi="Times New Roman" w:cs="Times New Roman"/>
         </w:rPr>
@@ -3671,6 +3723,7 @@
           <w:ilvl w:val="1"/>
           <w:numId w:val="1"/>
         </w:numPr>
+        <w:jc w:val="both"/>
         <w:rPr>
           <w:rFonts w:ascii="Times New Roman" w:eastAsia="Roboto" w:hAnsi="Times New Roman" w:cs="Times New Roman"/>
         </w:rPr>
@@ -3695,6 +3748,7 @@
           <w:ilvl w:val="1"/>
           <w:numId w:val="1"/>
         </w:numPr>
+        <w:jc w:val="both"/>
         <w:rPr>
           <w:rFonts w:ascii="Times New Roman" w:eastAsia="Roboto" w:hAnsi="Times New Roman" w:cs="Times New Roman"/>
         </w:rPr>
@@ -3746,6 +3800,7 @@
           <w:numId w:val="1"/>
         </w:numPr>
         <w:spacing w:after="240"/>
+        <w:jc w:val="both"/>
         <w:rPr>
           <w:rFonts w:ascii="Times New Roman" w:eastAsia="Roboto" w:hAnsi="Times New Roman" w:cs="Times New Roman"/>
         </w:rPr>
@@ -3767,6 +3822,7 @@
     <w:p>
       <w:pPr>
         <w:spacing w:before="240" w:after="240"/>
+        <w:jc w:val="both"/>
         <w:rPr>
           <w:rFonts w:ascii="Times New Roman" w:eastAsia="Roboto" w:hAnsi="Times New Roman" w:cs="Times New Roman"/>
           <w:b/>
@@ -3806,6 +3862,7 @@
           <w:numId w:val="5"/>
         </w:numPr>
         <w:spacing w:before="240"/>
+        <w:jc w:val="both"/>
         <w:rPr>
           <w:rFonts w:ascii="Times New Roman" w:eastAsia="Roboto" w:hAnsi="Times New Roman" w:cs="Times New Roman"/>
         </w:rPr>
@@ -3831,6 +3888,7 @@
           <w:ilvl w:val="0"/>
           <w:numId w:val="5"/>
         </w:numPr>
+        <w:jc w:val="both"/>
         <w:rPr>
           <w:rFonts w:ascii="Times New Roman" w:eastAsia="Roboto" w:hAnsi="Times New Roman" w:cs="Times New Roman"/>
         </w:rPr>
@@ -3850,6 +3908,7 @@
           <w:ilvl w:val="1"/>
           <w:numId w:val="5"/>
         </w:numPr>
+        <w:jc w:val="both"/>
         <w:rPr>
           <w:rFonts w:ascii="Times New Roman" w:eastAsia="Roboto" w:hAnsi="Times New Roman" w:cs="Times New Roman"/>
         </w:rPr>
@@ -3875,6 +3934,7 @@
           <w:numId w:val="5"/>
         </w:numPr>
         <w:spacing w:after="240"/>
+        <w:jc w:val="both"/>
         <w:rPr>
           <w:rFonts w:ascii="Times New Roman" w:eastAsia="Roboto" w:hAnsi="Times New Roman" w:cs="Times New Roman"/>
         </w:rPr>
@@ -3922,6 +3982,7 @@
     <w:p>
       <w:pPr>
         <w:spacing w:before="240" w:after="240"/>
+        <w:jc w:val="both"/>
         <w:rPr>
           <w:rFonts w:ascii="Times New Roman" w:eastAsia="Roboto" w:hAnsi="Times New Roman" w:cs="Times New Roman"/>
           <w:b/>
@@ -3961,6 +4022,7 @@
           <w:numId w:val="4"/>
         </w:numPr>
         <w:spacing w:before="240"/>
+        <w:jc w:val="both"/>
         <w:rPr>
           <w:rFonts w:ascii="Times New Roman" w:eastAsia="Roboto" w:hAnsi="Times New Roman" w:cs="Times New Roman"/>
         </w:rPr>
@@ -3986,6 +4048,7 @@
           <w:ilvl w:val="0"/>
           <w:numId w:val="4"/>
         </w:numPr>
+        <w:jc w:val="both"/>
         <w:rPr>
           <w:rFonts w:ascii="Times New Roman" w:eastAsia="Roboto" w:hAnsi="Times New Roman" w:cs="Times New Roman"/>
         </w:rPr>
@@ -4005,6 +4068,7 @@
           <w:ilvl w:val="1"/>
           <w:numId w:val="4"/>
         </w:numPr>
+        <w:jc w:val="both"/>
         <w:rPr>
           <w:rFonts w:ascii="Times New Roman" w:eastAsia="Roboto" w:hAnsi="Times New Roman" w:cs="Times New Roman"/>
         </w:rPr>
@@ -4014,7 +4078,6 @@
           <w:rFonts w:ascii="Times New Roman" w:eastAsia="Roboto Mono" w:hAnsi="Times New Roman" w:cs="Times New Roman"/>
           <w:color w:val="188038"/>
         </w:rPr>
-        <w:lastRenderedPageBreak/>
         <w:t>ma_lich_hen</w:t>
       </w:r>
       <w:r>
@@ -4030,6 +4093,7 @@
           <w:ilvl w:val="1"/>
           <w:numId w:val="4"/>
         </w:numPr>
+        <w:jc w:val="both"/>
         <w:rPr>
           <w:rFonts w:ascii="Times New Roman" w:eastAsia="Roboto" w:hAnsi="Times New Roman" w:cs="Times New Roman"/>
         </w:rPr>
@@ -4039,6 +4103,7 @@
           <w:rFonts w:ascii="Times New Roman" w:eastAsia="Roboto Mono" w:hAnsi="Times New Roman" w:cs="Times New Roman"/>
           <w:color w:val="188038"/>
         </w:rPr>
+        <w:lastRenderedPageBreak/>
         <w:t>thoi_gian_hen</w:t>
       </w:r>
       <w:r>
@@ -4054,6 +4119,7 @@
           <w:ilvl w:val="1"/>
           <w:numId w:val="4"/>
         </w:numPr>
+        <w:jc w:val="both"/>
         <w:rPr>
           <w:rFonts w:ascii="Times New Roman" w:eastAsia="Roboto" w:hAnsi="Times New Roman" w:cs="Times New Roman"/>
         </w:rPr>
@@ -4105,6 +4171,7 @@
           <w:numId w:val="4"/>
         </w:numPr>
         <w:spacing w:after="240"/>
+        <w:jc w:val="both"/>
         <w:rPr>
           <w:rFonts w:ascii="Times New Roman" w:eastAsia="Roboto" w:hAnsi="Times New Roman" w:cs="Times New Roman"/>
         </w:rPr>
@@ -4191,6 +4258,7 @@
     <w:p>
       <w:pPr>
         <w:spacing w:before="240" w:after="240"/>
+        <w:jc w:val="both"/>
         <w:rPr>
           <w:rFonts w:ascii="Times New Roman" w:eastAsia="Roboto" w:hAnsi="Times New Roman" w:cs="Times New Roman"/>
           <w:b/>
@@ -4230,6 +4298,7 @@
           <w:numId w:val="2"/>
         </w:numPr>
         <w:spacing w:before="240"/>
+        <w:jc w:val="both"/>
         <w:rPr>
           <w:rFonts w:ascii="Times New Roman" w:eastAsia="Roboto" w:hAnsi="Times New Roman" w:cs="Times New Roman"/>
         </w:rPr>
@@ -4255,6 +4324,7 @@
           <w:ilvl w:val="0"/>
           <w:numId w:val="2"/>
         </w:numPr>
+        <w:jc w:val="both"/>
         <w:rPr>
           <w:rFonts w:ascii="Times New Roman" w:eastAsia="Roboto" w:hAnsi="Times New Roman" w:cs="Times New Roman"/>
         </w:rPr>
@@ -4274,6 +4344,7 @@
           <w:ilvl w:val="1"/>
           <w:numId w:val="2"/>
         </w:numPr>
+        <w:jc w:val="both"/>
         <w:rPr>
           <w:rFonts w:ascii="Times New Roman" w:eastAsia="Roboto" w:hAnsi="Times New Roman" w:cs="Times New Roman"/>
         </w:rPr>
@@ -4298,6 +4369,7 @@
           <w:ilvl w:val="1"/>
           <w:numId w:val="2"/>
         </w:numPr>
+        <w:jc w:val="both"/>
         <w:rPr>
           <w:rFonts w:ascii="Times New Roman" w:eastAsia="Roboto" w:hAnsi="Times New Roman" w:cs="Times New Roman"/>
         </w:rPr>
@@ -4323,6 +4395,7 @@
           <w:numId w:val="2"/>
         </w:numPr>
         <w:spacing w:after="240"/>
+        <w:jc w:val="both"/>
         <w:rPr>
           <w:rFonts w:ascii="Times New Roman" w:eastAsia="Roboto" w:hAnsi="Times New Roman" w:cs="Times New Roman"/>
         </w:rPr>
@@ -4344,6 +4417,7 @@
     <w:p>
       <w:pPr>
         <w:spacing w:before="240" w:after="240"/>
+        <w:jc w:val="both"/>
         <w:rPr>
           <w:rFonts w:ascii="Times New Roman" w:eastAsia="Roboto" w:hAnsi="Times New Roman" w:cs="Times New Roman"/>
           <w:b/>
@@ -4383,6 +4457,7 @@
           <w:numId w:val="3"/>
         </w:numPr>
         <w:spacing w:before="240"/>
+        <w:jc w:val="both"/>
         <w:rPr>
           <w:rFonts w:ascii="Times New Roman" w:eastAsia="Roboto" w:hAnsi="Times New Roman" w:cs="Times New Roman"/>
         </w:rPr>
@@ -4408,6 +4483,7 @@
           <w:ilvl w:val="0"/>
           <w:numId w:val="3"/>
         </w:numPr>
+        <w:jc w:val="both"/>
         <w:rPr>
           <w:rFonts w:ascii="Times New Roman" w:eastAsia="Roboto" w:hAnsi="Times New Roman" w:cs="Times New Roman"/>
         </w:rPr>
@@ -4427,6 +4503,7 @@
           <w:ilvl w:val="1"/>
           <w:numId w:val="3"/>
         </w:numPr>
+        <w:jc w:val="both"/>
         <w:rPr>
           <w:rFonts w:ascii="Times New Roman" w:eastAsia="Roboto" w:hAnsi="Times New Roman" w:cs="Times New Roman"/>
         </w:rPr>
@@ -4451,6 +4528,7 @@
           <w:ilvl w:val="1"/>
           <w:numId w:val="3"/>
         </w:numPr>
+        <w:jc w:val="both"/>
         <w:rPr>
           <w:rFonts w:ascii="Times New Roman" w:eastAsia="Roboto" w:hAnsi="Times New Roman" w:cs="Times New Roman"/>
         </w:rPr>
@@ -4476,6 +4554,7 @@
           <w:numId w:val="3"/>
         </w:numPr>
         <w:spacing w:after="240"/>
+        <w:jc w:val="both"/>
         <w:rPr>
           <w:rFonts w:ascii="Times New Roman" w:eastAsia="Roboto" w:hAnsi="Times New Roman" w:cs="Times New Roman"/>
         </w:rPr>
@@ -4536,6 +4615,7 @@
     <w:p>
       <w:pPr>
         <w:spacing w:before="240" w:after="240"/>
+        <w:jc w:val="both"/>
         <w:rPr>
           <w:rFonts w:ascii="Times New Roman" w:eastAsia="Roboto" w:hAnsi="Times New Roman" w:cs="Times New Roman"/>
           <w:b/>
@@ -4558,6 +4638,7 @@
           <w:numId w:val="11"/>
         </w:numPr>
         <w:spacing w:before="240"/>
+        <w:jc w:val="both"/>
         <w:rPr>
           <w:rFonts w:ascii="Times New Roman" w:eastAsia="Roboto" w:hAnsi="Times New Roman" w:cs="Times New Roman"/>
         </w:rPr>
@@ -4666,6 +4747,7 @@
           <w:numId w:val="11"/>
         </w:numPr>
         <w:spacing w:after="240"/>
+        <w:jc w:val="both"/>
         <w:rPr>
           <w:rFonts w:ascii="Times New Roman" w:eastAsia="Roboto" w:hAnsi="Times New Roman" w:cs="Times New Roman"/>
         </w:rPr>
@@ -4744,6 +4826,7 @@
     <w:p>
       <w:pPr>
         <w:spacing w:before="240" w:after="240"/>
+        <w:jc w:val="both"/>
         <w:rPr>
           <w:rFonts w:ascii="Times New Roman" w:eastAsia="Roboto" w:hAnsi="Times New Roman" w:cs="Times New Roman"/>
           <w:b/>
@@ -4766,6 +4849,7 @@
           <w:numId w:val="7"/>
         </w:numPr>
         <w:spacing w:before="240"/>
+        <w:jc w:val="both"/>
         <w:rPr>
           <w:rFonts w:ascii="Times New Roman" w:eastAsia="Roboto" w:hAnsi="Times New Roman" w:cs="Times New Roman"/>
         </w:rPr>
@@ -4847,6 +4931,7 @@
           <w:ilvl w:val="0"/>
           <w:numId w:val="7"/>
         </w:numPr>
+        <w:jc w:val="both"/>
         <w:rPr>
           <w:rFonts w:ascii="Times New Roman" w:eastAsia="Roboto" w:hAnsi="Times New Roman" w:cs="Times New Roman"/>
         </w:rPr>
@@ -4942,6 +5027,7 @@
           <w:numId w:val="7"/>
         </w:numPr>
         <w:spacing w:after="240"/>
+        <w:jc w:val="both"/>
         <w:rPr>
           <w:rFonts w:ascii="Times New Roman" w:eastAsia="Roboto" w:hAnsi="Times New Roman" w:cs="Times New Roman"/>
         </w:rPr>
@@ -5032,6 +5118,7 @@
     </w:p>
     <w:p>
       <w:pPr>
+        <w:jc w:val="both"/>
         <w:rPr>
           <w:rFonts w:ascii="Times New Roman" w:eastAsia="Roboto" w:hAnsi="Times New Roman" w:cs="Times New Roman"/>
         </w:rPr>
@@ -5040,20 +5127,16 @@
     <w:p>
       <w:pPr>
         <w:ind w:left="1440"/>
-        <w:rPr>
-          <w:rFonts w:ascii="Times New Roman" w:eastAsia="Roboto" w:hAnsi="Times New Roman" w:cs="Times New Roman"/>
-        </w:rPr>
-      </w:pPr>
-      <w:r>
-        <w:rPr>
-          <w:rFonts w:ascii="Times New Roman" w:eastAsia="Roboto" w:hAnsi="Times New Roman" w:cs="Times New Roman"/>
-        </w:rPr>
-        <w:t xml:space="preserve"> </w:t>
-      </w:r>
+        <w:jc w:val="both"/>
+        <w:rPr>
+          <w:rFonts w:ascii="Times New Roman" w:eastAsia="Roboto" w:hAnsi="Times New Roman" w:cs="Times New Roman"/>
+        </w:rPr>
+      </w:pPr>
     </w:p>
     <w:p>
       <w:pPr>
         <w:spacing w:after="160"/>
+        <w:jc w:val="both"/>
         <w:rPr>
           <w:rFonts w:ascii="Times New Roman" w:eastAsia="Roboto" w:hAnsi="Times New Roman" w:cs="Times New Roman"/>
           <w:b/>
@@ -5072,6 +5155,7 @@
     <w:p>
       <w:pPr>
         <w:spacing w:after="160"/>
+        <w:jc w:val="both"/>
         <w:rPr>
           <w:rFonts w:ascii="Times New Roman" w:eastAsia="Roboto" w:hAnsi="Times New Roman" w:cs="Times New Roman"/>
         </w:rPr>
@@ -5094,6 +5178,7 @@
     <w:p>
       <w:pPr>
         <w:spacing w:after="160"/>
+        <w:jc w:val="both"/>
         <w:rPr>
           <w:rFonts w:ascii="Times New Roman" w:eastAsia="Roboto" w:hAnsi="Times New Roman" w:cs="Times New Roman"/>
         </w:rPr>
@@ -5108,6 +5193,7 @@
     <w:p>
       <w:pPr>
         <w:spacing w:after="160"/>
+        <w:jc w:val="both"/>
         <w:rPr>
           <w:rFonts w:ascii="Times New Roman" w:eastAsia="Roboto" w:hAnsi="Times New Roman" w:cs="Times New Roman"/>
           <w:b/>
@@ -5126,39 +5212,42 @@
     <w:p>
       <w:pPr>
         <w:spacing w:after="160"/>
-        <w:rPr>
-          <w:rFonts w:ascii="Times New Roman" w:eastAsia="Roboto" w:hAnsi="Times New Roman" w:cs="Times New Roman"/>
-          <w:b/>
-          <w:bCs/>
-        </w:rPr>
-      </w:pPr>
-      <w:r>
-        <w:rPr>
-          <w:rFonts w:ascii="Times New Roman" w:eastAsia="Roboto" w:hAnsi="Times New Roman" w:cs="Times New Roman"/>
-          <w:b/>
-          <w:bCs/>
+        <w:jc w:val="both"/>
+        <w:rPr>
+          <w:rFonts w:ascii="Times New Roman" w:eastAsia="Roboto" w:hAnsi="Times New Roman" w:cs="Times New Roman"/>
+          <w:b/>
+          <w:bCs/>
+        </w:rPr>
+      </w:pPr>
+      <w:r>
+        <w:rPr>
+          <w:rFonts w:ascii="Times New Roman" w:eastAsia="Roboto" w:hAnsi="Times New Roman" w:cs="Times New Roman"/>
+          <w:b/>
+          <w:bCs/>
+        </w:rPr>
+        <w:t>1.1 Mục đích tài liệu (Purpose)</w:t>
+      </w:r>
+    </w:p>
+    <w:p>
+      <w:pPr>
+        <w:spacing w:after="160"/>
+        <w:jc w:val="both"/>
+        <w:rPr>
+          <w:rFonts w:ascii="Times New Roman" w:eastAsia="Roboto" w:hAnsi="Times New Roman" w:cs="Times New Roman"/>
+        </w:rPr>
+      </w:pPr>
+      <w:r>
+        <w:rPr>
+          <w:rFonts w:ascii="Times New Roman" w:eastAsia="Roboto" w:hAnsi="Times New Roman" w:cs="Times New Roman"/>
         </w:rPr>
         <w:lastRenderedPageBreak/>
-        <w:t>1.1 Mục đích tài liệu (Purpose)</w:t>
+        <w:t>Tài liệu này xác định các yêu cầu chức năng, phi chức năng, quy tắc nghiệp vụ và ràng buộc hệ thống cho nền tảng điều phối lịch khám bệnh, quản lý hồ sơ bệnh án điện tử (EMR/EHR), phân bổ lịch làm việc của bác sĩ theo chuyên khoa, phát hành đơn thuốc điện tử và bảo đảm toàn vẹn dữ liệu y tế.</w:t>
       </w:r>
     </w:p>
     <w:p>
       <w:pPr>
         <w:spacing w:after="160"/>
-        <w:rPr>
-          <w:rFonts w:ascii="Times New Roman" w:eastAsia="Roboto" w:hAnsi="Times New Roman" w:cs="Times New Roman"/>
-        </w:rPr>
-      </w:pPr>
-      <w:r>
-        <w:rPr>
-          <w:rFonts w:ascii="Times New Roman" w:eastAsia="Roboto" w:hAnsi="Times New Roman" w:cs="Times New Roman"/>
-        </w:rPr>
-        <w:t>Tài liệu này xác định các yêu cầu chức năng, phi chức năng, quy tắc nghiệp vụ và ràng buộc hệ thống cho nền tảng điều phối lịch khám bệnh, quản lý hồ sơ bệnh án điện tử (EMR/EHR), phân bổ lịch làm việc của bác sĩ theo chuyên khoa, phát hành đơn thuốc điện tử và bảo đảm toàn vẹn dữ liệu y tế.</w:t>
-      </w:r>
-    </w:p>
-    <w:p>
-      <w:pPr>
-        <w:spacing w:after="160"/>
+        <w:jc w:val="both"/>
         <w:rPr>
           <w:rFonts w:ascii="Times New Roman" w:eastAsia="Roboto" w:hAnsi="Times New Roman" w:cs="Times New Roman"/>
           <w:b/>
@@ -5177,6 +5266,7 @@
     <w:p>
       <w:pPr>
         <w:ind w:left="720"/>
+        <w:jc w:val="both"/>
         <w:rPr>
           <w:rFonts w:ascii="Times New Roman" w:eastAsia="Roboto" w:hAnsi="Times New Roman" w:cs="Times New Roman"/>
         </w:rPr>
@@ -5219,6 +5309,7 @@
     <w:p>
       <w:pPr>
         <w:ind w:left="720"/>
+        <w:jc w:val="both"/>
         <w:rPr>
           <w:rFonts w:ascii="Times New Roman" w:eastAsia="Roboto" w:hAnsi="Times New Roman" w:cs="Times New Roman"/>
         </w:rPr>
@@ -5247,6 +5338,7 @@
     <w:p>
       <w:pPr>
         <w:ind w:left="1440"/>
+        <w:jc w:val="both"/>
         <w:rPr>
           <w:rFonts w:ascii="Times New Roman" w:eastAsia="Roboto" w:hAnsi="Times New Roman" w:cs="Times New Roman"/>
           <w:b/>
@@ -5279,6 +5371,7 @@
     <w:p>
       <w:pPr>
         <w:ind w:left="1440"/>
+        <w:jc w:val="both"/>
         <w:rPr>
           <w:rFonts w:ascii="Times New Roman" w:eastAsia="Roboto" w:hAnsi="Times New Roman" w:cs="Times New Roman"/>
           <w:b/>
@@ -5311,6 +5404,7 @@
     <w:p>
       <w:pPr>
         <w:ind w:left="1440"/>
+        <w:jc w:val="both"/>
         <w:rPr>
           <w:rFonts w:ascii="Times New Roman" w:eastAsia="Roboto" w:hAnsi="Times New Roman" w:cs="Times New Roman"/>
           <w:b/>
@@ -5343,6 +5437,7 @@
     <w:p>
       <w:pPr>
         <w:ind w:left="1440"/>
+        <w:jc w:val="both"/>
         <w:rPr>
           <w:rFonts w:ascii="Times New Roman" w:eastAsia="Roboto" w:hAnsi="Times New Roman" w:cs="Times New Roman"/>
           <w:b/>
@@ -5369,13 +5464,14 @@
           <w:b/>
           <w:bCs/>
         </w:rPr>
-        <w:t xml:space="preserve">Kê đơn thuốc điện tử (e-Prescription) và quản lý số lượng tồn kho dược. </w:t>
+        <w:t>Kê đơn thuốc điện tử (e-Prescription) và quản lý số lượng tồn kho dược.</w:t>
       </w:r>
     </w:p>
     <w:p>
       <w:pPr>
         <w:spacing w:after="160"/>
         <w:ind w:left="720"/>
+        <w:jc w:val="both"/>
         <w:rPr>
           <w:rFonts w:ascii="Times New Roman" w:eastAsia="Roboto" w:hAnsi="Times New Roman" w:cs="Times New Roman"/>
         </w:rPr>
@@ -5437,6 +5533,7 @@
       <w:pPr>
         <w:spacing w:after="160"/>
         <w:ind w:left="720"/>
+        <w:jc w:val="both"/>
         <w:rPr>
           <w:rFonts w:ascii="Times New Roman" w:eastAsia="Roboto" w:hAnsi="Times New Roman" w:cs="Times New Roman"/>
         </w:rPr>
@@ -5460,6 +5557,7 @@
       <w:pPr>
         <w:spacing w:after="160"/>
         <w:ind w:left="720"/>
+        <w:jc w:val="both"/>
         <w:rPr>
           <w:rFonts w:ascii="Times New Roman" w:eastAsia="Roboto" w:hAnsi="Times New Roman" w:cs="Times New Roman"/>
         </w:rPr>
@@ -5483,6 +5581,7 @@
       <w:pPr>
         <w:spacing w:after="160"/>
         <w:ind w:left="720"/>
+        <w:jc w:val="both"/>
         <w:rPr>
           <w:rFonts w:ascii="Times New Roman" w:eastAsia="Roboto" w:hAnsi="Times New Roman" w:cs="Times New Roman"/>
         </w:rPr>
@@ -5491,6 +5590,7 @@
     <w:p>
       <w:pPr>
         <w:spacing w:after="160"/>
+        <w:jc w:val="both"/>
         <w:rPr>
           <w:rFonts w:ascii="Times New Roman" w:eastAsia="Roboto" w:hAnsi="Times New Roman" w:cs="Times New Roman"/>
           <w:b/>
@@ -5509,6 +5609,7 @@
     <w:p>
       <w:pPr>
         <w:ind w:left="720"/>
+        <w:jc w:val="both"/>
         <w:rPr>
           <w:rFonts w:ascii="Times New Roman" w:eastAsia="Roboto" w:hAnsi="Times New Roman" w:cs="Times New Roman"/>
         </w:rPr>
@@ -5545,6 +5646,7 @@
     <w:p>
       <w:pPr>
         <w:ind w:left="720"/>
+        <w:jc w:val="both"/>
         <w:rPr>
           <w:rFonts w:ascii="Times New Roman" w:eastAsia="Roboto" w:hAnsi="Times New Roman" w:cs="Times New Roman"/>
         </w:rPr>
@@ -5575,12 +5677,13 @@
         <w:rPr>
           <w:rFonts w:ascii="Times New Roman" w:eastAsia="Roboto" w:hAnsi="Times New Roman" w:cs="Times New Roman"/>
         </w:rPr>
-        <w:t xml:space="preserve">: Đảm bảo tính toàn vẹn của dữ liệu bệnh án điện tử và lịch sử kê đơn sau khi hồ sơ được hoàn tất và lưu trữ trên hệ thống. </w:t>
+        <w:t>: Đảm bảo tính toàn vẹn của dữ liệu bệnh án điện tử và lịch sử kê đơn sau khi hồ sơ được hoàn tất và lưu trữ trên hệ thống.</w:t>
       </w:r>
     </w:p>
     <w:p>
       <w:pPr>
         <w:ind w:left="720"/>
+        <w:jc w:val="both"/>
         <w:rPr>
           <w:rFonts w:ascii="Times New Roman" w:eastAsia="Roboto" w:hAnsi="Times New Roman" w:cs="Times New Roman"/>
         </w:rPr>
@@ -5617,6 +5720,7 @@
     <w:p>
       <w:pPr>
         <w:spacing w:after="160"/>
+        <w:jc w:val="both"/>
         <w:rPr>
           <w:rFonts w:ascii="Times New Roman" w:eastAsia="Roboto" w:hAnsi="Times New Roman" w:cs="Times New Roman"/>
           <w:b/>
@@ -5635,6 +5739,7 @@
     <w:p>
       <w:pPr>
         <w:spacing w:after="160"/>
+        <w:jc w:val="both"/>
         <w:rPr>
           <w:rFonts w:ascii="Times New Roman" w:eastAsia="Roboto" w:hAnsi="Times New Roman" w:cs="Times New Roman"/>
           <w:b/>
@@ -5653,6 +5758,7 @@
     <w:p>
       <w:pPr>
         <w:ind w:left="720"/>
+        <w:jc w:val="both"/>
         <w:rPr>
           <w:rFonts w:ascii="Times New Roman" w:eastAsia="Roboto" w:hAnsi="Times New Roman" w:cs="Times New Roman"/>
         </w:rPr>
@@ -5689,6 +5795,7 @@
     <w:p>
       <w:pPr>
         <w:ind w:left="1440"/>
+        <w:jc w:val="both"/>
         <w:rPr>
           <w:rFonts w:ascii="Times New Roman" w:eastAsia="Roboto" w:hAnsi="Times New Roman" w:cs="Times New Roman"/>
         </w:rPr>
@@ -5717,6 +5824,7 @@
     <w:p>
       <w:pPr>
         <w:ind w:left="1440"/>
+        <w:jc w:val="both"/>
         <w:rPr>
           <w:rFonts w:ascii="Times New Roman" w:eastAsia="Roboto" w:hAnsi="Times New Roman" w:cs="Times New Roman"/>
         </w:rPr>
@@ -5745,6 +5853,7 @@
     <w:p>
       <w:pPr>
         <w:ind w:left="720"/>
+        <w:jc w:val="both"/>
         <w:rPr>
           <w:rFonts w:ascii="Times New Roman" w:eastAsia="Roboto" w:hAnsi="Times New Roman" w:cs="Times New Roman"/>
           <w:lang w:val="en-US"/>
@@ -5782,6 +5891,7 @@
     <w:p>
       <w:pPr>
         <w:ind w:left="720"/>
+        <w:jc w:val="both"/>
         <w:rPr>
           <w:rFonts w:ascii="Times New Roman" w:eastAsia="Arial Unicode MS" w:hAnsi="Times New Roman" w:cs="Times New Roman"/>
           <w:b/>
@@ -5805,6 +5915,7 @@
           <w:ilvl w:val="0"/>
           <w:numId w:val="12"/>
         </w:numPr>
+        <w:jc w:val="both"/>
         <w:rPr>
           <w:rFonts w:ascii="Times New Roman" w:eastAsia="Arial Unicode MS" w:hAnsi="Times New Roman" w:cs="Times New Roman"/>
           <w:lang w:val="en-US"/>
@@ -5833,6 +5944,7 @@
           <w:ilvl w:val="0"/>
           <w:numId w:val="12"/>
         </w:numPr>
+        <w:jc w:val="both"/>
         <w:rPr>
           <w:rFonts w:ascii="Times New Roman" w:eastAsia="Arial Unicode MS" w:hAnsi="Times New Roman" w:cs="Times New Roman"/>
           <w:lang w:val="en-US"/>
@@ -5854,6 +5966,7 @@
           <w:ilvl w:val="1"/>
           <w:numId w:val="12"/>
         </w:numPr>
+        <w:jc w:val="both"/>
         <w:rPr>
           <w:rFonts w:ascii="Times New Roman" w:eastAsia="Arial Unicode MS" w:hAnsi="Times New Roman" w:cs="Times New Roman"/>
           <w:lang w:val="en-US"/>
@@ -5874,6 +5987,7 @@
           <w:ilvl w:val="1"/>
           <w:numId w:val="12"/>
         </w:numPr>
+        <w:jc w:val="both"/>
         <w:rPr>
           <w:rFonts w:ascii="Times New Roman" w:eastAsia="Arial Unicode MS" w:hAnsi="Times New Roman" w:cs="Times New Roman"/>
           <w:lang w:val="en-US"/>
@@ -5893,6 +6007,7 @@
           <w:ilvl w:val="0"/>
           <w:numId w:val="12"/>
         </w:numPr>
+        <w:jc w:val="both"/>
         <w:rPr>
           <w:rFonts w:ascii="Times New Roman" w:eastAsia="Arial Unicode MS" w:hAnsi="Times New Roman" w:cs="Times New Roman"/>
           <w:lang w:val="en-US"/>
@@ -5918,6 +6033,7 @@
     <w:p>
       <w:pPr>
         <w:ind w:left="720"/>
+        <w:jc w:val="both"/>
         <w:rPr>
           <w:rFonts w:ascii="Times New Roman" w:eastAsia="Arial Unicode MS" w:hAnsi="Times New Roman" w:cs="Times New Roman"/>
           <w:b/>
@@ -5941,6 +6057,7 @@
           <w:ilvl w:val="0"/>
           <w:numId w:val="13"/>
         </w:numPr>
+        <w:jc w:val="both"/>
         <w:rPr>
           <w:rFonts w:ascii="Times New Roman" w:eastAsia="Arial Unicode MS" w:hAnsi="Times New Roman" w:cs="Times New Roman"/>
           <w:lang w:val="en-US"/>
@@ -5962,6 +6079,7 @@
           <w:ilvl w:val="1"/>
           <w:numId w:val="13"/>
         </w:numPr>
+        <w:jc w:val="both"/>
         <w:rPr>
           <w:rFonts w:ascii="Times New Roman" w:eastAsia="Arial Unicode MS" w:hAnsi="Times New Roman" w:cs="Times New Roman"/>
           <w:lang w:val="en-US"/>
@@ -5990,6 +6108,7 @@
           <w:ilvl w:val="1"/>
           <w:numId w:val="13"/>
         </w:numPr>
+        <w:jc w:val="both"/>
         <w:rPr>
           <w:rFonts w:ascii="Times New Roman" w:eastAsia="Arial Unicode MS" w:hAnsi="Times New Roman" w:cs="Times New Roman"/>
           <w:lang w:val="en-US"/>
@@ -6018,6 +6137,7 @@
           <w:ilvl w:val="0"/>
           <w:numId w:val="13"/>
         </w:numPr>
+        <w:jc w:val="both"/>
         <w:rPr>
           <w:rFonts w:ascii="Times New Roman" w:eastAsia="Arial Unicode MS" w:hAnsi="Times New Roman" w:cs="Times New Roman"/>
           <w:lang w:val="en-US"/>
@@ -6039,6 +6159,7 @@
           <w:ilvl w:val="1"/>
           <w:numId w:val="13"/>
         </w:numPr>
+        <w:jc w:val="both"/>
         <w:rPr>
           <w:rFonts w:ascii="Times New Roman" w:eastAsia="Arial Unicode MS" w:hAnsi="Times New Roman" w:cs="Times New Roman"/>
           <w:lang w:val="en-US"/>
@@ -6058,6 +6179,7 @@
           <w:ilvl w:val="1"/>
           <w:numId w:val="13"/>
         </w:numPr>
+        <w:jc w:val="both"/>
         <w:rPr>
           <w:rFonts w:ascii="Times New Roman" w:eastAsia="Arial Unicode MS" w:hAnsi="Times New Roman" w:cs="Times New Roman"/>
           <w:lang w:val="en-US"/>
@@ -6077,6 +6199,7 @@
           <w:ilvl w:val="0"/>
           <w:numId w:val="13"/>
         </w:numPr>
+        <w:jc w:val="both"/>
         <w:rPr>
           <w:rFonts w:ascii="Times New Roman" w:eastAsia="Arial Unicode MS" w:hAnsi="Times New Roman" w:cs="Times New Roman"/>
           <w:b/>
@@ -6110,6 +6233,7 @@
     <w:p>
       <w:pPr>
         <w:ind w:left="360"/>
+        <w:jc w:val="both"/>
         <w:rPr>
           <w:rFonts w:ascii="Times New Roman" w:eastAsia="Arial Unicode MS" w:hAnsi="Times New Roman" w:cs="Times New Roman"/>
           <w:b/>
@@ -6133,6 +6257,7 @@
           <w:ilvl w:val="0"/>
           <w:numId w:val="14"/>
         </w:numPr>
+        <w:jc w:val="both"/>
         <w:rPr>
           <w:rFonts w:ascii="Times New Roman" w:eastAsia="Arial Unicode MS" w:hAnsi="Times New Roman" w:cs="Times New Roman"/>
           <w:lang w:val="en-US"/>
@@ -6161,6 +6286,7 @@
           <w:ilvl w:val="0"/>
           <w:numId w:val="14"/>
         </w:numPr>
+        <w:jc w:val="both"/>
         <w:rPr>
           <w:rFonts w:ascii="Times New Roman" w:eastAsia="Arial Unicode MS" w:hAnsi="Times New Roman" w:cs="Times New Roman"/>
           <w:lang w:val="en-US"/>
@@ -6182,6 +6308,7 @@
           <w:ilvl w:val="1"/>
           <w:numId w:val="14"/>
         </w:numPr>
+        <w:jc w:val="both"/>
         <w:rPr>
           <w:rFonts w:ascii="Times New Roman" w:eastAsia="Arial Unicode MS" w:hAnsi="Times New Roman" w:cs="Times New Roman"/>
           <w:lang w:val="en-US"/>
@@ -6210,6 +6337,7 @@
           <w:ilvl w:val="1"/>
           <w:numId w:val="14"/>
         </w:numPr>
+        <w:jc w:val="both"/>
         <w:rPr>
           <w:rFonts w:ascii="Times New Roman" w:eastAsia="Arial Unicode MS" w:hAnsi="Times New Roman" w:cs="Times New Roman"/>
           <w:lang w:val="en-US"/>
@@ -6229,6 +6357,7 @@
           <w:ilvl w:val="0"/>
           <w:numId w:val="14"/>
         </w:numPr>
+        <w:jc w:val="both"/>
         <w:rPr>
           <w:rFonts w:ascii="Times New Roman" w:eastAsia="Arial Unicode MS" w:hAnsi="Times New Roman" w:cs="Times New Roman"/>
           <w:lang w:val="en-US"/>
@@ -6250,6 +6379,7 @@
           <w:ilvl w:val="1"/>
           <w:numId w:val="14"/>
         </w:numPr>
+        <w:jc w:val="both"/>
         <w:rPr>
           <w:rFonts w:ascii="Times New Roman" w:eastAsia="Arial Unicode MS" w:hAnsi="Times New Roman" w:cs="Times New Roman"/>
           <w:lang w:val="en-US"/>
@@ -6285,6 +6415,7 @@
           <w:ilvl w:val="1"/>
           <w:numId w:val="14"/>
         </w:numPr>
+        <w:jc w:val="both"/>
         <w:rPr>
           <w:rFonts w:ascii="Times New Roman" w:eastAsia="Arial Unicode MS" w:hAnsi="Times New Roman" w:cs="Times New Roman"/>
           <w:lang w:val="en-US"/>
@@ -6301,6 +6432,7 @@
     <w:p>
       <w:pPr>
         <w:ind w:left="720"/>
+        <w:jc w:val="both"/>
         <w:rPr>
           <w:rFonts w:ascii="Times New Roman" w:eastAsia="Arial Unicode MS" w:hAnsi="Times New Roman" w:cs="Times New Roman"/>
           <w:b/>
@@ -6324,6 +6456,7 @@
           <w:ilvl w:val="0"/>
           <w:numId w:val="15"/>
         </w:numPr>
+        <w:jc w:val="both"/>
         <w:rPr>
           <w:rFonts w:ascii="Times New Roman" w:eastAsia="Arial Unicode MS" w:hAnsi="Times New Roman" w:cs="Times New Roman"/>
           <w:lang w:val="en-US"/>
@@ -6352,6 +6485,7 @@
           <w:ilvl w:val="0"/>
           <w:numId w:val="15"/>
         </w:numPr>
+        <w:jc w:val="both"/>
         <w:rPr>
           <w:rFonts w:ascii="Times New Roman" w:eastAsia="Arial Unicode MS" w:hAnsi="Times New Roman" w:cs="Times New Roman"/>
           <w:lang w:val="en-US"/>
@@ -6373,6 +6507,7 @@
           <w:ilvl w:val="1"/>
           <w:numId w:val="15"/>
         </w:numPr>
+        <w:jc w:val="both"/>
         <w:rPr>
           <w:rFonts w:ascii="Times New Roman" w:eastAsia="Arial Unicode MS" w:hAnsi="Times New Roman" w:cs="Times New Roman"/>
           <w:lang w:val="en-US"/>
@@ -6401,6 +6536,7 @@
           <w:ilvl w:val="1"/>
           <w:numId w:val="15"/>
         </w:numPr>
+        <w:jc w:val="both"/>
         <w:rPr>
           <w:rFonts w:ascii="Times New Roman" w:eastAsia="Arial Unicode MS" w:hAnsi="Times New Roman" w:cs="Times New Roman"/>
           <w:lang w:val="en-US"/>
@@ -6420,6 +6556,7 @@
           <w:ilvl w:val="0"/>
           <w:numId w:val="15"/>
         </w:numPr>
+        <w:jc w:val="both"/>
         <w:rPr>
           <w:rFonts w:ascii="Times New Roman" w:eastAsia="Arial Unicode MS" w:hAnsi="Times New Roman" w:cs="Times New Roman"/>
           <w:lang w:val="en-US"/>
@@ -6445,6 +6582,7 @@
     <w:p>
       <w:pPr>
         <w:ind w:left="720"/>
+        <w:jc w:val="both"/>
         <w:rPr>
           <w:rFonts w:ascii="Times New Roman" w:eastAsia="Arial Unicode MS" w:hAnsi="Times New Roman" w:cs="Times New Roman"/>
           <w:b/>
@@ -6468,6 +6606,7 @@
           <w:ilvl w:val="0"/>
           <w:numId w:val="16"/>
         </w:numPr>
+        <w:jc w:val="both"/>
         <w:rPr>
           <w:rFonts w:ascii="Times New Roman" w:eastAsia="Arial Unicode MS" w:hAnsi="Times New Roman" w:cs="Times New Roman"/>
           <w:lang w:val="en-US"/>
@@ -6496,6 +6635,7 @@
           <w:ilvl w:val="0"/>
           <w:numId w:val="16"/>
         </w:numPr>
+        <w:jc w:val="both"/>
         <w:rPr>
           <w:rFonts w:ascii="Times New Roman" w:eastAsia="Arial Unicode MS" w:hAnsi="Times New Roman" w:cs="Times New Roman"/>
           <w:lang w:val="en-US"/>
@@ -6517,6 +6657,7 @@
           <w:ilvl w:val="1"/>
           <w:numId w:val="16"/>
         </w:numPr>
+        <w:jc w:val="both"/>
         <w:rPr>
           <w:rFonts w:ascii="Times New Roman" w:eastAsia="Arial Unicode MS" w:hAnsi="Times New Roman" w:cs="Times New Roman"/>
           <w:lang w:val="en-US"/>
@@ -6553,6 +6694,7 @@
           <w:ilvl w:val="1"/>
           <w:numId w:val="16"/>
         </w:numPr>
+        <w:jc w:val="both"/>
         <w:rPr>
           <w:rFonts w:ascii="Times New Roman" w:eastAsia="Arial Unicode MS" w:hAnsi="Times New Roman" w:cs="Times New Roman"/>
           <w:lang w:val="en-US"/>
@@ -6572,6 +6714,7 @@
           <w:ilvl w:val="0"/>
           <w:numId w:val="16"/>
         </w:numPr>
+        <w:jc w:val="both"/>
         <w:rPr>
           <w:rFonts w:ascii="Times New Roman" w:eastAsia="Arial Unicode MS" w:hAnsi="Times New Roman" w:cs="Times New Roman"/>
           <w:lang w:val="en-US"/>
@@ -6597,6 +6740,7 @@
     <w:p>
       <w:pPr>
         <w:ind w:left="720"/>
+        <w:jc w:val="both"/>
         <w:rPr>
           <w:rFonts w:ascii="Times New Roman" w:eastAsia="Arial Unicode MS" w:hAnsi="Times New Roman" w:cs="Times New Roman"/>
           <w:b/>
@@ -6620,6 +6764,7 @@
           <w:ilvl w:val="0"/>
           <w:numId w:val="17"/>
         </w:numPr>
+        <w:jc w:val="both"/>
         <w:rPr>
           <w:rFonts w:ascii="Times New Roman" w:eastAsia="Arial Unicode MS" w:hAnsi="Times New Roman" w:cs="Times New Roman"/>
           <w:lang w:val="en-US"/>
@@ -6648,6 +6793,7 @@
           <w:ilvl w:val="0"/>
           <w:numId w:val="17"/>
         </w:numPr>
+        <w:jc w:val="both"/>
         <w:rPr>
           <w:rFonts w:ascii="Times New Roman" w:eastAsia="Arial Unicode MS" w:hAnsi="Times New Roman" w:cs="Times New Roman"/>
           <w:lang w:val="en-US"/>
@@ -6669,6 +6815,7 @@
           <w:ilvl w:val="1"/>
           <w:numId w:val="17"/>
         </w:numPr>
+        <w:jc w:val="both"/>
         <w:rPr>
           <w:rFonts w:ascii="Times New Roman" w:eastAsia="Arial Unicode MS" w:hAnsi="Times New Roman" w:cs="Times New Roman"/>
           <w:lang w:val="en-US"/>
@@ -6688,6 +6835,7 @@
           <w:ilvl w:val="1"/>
           <w:numId w:val="17"/>
         </w:numPr>
+        <w:jc w:val="both"/>
         <w:rPr>
           <w:rFonts w:ascii="Times New Roman" w:eastAsia="Arial Unicode MS" w:hAnsi="Times New Roman" w:cs="Times New Roman"/>
           <w:lang w:val="en-US"/>
@@ -6707,6 +6855,7 @@
           <w:ilvl w:val="0"/>
           <w:numId w:val="17"/>
         </w:numPr>
+        <w:jc w:val="both"/>
         <w:rPr>
           <w:rFonts w:ascii="Times New Roman" w:eastAsia="Arial Unicode MS" w:hAnsi="Times New Roman" w:cs="Times New Roman"/>
           <w:lang w:val="en-US"/>
@@ -6760,6 +6909,7 @@
     <w:p>
       <w:pPr>
         <w:ind w:left="720"/>
+        <w:jc w:val="both"/>
         <w:rPr>
           <w:rFonts w:ascii="Times New Roman" w:eastAsia="Roboto" w:hAnsi="Times New Roman" w:cs="Times New Roman"/>
         </w:rPr>
@@ -6823,6 +6973,7 @@
     <w:p>
       <w:pPr>
         <w:ind w:left="720"/>
+        <w:jc w:val="both"/>
         <w:rPr>
           <w:rFonts w:ascii="Times New Roman" w:eastAsia="Roboto" w:hAnsi="Times New Roman" w:cs="Times New Roman"/>
         </w:rPr>
@@ -6859,6 +7010,7 @@
     <w:p>
       <w:pPr>
         <w:spacing w:after="160"/>
+        <w:jc w:val="both"/>
         <w:rPr>
           <w:rFonts w:ascii="Times New Roman" w:eastAsia="Roboto" w:hAnsi="Times New Roman" w:cs="Times New Roman"/>
           <w:b/>
@@ -6877,6 +7029,7 @@
     <w:p>
       <w:pPr>
         <w:ind w:left="720"/>
+        <w:jc w:val="both"/>
         <w:rPr>
           <w:rFonts w:ascii="Times New Roman" w:eastAsia="Roboto" w:hAnsi="Times New Roman" w:cs="Times New Roman"/>
         </w:rPr>
@@ -6913,6 +7066,7 @@
     <w:p>
       <w:pPr>
         <w:ind w:left="720"/>
+        <w:jc w:val="both"/>
         <w:rPr>
           <w:rFonts w:ascii="Times New Roman" w:eastAsia="Roboto" w:hAnsi="Times New Roman" w:cs="Times New Roman"/>
         </w:rPr>
@@ -6969,12 +7123,13 @@
         <w:rPr>
           <w:rFonts w:ascii="Times New Roman" w:eastAsia="Roboto" w:hAnsi="Times New Roman" w:cs="Times New Roman"/>
         </w:rPr>
-        <w:t xml:space="preserve"> gốc. </w:t>
+        <w:t xml:space="preserve"> gốc.</w:t>
       </w:r>
     </w:p>
     <w:p>
       <w:pPr>
         <w:spacing w:after="160"/>
+        <w:jc w:val="both"/>
         <w:rPr>
           <w:rFonts w:ascii="Times New Roman" w:eastAsia="Roboto" w:hAnsi="Times New Roman" w:cs="Times New Roman"/>
           <w:b/>
@@ -6993,6 +7148,7 @@
     <w:p>
       <w:pPr>
         <w:spacing w:after="160"/>
+        <w:jc w:val="both"/>
         <w:rPr>
           <w:rFonts w:ascii="Times New Roman" w:eastAsia="Roboto" w:hAnsi="Times New Roman" w:cs="Times New Roman"/>
           <w:b/>
@@ -7003,7 +7159,7 @@
     <w:tbl>
       <w:tblPr>
         <w:tblStyle w:val="a0"/>
-        <w:tblW w:w="9045" w:type="dxa"/>
+        <w:tblW w:w="0" w:type="auto"/>
         <w:tblInd w:w="-210" w:type="dxa"/>
         <w:tblBorders>
           <w:top w:val="nil"/>
@@ -7013,13 +7169,12 @@
           <w:insideH w:val="nil"/>
           <w:insideV w:val="nil"/>
         </w:tblBorders>
-        <w:tblLayout w:type="fixed"/>
         <w:tblLook w:val="0600" w:firstRow="0" w:lastRow="0" w:firstColumn="0" w:lastColumn="0" w:noHBand="1" w:noVBand="1"/>
       </w:tblPr>
       <w:tblGrid>
-        <w:gridCol w:w="1140"/>
-        <w:gridCol w:w="3675"/>
-        <w:gridCol w:w="4230"/>
+        <w:gridCol w:w="1041"/>
+        <w:gridCol w:w="3419"/>
+        <w:gridCol w:w="4767"/>
       </w:tblGrid>
       <w:tr>
         <w:trPr>
@@ -7027,7 +7182,7 @@
         </w:trPr>
         <w:tc>
           <w:tcPr>
-            <w:tcW w:w="1140" w:type="dxa"/>
+            <w:tcW w:w="0" w:type="auto"/>
             <w:tcBorders>
               <w:top w:val="single" w:sz="5" w:space="0" w:color="C4C7C5"/>
               <w:left w:val="single" w:sz="5" w:space="0" w:color="C4C7C5"/>
@@ -7045,6 +7200,7 @@
             <w:pPr>
               <w:spacing w:after="480"/>
               <w:ind w:left="-80"/>
+              <w:jc w:val="center"/>
               <w:rPr>
                 <w:rFonts w:ascii="Times New Roman" w:hAnsi="Times New Roman" w:cs="Times New Roman"/>
                 <w:b/>
@@ -7063,7 +7219,7 @@
         </w:tc>
         <w:tc>
           <w:tcPr>
-            <w:tcW w:w="3675" w:type="dxa"/>
+            <w:tcW w:w="0" w:type="auto"/>
             <w:tcBorders>
               <w:top w:val="single" w:sz="5" w:space="0" w:color="C4C7C5"/>
               <w:left w:val="single" w:sz="5" w:space="0" w:color="C4C7C5"/>
@@ -7081,6 +7237,7 @@
             <w:pPr>
               <w:spacing w:after="480"/>
               <w:ind w:left="-80"/>
+              <w:jc w:val="center"/>
               <w:rPr>
                 <w:rFonts w:ascii="Times New Roman" w:hAnsi="Times New Roman" w:cs="Times New Roman"/>
                 <w:b/>
@@ -7099,7 +7256,7 @@
         </w:tc>
         <w:tc>
           <w:tcPr>
-            <w:tcW w:w="4230" w:type="dxa"/>
+            <w:tcW w:w="0" w:type="auto"/>
             <w:tcBorders>
               <w:top w:val="single" w:sz="5" w:space="0" w:color="C4C7C5"/>
               <w:left w:val="single" w:sz="5" w:space="0" w:color="C4C7C5"/>
@@ -7117,6 +7274,7 @@
             <w:pPr>
               <w:spacing w:after="480"/>
               <w:ind w:left="-80"/>
+              <w:jc w:val="center"/>
               <w:rPr>
                 <w:rFonts w:ascii="Times New Roman" w:hAnsi="Times New Roman" w:cs="Times New Roman"/>
                 <w:b/>
@@ -7140,7 +7298,7 @@
         </w:trPr>
         <w:tc>
           <w:tcPr>
-            <w:tcW w:w="1140" w:type="dxa"/>
+            <w:tcW w:w="0" w:type="auto"/>
             <w:tcBorders>
               <w:top w:val="single" w:sz="5" w:space="0" w:color="C4C7C5"/>
               <w:left w:val="single" w:sz="5" w:space="0" w:color="C4C7C5"/>
@@ -7162,6 +7320,7 @@
                 <w:rFonts w:ascii="Times New Roman" w:hAnsi="Times New Roman" w:cs="Times New Roman"/>
                 <w:b/>
                 <w:bCs/>
+                <w:lang w:val="en-US"/>
               </w:rPr>
             </w:pPr>
             <w:r>
@@ -7170,13 +7329,30 @@
                 <w:b/>
                 <w:bCs/>
               </w:rPr>
-              <w:t>Đặt lịch khám</w:t>
+              <w:t>Đặt</w:t>
+            </w:r>
+            <w:r>
+              <w:rPr>
+                <w:rFonts w:ascii="Times New Roman" w:hAnsi="Times New Roman" w:cs="Times New Roman"/>
+                <w:b/>
+                <w:bCs/>
+                <w:lang w:val="en-US"/>
+              </w:rPr>
+              <w:t xml:space="preserve"> </w:t>
+            </w:r>
+            <w:r>
+              <w:rPr>
+                <w:rFonts w:ascii="Times New Roman" w:hAnsi="Times New Roman" w:cs="Times New Roman"/>
+                <w:b/>
+                <w:bCs/>
+              </w:rPr>
+              <w:t>lịch khám</w:t>
             </w:r>
           </w:p>
         </w:tc>
         <w:tc>
           <w:tcPr>
-            <w:tcW w:w="3675" w:type="dxa"/>
+            <w:tcW w:w="0" w:type="auto"/>
             <w:tcBorders>
               <w:top w:val="single" w:sz="5" w:space="0" w:color="C4C7C5"/>
               <w:left w:val="single" w:sz="5" w:space="0" w:color="C4C7C5"/>
@@ -7194,17 +7370,14 @@
             <w:pPr>
               <w:spacing w:after="480"/>
               <w:ind w:left="-80"/>
-              <w:rPr>
-                <w:rFonts w:ascii="Times New Roman" w:hAnsi="Times New Roman" w:cs="Times New Roman"/>
-                <w:b/>
-                <w:bCs/>
+              <w:jc w:val="both"/>
+              <w:rPr>
+                <w:rFonts w:ascii="Times New Roman" w:hAnsi="Times New Roman" w:cs="Times New Roman"/>
               </w:rPr>
             </w:pPr>
             <w:r>
               <w:rPr>
                 <w:rFonts w:ascii="Times New Roman" w:hAnsi="Times New Roman" w:cs="Times New Roman"/>
-                <w:b/>
-                <w:bCs/>
               </w:rPr>
               <w:t>UR-01: Bệnh nhân muốn xem lịch trống của bác sĩ theo đúng chuyên khoa cần khám để đặt lịch hẹn trực tiếp hoặc khám từ xa.</w:t>
             </w:r>
@@ -7212,7 +7385,7 @@
         </w:tc>
         <w:tc>
           <w:tcPr>
-            <w:tcW w:w="4230" w:type="dxa"/>
+            <w:tcW w:w="0" w:type="auto"/>
             <w:tcBorders>
               <w:top w:val="single" w:sz="5" w:space="0" w:color="C4C7C5"/>
               <w:left w:val="single" w:sz="5" w:space="0" w:color="C4C7C5"/>
@@ -7230,17 +7403,14 @@
             <w:pPr>
               <w:spacing w:after="480"/>
               <w:ind w:left="-80"/>
-              <w:rPr>
-                <w:rFonts w:ascii="Times New Roman" w:hAnsi="Times New Roman" w:cs="Times New Roman"/>
-                <w:b/>
-                <w:bCs/>
+              <w:jc w:val="both"/>
+              <w:rPr>
+                <w:rFonts w:ascii="Times New Roman" w:hAnsi="Times New Roman" w:cs="Times New Roman"/>
               </w:rPr>
             </w:pPr>
             <w:r>
               <w:rPr>
                 <w:rFonts w:ascii="Times New Roman" w:hAnsi="Times New Roman" w:cs="Times New Roman"/>
-                <w:b/>
-                <w:bCs/>
               </w:rPr>
               <w:t>SC-01: Hệ thống cung cấp bộ lọc tìm kiếm bác sĩ theo chuyên khoa, loại hình khám (In-clinic/Telemedicine) và hiển thị các khung thời gian khả dụng (Available Slots) theo thời gian thực.</w:t>
             </w:r>
@@ -7253,7 +7423,7 @@
         </w:trPr>
         <w:tc>
           <w:tcPr>
-            <w:tcW w:w="1140" w:type="dxa"/>
+            <w:tcW w:w="0" w:type="auto"/>
             <w:tcBorders>
               <w:top w:val="single" w:sz="5" w:space="0" w:color="C4C7C5"/>
               <w:left w:val="single" w:sz="5" w:space="0" w:color="C4C7C5"/>
@@ -7290,7 +7460,7 @@
         </w:tc>
         <w:tc>
           <w:tcPr>
-            <w:tcW w:w="3675" w:type="dxa"/>
+            <w:tcW w:w="0" w:type="auto"/>
             <w:tcBorders>
               <w:top w:val="single" w:sz="5" w:space="0" w:color="C4C7C5"/>
               <w:left w:val="single" w:sz="5" w:space="0" w:color="C4C7C5"/>
@@ -7308,17 +7478,14 @@
             <w:pPr>
               <w:spacing w:after="480"/>
               <w:ind w:left="-80"/>
-              <w:rPr>
-                <w:rFonts w:ascii="Times New Roman" w:hAnsi="Times New Roman" w:cs="Times New Roman"/>
-                <w:b/>
-                <w:bCs/>
+              <w:jc w:val="both"/>
+              <w:rPr>
+                <w:rFonts w:ascii="Times New Roman" w:hAnsi="Times New Roman" w:cs="Times New Roman"/>
               </w:rPr>
             </w:pPr>
             <w:r>
               <w:rPr>
                 <w:rFonts w:ascii="Times New Roman" w:hAnsi="Times New Roman" w:cs="Times New Roman"/>
-                <w:b/>
-                <w:bCs/>
               </w:rPr>
               <w:t>UR-02: Bác sĩ muốn kê đơn thuốc nhanh chóng và được cảnh báo nếu thuốc mới kê xung đột với tiền sử dị ứng của bệnh nhân.</w:t>
             </w:r>
@@ -7326,7 +7493,7 @@
         </w:tc>
         <w:tc>
           <w:tcPr>
-            <w:tcW w:w="4230" w:type="dxa"/>
+            <w:tcW w:w="0" w:type="auto"/>
             <w:tcBorders>
               <w:top w:val="single" w:sz="5" w:space="0" w:color="C4C7C5"/>
               <w:left w:val="single" w:sz="5" w:space="0" w:color="C4C7C5"/>
@@ -7344,19 +7511,16 @@
             <w:pPr>
               <w:spacing w:after="480"/>
               <w:ind w:left="-80"/>
-              <w:rPr>
-                <w:rFonts w:ascii="Times New Roman" w:hAnsi="Times New Roman" w:cs="Times New Roman"/>
-                <w:b/>
-                <w:bCs/>
+              <w:jc w:val="both"/>
+              <w:rPr>
+                <w:rFonts w:ascii="Times New Roman" w:hAnsi="Times New Roman" w:cs="Times New Roman"/>
               </w:rPr>
             </w:pPr>
             <w:r>
               <w:rPr>
                 <w:rFonts w:ascii="Times New Roman" w:hAnsi="Times New Roman" w:cs="Times New Roman"/>
-                <w:b/>
-                <w:bCs/>
-              </w:rPr>
-              <w:t xml:space="preserve">SC-02:Hệ thống cung cấp giao diện e-Prescription, tự động đối soát đơn thuốc với bảng dữ liệu dị ứng (Patient_Allergies) và phát cảnh báo nếu phát hiện thuốc có khả năng gây phản ứng dị ứng. </w:t>
+              </w:rPr>
+              <w:t>SC-02:Hệ thống cung cấp giao diện e-Prescription, tự động đối soát đơn thuốc với bảng dữ liệu dị ứng (Patient_Allergies) và phát cảnh báo nếu phát hiện thuốc có khả năng gây phản ứng dị ứng.</w:t>
             </w:r>
           </w:p>
         </w:tc>
@@ -7367,7 +7531,7 @@
         </w:trPr>
         <w:tc>
           <w:tcPr>
-            <w:tcW w:w="1140" w:type="dxa"/>
+            <w:tcW w:w="0" w:type="auto"/>
             <w:tcBorders>
               <w:top w:val="single" w:sz="5" w:space="0" w:color="C4C7C5"/>
               <w:left w:val="single" w:sz="5" w:space="0" w:color="C4C7C5"/>
@@ -7403,7 +7567,7 @@
         </w:tc>
         <w:tc>
           <w:tcPr>
-            <w:tcW w:w="3675" w:type="dxa"/>
+            <w:tcW w:w="0" w:type="auto"/>
             <w:tcBorders>
               <w:top w:val="single" w:sz="5" w:space="0" w:color="C4C7C5"/>
               <w:left w:val="single" w:sz="5" w:space="0" w:color="C4C7C5"/>
@@ -7421,17 +7585,14 @@
             <w:pPr>
               <w:spacing w:after="480"/>
               <w:ind w:left="-80"/>
-              <w:rPr>
-                <w:rFonts w:ascii="Times New Roman" w:hAnsi="Times New Roman" w:cs="Times New Roman"/>
-                <w:b/>
-                <w:bCs/>
+              <w:jc w:val="both"/>
+              <w:rPr>
+                <w:rFonts w:ascii="Times New Roman" w:hAnsi="Times New Roman" w:cs="Times New Roman"/>
               </w:rPr>
             </w:pPr>
             <w:r>
               <w:rPr>
                 <w:rFonts w:ascii="Times New Roman" w:hAnsi="Times New Roman" w:cs="Times New Roman"/>
-                <w:b/>
-                <w:bCs/>
               </w:rPr>
               <w:t>UR-03: Bác sĩ Chuyên khoa muốn xem toàn bộ tiền sử khám và ghi chú của Bác sĩ Đa khoa trước khi tiến hành hội chẩn chuyên sâu.</w:t>
             </w:r>
@@ -7439,7 +7600,7 @@
         </w:tc>
         <w:tc>
           <w:tcPr>
-            <w:tcW w:w="4230" w:type="dxa"/>
+            <w:tcW w:w="0" w:type="auto"/>
             <w:tcBorders>
               <w:top w:val="single" w:sz="5" w:space="0" w:color="C4C7C5"/>
               <w:left w:val="single" w:sz="5" w:space="0" w:color="C4C7C5"/>
@@ -7457,17 +7618,14 @@
             <w:pPr>
               <w:spacing w:after="480"/>
               <w:ind w:left="-80"/>
-              <w:rPr>
-                <w:rFonts w:ascii="Times New Roman" w:hAnsi="Times New Roman" w:cs="Times New Roman"/>
-                <w:b/>
-                <w:bCs/>
+              <w:jc w:val="both"/>
+              <w:rPr>
+                <w:rFonts w:ascii="Times New Roman" w:hAnsi="Times New Roman" w:cs="Times New Roman"/>
               </w:rPr>
             </w:pPr>
             <w:r>
               <w:rPr>
                 <w:rFonts w:ascii="Times New Roman" w:hAnsi="Times New Roman" w:cs="Times New Roman"/>
-                <w:b/>
-                <w:bCs/>
               </w:rPr>
               <w:t>SC-03: Hệ thống cung cấp API truy xuất dòng thời gian bệnh án (Timeline EMR) được cấp quyền theo phiên khám, tổng hợp toàn bộ kết quả chẩn đoán, xét nghiệm và đơn thuốc liên quan.</w:t>
             </w:r>
@@ -7478,6 +7636,7 @@
     <w:p>
       <w:pPr>
         <w:spacing w:after="160"/>
+        <w:jc w:val="both"/>
         <w:rPr>
           <w:rFonts w:ascii="Times New Roman" w:eastAsia="Roboto" w:hAnsi="Times New Roman" w:cs="Times New Roman"/>
           <w:b/>
@@ -7488,6 +7647,7 @@
     <w:p>
       <w:pPr>
         <w:spacing w:after="160"/>
+        <w:jc w:val="both"/>
         <w:rPr>
           <w:rFonts w:ascii="Times New Roman" w:eastAsia="Roboto" w:hAnsi="Times New Roman" w:cs="Times New Roman"/>
           <w:b/>
@@ -7506,6 +7666,7 @@
     <w:p>
       <w:pPr>
         <w:spacing w:after="160"/>
+        <w:jc w:val="both"/>
         <w:rPr>
           <w:rFonts w:ascii="Times New Roman" w:eastAsia="Roboto" w:hAnsi="Times New Roman" w:cs="Times New Roman"/>
           <w:b/>
@@ -7524,6 +7685,7 @@
     <w:p>
       <w:pPr>
         <w:ind w:left="720"/>
+        <w:jc w:val="both"/>
         <w:rPr>
           <w:rFonts w:ascii="Times New Roman" w:eastAsia="Roboto" w:hAnsi="Times New Roman" w:cs="Times New Roman"/>
         </w:rPr>
@@ -7560,6 +7722,7 @@
     <w:p>
       <w:pPr>
         <w:ind w:left="1440"/>
+        <w:jc w:val="both"/>
         <w:rPr>
           <w:rFonts w:ascii="Times New Roman" w:eastAsia="Roboto" w:hAnsi="Times New Roman" w:cs="Times New Roman"/>
         </w:rPr>
@@ -7588,6 +7751,7 @@
     <w:p>
       <w:pPr>
         <w:ind w:left="1440"/>
+        <w:jc w:val="both"/>
         <w:rPr>
           <w:rFonts w:ascii="Times New Roman" w:eastAsia="Roboto" w:hAnsi="Times New Roman" w:cs="Times New Roman"/>
         </w:rPr>
@@ -7616,6 +7780,7 @@
     <w:p>
       <w:pPr>
         <w:ind w:left="720"/>
+        <w:jc w:val="both"/>
         <w:rPr>
           <w:rFonts w:ascii="Times New Roman" w:eastAsia="Roboto" w:hAnsi="Times New Roman" w:cs="Times New Roman"/>
         </w:rPr>
@@ -7652,6 +7817,7 @@
     <w:p>
       <w:pPr>
         <w:ind w:left="1440"/>
+        <w:jc w:val="both"/>
         <w:rPr>
           <w:rFonts w:ascii="Times New Roman" w:eastAsia="Roboto" w:hAnsi="Times New Roman" w:cs="Times New Roman"/>
         </w:rPr>
@@ -7680,6 +7846,7 @@
     <w:p>
       <w:pPr>
         <w:ind w:left="1440"/>
+        <w:jc w:val="both"/>
         <w:rPr>
           <w:rFonts w:ascii="Times New Roman" w:eastAsia="Roboto" w:hAnsi="Times New Roman" w:cs="Times New Roman"/>
         </w:rPr>
@@ -7708,6 +7875,7 @@
     <w:p>
       <w:pPr>
         <w:ind w:left="720"/>
+        <w:jc w:val="both"/>
         <w:rPr>
           <w:rFonts w:ascii="Times New Roman" w:eastAsia="Roboto" w:hAnsi="Times New Roman" w:cs="Times New Roman"/>
         </w:rPr>
@@ -7744,6 +7912,7 @@
     <w:p>
       <w:pPr>
         <w:ind w:left="1440"/>
+        <w:jc w:val="both"/>
         <w:rPr>
           <w:rFonts w:ascii="Times New Roman" w:eastAsia="Roboto" w:hAnsi="Times New Roman" w:cs="Times New Roman"/>
         </w:rPr>
@@ -7766,12 +7935,13 @@
         <w:rPr>
           <w:rFonts w:ascii="Times New Roman" w:eastAsia="Roboto" w:hAnsi="Times New Roman" w:cs="Times New Roman"/>
         </w:rPr>
-        <w:t xml:space="preserve">Hệ thống phải ghi nhận triệu chứng, chẩn đoán theo chuẩn ICD-10 và kết luận điều trị. </w:t>
+        <w:t>Hệ thống phải ghi nhận triệu chứng, chẩn đoán theo chuẩn ICD-10 và kết luận điều trị.</w:t>
       </w:r>
     </w:p>
     <w:p>
       <w:pPr>
         <w:ind w:left="1440"/>
+        <w:jc w:val="both"/>
         <w:rPr>
           <w:rFonts w:ascii="Times New Roman" w:eastAsia="Roboto" w:hAnsi="Times New Roman" w:cs="Times New Roman"/>
           <w:sz w:val="24"/>
@@ -7798,12 +7968,13 @@
           <w:sz w:val="24"/>
           <w:szCs w:val="24"/>
         </w:rPr>
-        <w:t xml:space="preserve">Sau khi hoàn tất phiên khám, hồ sơ bệnh án được cập nhật sang trạng thái hoàn tất và lưu trữ trên hệ thống. </w:t>
+        <w:t>Sau khi hoàn tất phiên khám, hồ sơ bệnh án được cập nhật sang trạng thái hoàn tất và lưu trữ trên hệ thống.</w:t>
       </w:r>
     </w:p>
     <w:p>
       <w:pPr>
         <w:ind w:left="720"/>
+        <w:jc w:val="both"/>
         <w:rPr>
           <w:rFonts w:ascii="Times New Roman" w:eastAsia="Roboto" w:hAnsi="Times New Roman" w:cs="Times New Roman"/>
         </w:rPr>
@@ -7840,6 +8011,7 @@
     <w:p>
       <w:pPr>
         <w:ind w:left="1440"/>
+        <w:jc w:val="both"/>
         <w:rPr>
           <w:rFonts w:ascii="Times New Roman" w:eastAsia="Roboto" w:hAnsi="Times New Roman" w:cs="Times New Roman"/>
         </w:rPr>
@@ -7868,6 +8040,7 @@
     <w:p>
       <w:pPr>
         <w:ind w:left="1440"/>
+        <w:jc w:val="both"/>
         <w:rPr>
           <w:rFonts w:ascii="Times New Roman" w:eastAsia="Roboto" w:hAnsi="Times New Roman" w:cs="Times New Roman"/>
           <w:sz w:val="34"/>
@@ -7894,12 +8067,13 @@
           <w:sz w:val="26"/>
           <w:szCs w:val="26"/>
         </w:rPr>
-        <w:t xml:space="preserve"> Hệ thống kiểm tra số lượng tồn kho và cập nhật số lượng tồn sau khi đơn thuốc được xác nhận phát hành </w:t>
+        <w:t xml:space="preserve"> Hệ thống kiểm tra số lượng tồn kho và cập nhật số lượng tồn sau khi đơn thuốc được xác nhận phát hành</w:t>
       </w:r>
     </w:p>
     <w:p>
       <w:pPr>
         <w:ind w:left="720"/>
+        <w:jc w:val="both"/>
         <w:rPr>
           <w:rFonts w:ascii="Times New Roman" w:eastAsia="Roboto" w:hAnsi="Times New Roman" w:cs="Times New Roman"/>
         </w:rPr>
@@ -7936,6 +8110,7 @@
     <w:p>
       <w:pPr>
         <w:ind w:left="1440"/>
+        <w:jc w:val="both"/>
         <w:rPr>
           <w:rFonts w:ascii="Times New Roman" w:eastAsia="Roboto" w:hAnsi="Times New Roman" w:cs="Times New Roman"/>
         </w:rPr>
@@ -7964,6 +8139,7 @@
     <w:p>
       <w:pPr>
         <w:spacing w:after="160"/>
+        <w:jc w:val="both"/>
         <w:rPr>
           <w:rFonts w:ascii="Times New Roman" w:eastAsia="Roboto" w:hAnsi="Times New Roman" w:cs="Times New Roman"/>
           <w:b/>
@@ -7981,15 +8157,16 @@
     </w:p>
     <w:p>
       <w:pPr>
-        <w:rPr>
-          <w:rFonts w:ascii="Times New Roman" w:eastAsia="Roboto" w:hAnsi="Times New Roman" w:cs="Times New Roman"/>
-        </w:rPr>
-      </w:pPr>
-      <w:r>
-        <w:rPr>
-          <w:rFonts w:ascii="Times New Roman" w:eastAsia="Arial Unicode MS" w:hAnsi="Times New Roman" w:cs="Times New Roman"/>
-        </w:rPr>
-        <w:t xml:space="preserve">              ● </w:t>
+        <w:jc w:val="both"/>
+        <w:rPr>
+          <w:rFonts w:ascii="Times New Roman" w:eastAsia="Roboto" w:hAnsi="Times New Roman" w:cs="Times New Roman"/>
+        </w:rPr>
+      </w:pPr>
+      <w:r>
+        <w:rPr>
+          <w:rFonts w:ascii="Times New Roman" w:eastAsia="Arial Unicode MS" w:hAnsi="Times New Roman" w:cs="Times New Roman"/>
+        </w:rPr>
+        <w:t xml:space="preserve">● </w:t>
       </w:r>
       <w:r>
         <w:rPr>
@@ -8003,12 +8180,28 @@
         <w:rPr>
           <w:rFonts w:ascii="Times New Roman" w:eastAsia="Roboto" w:hAnsi="Times New Roman" w:cs="Times New Roman"/>
         </w:rPr>
-        <w:t xml:space="preserve"> (Hiệu năng &amp; Tối ưu CSDL - Performance): </w:t>
+        <w:t xml:space="preserve"> (Hiệu năng &amp; Tối ưu CSDL - Performance):</w:t>
       </w:r>
     </w:p>
     <w:p>
       <w:pPr>
         <w:ind w:left="1440"/>
+        <w:jc w:val="both"/>
+        <w:rPr>
+          <w:rFonts w:ascii="Times New Roman" w:eastAsia="Roboto" w:hAnsi="Times New Roman" w:cs="Times New Roman"/>
+        </w:rPr>
+      </w:pPr>
+      <w:r>
+        <w:rPr>
+          <w:rFonts w:ascii="Times New Roman" w:eastAsia="Roboto" w:hAnsi="Times New Roman" w:cs="Times New Roman"/>
+        </w:rPr>
+        <w:t>○     Thời gian phản hồi cho các thao tác tìm kiếm bác sĩ khả dụng, kiểm tra ca trực và tải lịch sử hồ sơ bệnh án phải dưới 250ms với quy mô 500.000 hồ sơ bệnh nhân</w:t>
+      </w:r>
+    </w:p>
+    <w:p>
+      <w:pPr>
+        <w:ind w:left="1440"/>
+        <w:jc w:val="both"/>
         <w:rPr>
           <w:rFonts w:ascii="Times New Roman" w:eastAsia="Roboto" w:hAnsi="Times New Roman" w:cs="Times New Roman"/>
         </w:rPr>
@@ -8018,26 +8211,13 @@
           <w:rFonts w:ascii="Times New Roman" w:eastAsia="Roboto" w:hAnsi="Times New Roman" w:cs="Times New Roman"/>
         </w:rPr>
         <w:lastRenderedPageBreak/>
-        <w:t>○     Thời gian phản hồi cho các thao tác tìm kiếm bác sĩ khả dụng, kiểm tra ca trực và tải lịch sử hồ sơ bệnh án phải dưới 250ms với quy mô 500.000 hồ sơ bệnh nhân</w:t>
-      </w:r>
-    </w:p>
-    <w:p>
-      <w:pPr>
-        <w:ind w:left="1440"/>
-        <w:rPr>
-          <w:rFonts w:ascii="Times New Roman" w:eastAsia="Roboto" w:hAnsi="Times New Roman" w:cs="Times New Roman"/>
-        </w:rPr>
-      </w:pPr>
-      <w:r>
-        <w:rPr>
-          <w:rFonts w:ascii="Times New Roman" w:eastAsia="Roboto" w:hAnsi="Times New Roman" w:cs="Times New Roman"/>
-        </w:rPr>
-        <w:t xml:space="preserve">○     Bắt buộc đánh chỉ mục (Index) trên các trường: LICH_HEN_KHAM(ma_bac_si, thoi_gian_hen, trang_thai), HO_SO_BENH_AN(ma_benh_nhan, ma_lich_hen), BAC_SI_CHUYEN_KHOA(ma_chuyen_khoa), LICH_LAM_VIEC_BAC_SI(ma_bac_si, ngay_lam_viec). </w:t>
+        <w:t>○     Bắt buộc đánh chỉ mục (Index) trên các trường: LICH_HEN_KHAM(ma_bac_si, thoi_gian_hen, trang_thai), HO_SO_BENH_AN(ma_benh_nhan, ma_lich_hen), BAC_SI_CHUYEN_KHOA(ma_chuyen_khoa), LICH_LAM_VIEC_BAC_SI(ma_bac_si, ngay_lam_viec).</w:t>
       </w:r>
     </w:p>
     <w:p>
       <w:pPr>
         <w:ind w:left="720"/>
+        <w:jc w:val="both"/>
         <w:rPr>
           <w:rFonts w:ascii="Times New Roman" w:eastAsia="Roboto" w:hAnsi="Times New Roman" w:cs="Times New Roman"/>
         </w:rPr>
@@ -8074,6 +8254,7 @@
     <w:p>
       <w:pPr>
         <w:ind w:left="1440"/>
+        <w:jc w:val="both"/>
         <w:rPr>
           <w:rFonts w:ascii="Times New Roman" w:eastAsia="Roboto" w:hAnsi="Times New Roman" w:cs="Times New Roman"/>
         </w:rPr>
@@ -8102,6 +8283,7 @@
     <w:p>
       <w:pPr>
         <w:ind w:left="1440"/>
+        <w:jc w:val="both"/>
         <w:rPr>
           <w:rFonts w:ascii="Times New Roman" w:eastAsia="Roboto" w:hAnsi="Times New Roman" w:cs="Times New Roman"/>
           <w:lang w:val="en-US"/>
@@ -8138,6 +8320,7 @@
     <w:p>
       <w:pPr>
         <w:ind w:left="1440"/>
+        <w:jc w:val="both"/>
         <w:rPr>
           <w:rFonts w:ascii="Times New Roman" w:eastAsia="Roboto" w:hAnsi="Times New Roman" w:cs="Times New Roman"/>
         </w:rPr>
@@ -8166,6 +8349,7 @@
     <w:p>
       <w:pPr>
         <w:ind w:left="720"/>
+        <w:jc w:val="both"/>
         <w:rPr>
           <w:rFonts w:ascii="Times New Roman" w:eastAsia="Roboto" w:hAnsi="Times New Roman" w:cs="Times New Roman"/>
         </w:rPr>
@@ -8202,6 +8386,7 @@
     <w:p>
       <w:pPr>
         <w:ind w:left="1440"/>
+        <w:jc w:val="both"/>
         <w:rPr>
           <w:rFonts w:ascii="Times New Roman" w:eastAsia="Roboto" w:hAnsi="Times New Roman" w:cs="Times New Roman"/>
         </w:rPr>
@@ -8230,6 +8415,7 @@
     <w:p>
       <w:pPr>
         <w:ind w:left="1440"/>
+        <w:jc w:val="both"/>
         <w:rPr>
           <w:rFonts w:ascii="Times New Roman" w:eastAsia="Roboto" w:hAnsi="Times New Roman" w:cs="Times New Roman"/>
         </w:rPr>
@@ -8257,19 +8443,15 @@
     </w:p>
     <w:p>
       <w:pPr>
-        <w:rPr>
-          <w:rFonts w:ascii="Times New Roman" w:eastAsia="Roboto" w:hAnsi="Times New Roman" w:cs="Times New Roman"/>
-        </w:rPr>
-      </w:pPr>
-      <w:r>
-        <w:rPr>
-          <w:rFonts w:ascii="Times New Roman" w:eastAsia="Roboto" w:hAnsi="Times New Roman" w:cs="Times New Roman"/>
-        </w:rPr>
-        <w:t xml:space="preserve"> </w:t>
-      </w:r>
-    </w:p>
-    <w:p>
-      <w:pPr>
+        <w:jc w:val="both"/>
+        <w:rPr>
+          <w:rFonts w:ascii="Times New Roman" w:eastAsia="Roboto" w:hAnsi="Times New Roman" w:cs="Times New Roman"/>
+        </w:rPr>
+      </w:pPr>
+    </w:p>
+    <w:p>
+      <w:pPr>
+        <w:jc w:val="both"/>
         <w:rPr>
           <w:rFonts w:ascii="Times New Roman" w:eastAsia="Roboto" w:hAnsi="Times New Roman" w:cs="Times New Roman"/>
           <w:b/>
@@ -8282,12 +8464,6 @@
       <w:r>
         <w:rPr>
           <w:rFonts w:ascii="Times New Roman" w:eastAsia="Roboto" w:hAnsi="Times New Roman" w:cs="Times New Roman"/>
-        </w:rPr>
-        <w:t xml:space="preserve"> </w:t>
-      </w:r>
-      <w:r>
-        <w:rPr>
-          <w:rFonts w:ascii="Times New Roman" w:eastAsia="Roboto" w:hAnsi="Times New Roman" w:cs="Times New Roman"/>
           <w:b/>
           <w:bCs/>
           <w:sz w:val="24"/>
@@ -8319,6 +8495,7 @@
     </w:p>
     <w:p>
       <w:pPr>
+        <w:jc w:val="both"/>
         <w:rPr>
           <w:rFonts w:ascii="Times New Roman" w:eastAsia="Roboto" w:hAnsi="Times New Roman" w:cs="Times New Roman"/>
           <w:b/>
@@ -8331,13 +8508,15 @@
     </w:p>
     <w:p>
       <w:pPr>
-        <w:rPr>
-          <w:rFonts w:ascii="Times New Roman" w:eastAsia="Roboto" w:hAnsi="Times New Roman" w:cs="Times New Roman"/>
-        </w:rPr>
-      </w:pPr>
-    </w:p>
-    <w:p>
-      <w:pPr>
+        <w:jc w:val="both"/>
+        <w:rPr>
+          <w:rFonts w:ascii="Times New Roman" w:eastAsia="Roboto" w:hAnsi="Times New Roman" w:cs="Times New Roman"/>
+        </w:rPr>
+      </w:pPr>
+    </w:p>
+    <w:p>
+      <w:pPr>
+        <w:jc w:val="both"/>
         <w:rPr>
           <w:rFonts w:ascii="Times New Roman" w:eastAsia="Roboto" w:hAnsi="Times New Roman" w:cs="Times New Roman"/>
           <w:sz w:val="40"/>
@@ -8348,6 +8527,7 @@
     </w:p>
     <w:p>
       <w:pPr>
+        <w:jc w:val="both"/>
         <w:rPr>
           <w:rFonts w:ascii="Times New Roman" w:eastAsia="Roboto" w:hAnsi="Times New Roman" w:cs="Times New Roman"/>
           <w:sz w:val="40"/>
@@ -8358,6 +8538,7 @@
     </w:p>
     <w:p>
       <w:pPr>
+        <w:jc w:val="both"/>
         <w:rPr>
           <w:rFonts w:ascii="Times New Roman" w:eastAsia="Roboto" w:hAnsi="Times New Roman" w:cs="Times New Roman"/>
           <w:sz w:val="40"/>
@@ -8368,6 +8549,7 @@
     </w:p>
     <w:p>
       <w:pPr>
+        <w:jc w:val="both"/>
         <w:rPr>
           <w:rFonts w:ascii="Times New Roman" w:eastAsia="Roboto" w:hAnsi="Times New Roman" w:cs="Times New Roman"/>
           <w:sz w:val="40"/>
@@ -8378,6 +8560,7 @@
     </w:p>
     <w:p>
       <w:pPr>
+        <w:jc w:val="both"/>
         <w:rPr>
           <w:rFonts w:ascii="Times New Roman" w:eastAsia="Roboto" w:hAnsi="Times New Roman" w:cs="Times New Roman"/>
           <w:sz w:val="40"/>
@@ -8388,6 +8571,7 @@
     </w:p>
     <w:p>
       <w:pPr>
+        <w:jc w:val="both"/>
         <w:rPr>
           <w:rFonts w:ascii="Times New Roman" w:eastAsia="Roboto" w:hAnsi="Times New Roman" w:cs="Times New Roman"/>
           <w:sz w:val="40"/>
@@ -8398,6 +8582,7 @@
     </w:p>
     <w:p>
       <w:pPr>
+        <w:jc w:val="both"/>
         <w:rPr>
           <w:rFonts w:ascii="Times New Roman" w:eastAsia="Roboto" w:hAnsi="Times New Roman" w:cs="Times New Roman"/>
           <w:sz w:val="40"/>

</xml_diff>

<commit_message>
update so do EER
</commit_message>
<xml_diff>
--- a/Healthcare Clinic & Telemedicine Portal-phase1.docx
+++ b/Healthcare Clinic & Telemedicine Portal-phase1.docx
@@ -8498,54 +8498,43 @@
         <w:jc w:val="both"/>
         <w:rPr>
           <w:rFonts w:ascii="Times New Roman" w:eastAsia="Roboto" w:hAnsi="Times New Roman" w:cs="Times New Roman"/>
-          <w:b/>
-          <w:bCs/>
-          <w:sz w:val="24"/>
-          <w:szCs w:val="24"/>
-          <w:lang w:val="en-US"/>
-        </w:rPr>
-      </w:pPr>
-    </w:p>
-    <w:p>
-      <w:pPr>
-        <w:jc w:val="both"/>
-        <w:rPr>
-          <w:rFonts w:ascii="Times New Roman" w:eastAsia="Roboto" w:hAnsi="Times New Roman" w:cs="Times New Roman"/>
-        </w:rPr>
-      </w:pPr>
-    </w:p>
-    <w:p>
-      <w:pPr>
-        <w:jc w:val="both"/>
-        <w:rPr>
-          <w:rFonts w:ascii="Times New Roman" w:eastAsia="Roboto" w:hAnsi="Times New Roman" w:cs="Times New Roman"/>
           <w:sz w:val="40"/>
           <w:szCs w:val="40"/>
           <w:lang w:val="en-US"/>
         </w:rPr>
       </w:pPr>
-    </w:p>
-    <w:p>
-      <w:pPr>
-        <w:jc w:val="both"/>
-        <w:rPr>
-          <w:rFonts w:ascii="Times New Roman" w:eastAsia="Roboto" w:hAnsi="Times New Roman" w:cs="Times New Roman"/>
-          <w:sz w:val="40"/>
-          <w:szCs w:val="40"/>
-          <w:lang w:val="en-US"/>
-        </w:rPr>
-      </w:pPr>
-    </w:p>
-    <w:p>
-      <w:pPr>
-        <w:jc w:val="both"/>
-        <w:rPr>
-          <w:rFonts w:ascii="Times New Roman" w:eastAsia="Roboto" w:hAnsi="Times New Roman" w:cs="Times New Roman"/>
-          <w:sz w:val="40"/>
-          <w:szCs w:val="40"/>
-          <w:lang w:val="en-US"/>
-        </w:rPr>
-      </w:pPr>
+      <w:hyperlink r:id="rId5" w:history="1">
+        <w:r>
+          <w:rPr>
+            <w:rStyle w:val="Hyperlink"/>
+            <w:rFonts w:ascii="Times New Roman" w:eastAsia="Roboto" w:hAnsi="Times New Roman" w:cs="Times New Roman"/>
+            <w:sz w:val="40"/>
+            <w:szCs w:val="40"/>
+            <w:lang w:val="en-US"/>
+          </w:rPr>
+          <w:t xml:space="preserve">Sơ đồ </w:t>
+        </w:r>
+        <w:r>
+          <w:rPr>
+            <w:rStyle w:val="Hyperlink"/>
+            <w:rFonts w:ascii="Times New Roman" w:eastAsia="Roboto" w:hAnsi="Times New Roman" w:cs="Times New Roman"/>
+            <w:sz w:val="40"/>
+            <w:szCs w:val="40"/>
+            <w:lang w:val="en-US"/>
+          </w:rPr>
+          <w:t>E</w:t>
+        </w:r>
+        <w:r>
+          <w:rPr>
+            <w:rStyle w:val="Hyperlink"/>
+            <w:rFonts w:ascii="Times New Roman" w:eastAsia="Roboto" w:hAnsi="Times New Roman" w:cs="Times New Roman"/>
+            <w:sz w:val="40"/>
+            <w:szCs w:val="40"/>
+            <w:lang w:val="en-US"/>
+          </w:rPr>
+          <w:t>ER</w:t>
+        </w:r>
+      </w:hyperlink>
     </w:p>
     <w:p>
       <w:pPr>
@@ -8600,10 +8589,10 @@
         </w:rPr>
         <w:lastRenderedPageBreak/>
         <w:drawing>
-          <wp:inline distT="0" distB="0" distL="0" distR="0" wp14:anchorId="6EE63D97" wp14:editId="28175961">
-            <wp:extent cx="5726430" cy="6277610"/>
-            <wp:effectExtent l="0" t="0" r="7620" b="8890"/>
-            <wp:docPr id="1627485130" name="Picture 1"/>
+          <wp:inline distT="0" distB="0" distL="0" distR="0" wp14:anchorId="7E5E23ED" wp14:editId="017028FC">
+            <wp:extent cx="5730240" cy="6286500"/>
+            <wp:effectExtent l="0" t="0" r="3810" b="0"/>
+            <wp:docPr id="1788068693" name="Picture 1"/>
             <wp:cNvGraphicFramePr>
               <a:graphicFrameLocks xmlns:a="http://schemas.openxmlformats.org/drawingml/2006/main" noChangeAspect="1"/>
             </wp:cNvGraphicFramePr>
@@ -8617,7 +8606,7 @@
                     </pic:cNvPicPr>
                   </pic:nvPicPr>
                   <pic:blipFill>
-                    <a:blip r:embed="rId5" cstate="print">
+                    <a:blip r:embed="rId6" cstate="print">
                       <a:extLst>
                         <a:ext uri="{28A0092B-C50C-407E-A947-70E740481C1C}">
                           <a14:useLocalDpi xmlns:a14="http://schemas.microsoft.com/office/drawing/2010/main" val="0"/>
@@ -8632,7 +8621,7 @@
                   <pic:spPr bwMode="auto">
                     <a:xfrm>
                       <a:off x="0" y="0"/>
-                      <a:ext cx="5726430" cy="6277610"/>
+                      <a:ext cx="5730240" cy="6286500"/>
                     </a:xfrm>
                     <a:prstGeom prst="rect">
                       <a:avLst/>
@@ -8648,6 +8637,17 @@
           </wp:inline>
         </w:drawing>
       </w:r>
+    </w:p>
+    <w:p>
+      <w:pPr>
+        <w:jc w:val="both"/>
+        <w:rPr>
+          <w:rFonts w:ascii="Times New Roman" w:eastAsia="Roboto" w:hAnsi="Times New Roman" w:cs="Times New Roman"/>
+          <w:sz w:val="40"/>
+          <w:szCs w:val="40"/>
+          <w:lang w:val="en-US"/>
+        </w:rPr>
+      </w:pPr>
     </w:p>
     <w:sectPr>
       <w:pgSz w:w="11909" w:h="16834"/>
@@ -11471,6 +11471,18 @@
       <w:shd w:val="clear" w:color="auto" w:fill="E1DFDD"/>
     </w:rPr>
   </w:style>
+  <w:style w:type="character" w:styleId="FollowedHyperlink">
+    <w:name w:val="FollowedHyperlink"/>
+    <w:basedOn w:val="DefaultParagraphFont"/>
+    <w:uiPriority w:val="99"/>
+    <w:semiHidden/>
+    <w:unhideWhenUsed/>
+    <w:rsid w:val="00325F78"/>
+    <w:rPr>
+      <w:color w:val="800080" w:themeColor="followedHyperlink"/>
+      <w:u w:val="single"/>
+    </w:rPr>
+  </w:style>
 </w:styles>
 </file>
 

</xml_diff>